<commit_message>
Chapter 4: remove oscilloscope ripple measurement and renumber figures
Co-Authored-By: Claude Sonnet 5.5 <noreply@anthropic.com>
Claude-Session: https://claude.ai/code/session_01VnBozHXF9mmTyHiTgVtwAM
</commit_message>
<xml_diff>
--- a/บทที่4_ไฟนอล_เฉพาะบท.docx
+++ b/บทที่4_ไฟนอล_เฉพาะบท.docx
@@ -1114,7 +1114,7 @@
           <w:szCs w:val="32"/>
           <w:bCs w:val="0"/>
         </w:rPr>
-        <w:t>บทที่ 3 กำหนดให้ตรวจสอบค่าที่ได้จากการคำนวณออกแบบกับค่าที่วัดได้จริงในบทที่ 4 (หัวข้อ 3.2.3) คณะผู้จัดทำจึงวัดแรงดัน กระแส และริปเปิลด้วยมัลติมิเตอร์และออสซิลโลสโคป ผลแสดงดังตารางที่ 4.2 และภาพประกอบที่ 4.3</w:t>
+        <w:t>บทที่ 3 กำหนดให้ตรวจสอบค่าที่ได้จากการคำนวณออกแบบกับค่าที่วัดได้จริงในบทที่ 4 (หัวข้อ 3.2.1–3.2.3) คณะผู้จัดทำจึงวัดแรงดันและกระแสด้วยมัลติมิเตอร์ ผลแสดงดังตารางที่ 4.2</w:t>
       </w:r>
     </w:p>
     <w:p>
@@ -1134,7 +1134,7 @@
           <w:szCs w:val="32"/>
           <w:bCs w:val="0"/>
         </w:rPr>
-        <w:t>ตารางที่ 4.2 ผลการตรวจวัดแรงดันและริปเปิลของแหล่งจ่ายไฟและวงจรขับกลอน</w:t>
+        <w:t>ตารางที่ 4.2 ผลการตรวจวัดแรงดันและกระแสของแหล่งจ่ายไฟและวงจรขับกลอน</w:t>
       </w:r>
     </w:p>
     <w:tbl>
@@ -1497,7 +1497,7 @@
                 <w:szCs w:val="28"/>
                 <w:bCs w:val="0"/>
               </w:rPr>
-              <w:t>ริปเปิลแรงดันเอาต์พุต 5 V</w:t>
+              <w:t>กระแสรางไฟ 5 V</w:t>
             </w:r>
           </w:p>
         </w:tc>
@@ -1520,7 +1520,7 @@
                 <w:szCs w:val="28"/>
                 <w:bCs w:val="0"/>
               </w:rPr>
-              <w:t>เอาต์พุต XL4015E1</w:t>
+              <w:t>อนุกรมรางไฟ 5 V</w:t>
             </w:r>
           </w:p>
         </w:tc>
@@ -1542,7 +1542,7 @@
                 <w:szCs w:val="28"/>
                 <w:bCs w:val="0"/>
               </w:rPr>
-              <w:t>≈ 52 mV (ไม่เกิน 250 mV)</w:t>
+              <w:t>0.78 A (ออกแบบ 1.17 A)</w:t>
             </w:r>
           </w:p>
         </w:tc>
@@ -1594,7 +1594,7 @@
                 <w:szCs w:val="28"/>
                 <w:bCs w:val="0"/>
               </w:rPr>
-              <w:t>กระแสรางไฟ 5 V</w:t>
+              <w:t>กระแสรางไฟ 12 V ขณะกลอนทำงาน</w:t>
             </w:r>
           </w:p>
         </w:tc>
@@ -1617,7 +1617,7 @@
                 <w:szCs w:val="28"/>
                 <w:bCs w:val="0"/>
               </w:rPr>
-              <w:t>อนุกรมรางไฟ 5 V</w:t>
+              <w:t>อนุกรมรางไฟ 12 V</w:t>
             </w:r>
           </w:p>
         </w:tc>
@@ -1628,6 +1628,7 @@
           <w:p>
             <w:pPr>
               <w:keepNext/>
+              <w:jc w:val="center"/>
             </w:pPr>
             <w:r/>
             <w:r>
@@ -1639,7 +1640,7 @@
                 <w:szCs w:val="28"/>
                 <w:bCs w:val="0"/>
               </w:rPr>
-              <w:t>0.78 A (ออกแบบ 1.17 A)</w:t>
+              <w:t>1.38 A</w:t>
             </w:r>
           </w:p>
         </w:tc>
@@ -1691,7 +1692,7 @@
                 <w:szCs w:val="28"/>
                 <w:bCs w:val="0"/>
               </w:rPr>
-              <w:t>กระแสรางไฟ 12 V ขณะกลอนทำงาน</w:t>
+              <w:t>แรงดันเกตของ Q1 ขณะล็อก</w:t>
             </w:r>
           </w:p>
         </w:tc>
@@ -1714,7 +1715,7 @@
                 <w:szCs w:val="28"/>
                 <w:bCs w:val="0"/>
               </w:rPr>
-              <w:t>อนุกรมรางไฟ 12 V</w:t>
+              <w:t>เกต IRFZ44N</w:t>
             </w:r>
           </w:p>
         </w:tc>
@@ -1737,7 +1738,7 @@
                 <w:szCs w:val="28"/>
                 <w:bCs w:val="0"/>
               </w:rPr>
-              <w:t>1.38 A</w:t>
+              <w:t>ต่ำกว่า 2 V</w:t>
             </w:r>
           </w:p>
         </w:tc>
@@ -1789,7 +1790,7 @@
                 <w:szCs w:val="28"/>
                 <w:bCs w:val="0"/>
               </w:rPr>
-              <w:t>แรงดันเกตของ Q1 ขณะล็อก</w:t>
+              <w:t>แรงดันเกตของ Q1 ขณะปลดล็อก</w:t>
             </w:r>
           </w:p>
         </w:tc>
@@ -1835,7 +1836,7 @@
                 <w:szCs w:val="28"/>
                 <w:bCs w:val="0"/>
               </w:rPr>
-              <w:t>ต่ำกว่า 2 V</w:t>
+              <w:t>≈ 12 V</w:t>
             </w:r>
           </w:p>
         </w:tc>
@@ -1874,104 +1875,6 @@
           </w:tcPr>
           <w:p>
             <w:pPr>
-              <w:keepNext/>
-              <w:jc w:val="center"/>
-            </w:pPr>
-            <w:r/>
-            <w:r>
-              <w:rPr>
-                <w:rFonts w:ascii="TH SarabunPSK" w:hAnsi="TH SarabunPSK" w:cs="TH SarabunPSK" w:eastAsia="TH SarabunPSK"/>
-                <w:b w:val="0"/>
-                <w:i w:val="0"/>
-                <w:sz w:val="28"/>
-                <w:szCs w:val="28"/>
-                <w:bCs w:val="0"/>
-              </w:rPr>
-              <w:t>แรงดันเกตของ Q1 ขณะปลดล็อก</w:t>
-            </w:r>
-          </w:p>
-        </w:tc>
-        <w:tc>
-          <w:tcPr>
-            <w:tcW w:type="dxa" w:w="1814"/>
-          </w:tcPr>
-          <w:p>
-            <w:pPr>
-              <w:keepNext/>
-              <w:jc w:val="center"/>
-            </w:pPr>
-            <w:r/>
-            <w:r>
-              <w:rPr>
-                <w:rFonts w:ascii="TH SarabunPSK" w:hAnsi="TH SarabunPSK" w:cs="TH SarabunPSK" w:eastAsia="TH SarabunPSK"/>
-                <w:b w:val="0"/>
-                <w:i w:val="0"/>
-                <w:sz w:val="28"/>
-                <w:szCs w:val="28"/>
-                <w:bCs w:val="0"/>
-              </w:rPr>
-              <w:t>เกต IRFZ44N</w:t>
-            </w:r>
-          </w:p>
-        </w:tc>
-        <w:tc>
-          <w:tcPr>
-            <w:tcW w:type="dxa" w:w="2381"/>
-          </w:tcPr>
-          <w:p>
-            <w:pPr>
-              <w:keepNext/>
-              <w:jc w:val="center"/>
-            </w:pPr>
-            <w:r/>
-            <w:r>
-              <w:rPr>
-                <w:rFonts w:ascii="TH SarabunPSK" w:hAnsi="TH SarabunPSK" w:cs="TH SarabunPSK" w:eastAsia="TH SarabunPSK"/>
-                <w:b w:val="0"/>
-                <w:i w:val="0"/>
-                <w:sz w:val="28"/>
-                <w:szCs w:val="28"/>
-                <w:bCs w:val="0"/>
-              </w:rPr>
-              <w:t>≈ 12 V</w:t>
-            </w:r>
-          </w:p>
-        </w:tc>
-        <w:tc>
-          <w:tcPr>
-            <w:tcW w:type="dxa" w:w="1247"/>
-          </w:tcPr>
-          <w:p>
-            <w:pPr>
-              <w:keepNext/>
-              <w:jc w:val="center"/>
-            </w:pPr>
-            <w:r/>
-          </w:p>
-        </w:tc>
-        <w:tc>
-          <w:tcPr>
-            <w:tcW w:type="dxa" w:w="794"/>
-          </w:tcPr>
-          <w:p>
-            <w:pPr>
-              <w:keepNext/>
-              <w:jc w:val="center"/>
-            </w:pPr>
-            <w:r/>
-          </w:p>
-        </w:tc>
-      </w:tr>
-      <w:tr>
-        <w:trPr>
-          <w:cantSplit w:val="true"/>
-        </w:trPr>
-        <w:tc>
-          <w:tcPr>
-            <w:tcW w:type="dxa" w:w="2835"/>
-          </w:tcPr>
-          <w:p>
-            <w:pPr>
               <w:jc w:val="center"/>
             </w:pPr>
             <w:r/>
@@ -2078,11 +1981,21 @@
     </w:p>
     <w:p>
       <w:pPr>
-        <w:keepNext/>
-        <w:spacing w:after="80"/>
-        <w:ind w:firstLine="0"/>
-        <w:jc w:val="center"/>
-      </w:pPr>
+        <w:spacing w:after="120" w:before="0" w:line="240" w:lineRule="auto"/>
+        <w:ind w:left="0" w:firstLine="850"/>
+        <w:jc w:val="both"/>
+      </w:pPr>
+      <w:r>
+        <w:rPr>
+          <w:rFonts w:ascii="TH SarabunPSK" w:hAnsi="TH SarabunPSK" w:cs="TH SarabunPSK" w:eastAsia="TH SarabunPSK"/>
+          <w:b w:val="0"/>
+          <w:i w:val="0"/>
+          <w:sz w:val="32"/>
+          <w:szCs w:val="32"/>
+          <w:bCs w:val="0"/>
+        </w:rPr>
+        <w:t xml:space="preserve">จากตารางที่ 4.2 พบว่า แรงดันรางไฟ 5 V วัดได้ </w:t>
+      </w:r>
       <w:r>
         <w:rPr>
           <w:rFonts w:ascii="TH SarabunPSK" w:hAnsi="TH SarabunPSK" w:cs="TH SarabunPSK" w:eastAsia="TH SarabunPSK"/>
@@ -2093,15 +2006,8 @@
           <w:bCs w:val="0"/>
           <w:highlight w:val="yellow"/>
         </w:rPr>
-        <w:t>[แทรกภาพหน้าจอออสซิลโลสโคปที่วัดริปเปิล]</w:t>
-      </w:r>
-    </w:p>
-    <w:p>
-      <w:pPr>
-        <w:spacing w:after="160"/>
-        <w:ind w:firstLine="0"/>
-        <w:jc w:val="center"/>
-      </w:pPr>
+        <w:t>[ ]</w:t>
+      </w:r>
       <w:r>
         <w:rPr>
           <w:rFonts w:ascii="TH SarabunPSK" w:hAnsi="TH SarabunPSK" w:cs="TH SarabunPSK" w:eastAsia="TH SarabunPSK"/>
@@ -2111,25 +2017,7 @@
           <w:szCs w:val="32"/>
           <w:bCs w:val="0"/>
         </w:rPr>
-        <w:t>ภาพประกอบที่ 4.3 สัญญาณริปเปิลที่เอาต์พุต 5 V ของ XL4015E1</w:t>
-      </w:r>
-    </w:p>
-    <w:p>
-      <w:pPr>
-        <w:spacing w:after="120" w:before="0" w:line="240" w:lineRule="auto"/>
-        <w:ind w:left="0" w:firstLine="850"/>
-        <w:jc w:val="both"/>
-      </w:pPr>
-      <w:r>
-        <w:rPr>
-          <w:rFonts w:ascii="TH SarabunPSK" w:hAnsi="TH SarabunPSK" w:cs="TH SarabunPSK" w:eastAsia="TH SarabunPSK"/>
-          <w:b w:val="0"/>
-          <w:i w:val="0"/>
-          <w:sz w:val="32"/>
-          <w:szCs w:val="32"/>
-          <w:bCs w:val="0"/>
-        </w:rPr>
-        <w:t xml:space="preserve">จากตารางที่ 4.2 พบว่า แรงดันรางไฟ 5 V วัดได้ </w:t>
+        <w:t xml:space="preserve"> V </w:t>
       </w:r>
       <w:r>
         <w:rPr>
@@ -2141,7 +2029,7 @@
           <w:bCs w:val="0"/>
           <w:highlight w:val="yellow"/>
         </w:rPr>
-        <w:t>[ ]</w:t>
+        <w:t>[ใกล้เคียง/ต่างจาก]</w:t>
       </w:r>
       <w:r>
         <w:rPr>
@@ -2152,99 +2040,7 @@
           <w:szCs w:val="32"/>
           <w:bCs w:val="0"/>
         </w:rPr>
-        <w:t xml:space="preserve"> V </w:t>
-      </w:r>
-      <w:r>
-        <w:rPr>
-          <w:rFonts w:ascii="TH SarabunPSK" w:hAnsi="TH SarabunPSK" w:cs="TH SarabunPSK" w:eastAsia="TH SarabunPSK"/>
-          <w:b w:val="0"/>
-          <w:i w:val="0"/>
-          <w:sz w:val="32"/>
-          <w:szCs w:val="32"/>
-          <w:bCs w:val="0"/>
-          <w:highlight w:val="yellow"/>
-        </w:rPr>
-        <w:t>[ใกล้เคียง/ต่างจาก]</w:t>
-      </w:r>
-      <w:r>
-        <w:rPr>
-          <w:rFonts w:ascii="TH SarabunPSK" w:hAnsi="TH SarabunPSK" w:cs="TH SarabunPSK" w:eastAsia="TH SarabunPSK"/>
-          <w:b w:val="0"/>
-          <w:i w:val="0"/>
-          <w:sz w:val="32"/>
-          <w:szCs w:val="32"/>
-          <w:bCs w:val="0"/>
-        </w:rPr>
-        <w:t xml:space="preserve"> ค่าออกแบบ ริปเปิลวัดได้ </w:t>
-      </w:r>
-      <w:r>
-        <w:rPr>
-          <w:rFonts w:ascii="TH SarabunPSK" w:hAnsi="TH SarabunPSK" w:cs="TH SarabunPSK" w:eastAsia="TH SarabunPSK"/>
-          <w:b w:val="0"/>
-          <w:i w:val="0"/>
-          <w:sz w:val="32"/>
-          <w:szCs w:val="32"/>
-          <w:bCs w:val="0"/>
-          <w:highlight w:val="yellow"/>
-        </w:rPr>
-        <w:t>[ ]</w:t>
-      </w:r>
-      <w:r>
-        <w:rPr>
-          <w:rFonts w:ascii="TH SarabunPSK" w:hAnsi="TH SarabunPSK" w:cs="TH SarabunPSK" w:eastAsia="TH SarabunPSK"/>
-          <w:b w:val="0"/>
-          <w:i w:val="0"/>
-          <w:sz w:val="32"/>
-          <w:szCs w:val="32"/>
-          <w:bCs w:val="0"/>
-        </w:rPr>
-        <w:t xml:space="preserve"> mV </w:t>
-      </w:r>
-      <w:r>
-        <w:rPr>
-          <w:rFonts w:ascii="TH SarabunPSK" w:hAnsi="TH SarabunPSK" w:cs="TH SarabunPSK" w:eastAsia="TH SarabunPSK"/>
-          <w:b w:val="0"/>
-          <w:i w:val="0"/>
-          <w:sz w:val="32"/>
-          <w:szCs w:val="32"/>
-          <w:bCs w:val="0"/>
-          <w:highlight w:val="yellow"/>
-        </w:rPr>
-        <w:t>[น้อยกว่า/มากกว่า]</w:t>
-      </w:r>
-      <w:r>
-        <w:rPr>
-          <w:rFonts w:ascii="TH SarabunPSK" w:hAnsi="TH SarabunPSK" w:cs="TH SarabunPSK" w:eastAsia="TH SarabunPSK"/>
-          <w:b w:val="0"/>
-          <w:i w:val="0"/>
-          <w:sz w:val="32"/>
-          <w:szCs w:val="32"/>
-          <w:bCs w:val="0"/>
-        </w:rPr>
-        <w:t xml:space="preserve"> เกณฑ์ 250 mV (ร้อยละ 5 ของ 5 V) และ </w:t>
-      </w:r>
-      <w:r>
-        <w:rPr>
-          <w:rFonts w:ascii="TH SarabunPSK" w:hAnsi="TH SarabunPSK" w:cs="TH SarabunPSK" w:eastAsia="TH SarabunPSK"/>
-          <w:b w:val="0"/>
-          <w:i w:val="0"/>
-          <w:sz w:val="32"/>
-          <w:szCs w:val="32"/>
-          <w:bCs w:val="0"/>
-          <w:highlight w:val="yellow"/>
-        </w:rPr>
-        <w:t>[ใกล้เคียง/ต่างจาก]</w:t>
-      </w:r>
-      <w:r>
-        <w:rPr>
-          <w:rFonts w:ascii="TH SarabunPSK" w:hAnsi="TH SarabunPSK" w:cs="TH SarabunPSK" w:eastAsia="TH SarabunPSK"/>
-          <w:b w:val="0"/>
-          <w:i w:val="0"/>
-          <w:sz w:val="32"/>
-          <w:szCs w:val="32"/>
-          <w:bCs w:val="0"/>
-        </w:rPr>
-        <w:t xml:space="preserve"> ค่าคำนวณ 52 mV ส่วนแรงดันเกตของ Q1 ขณะล็อกวัดได้ </w:t>
+        <w:t xml:space="preserve"> ค่าออกแบบ ส่วนแรงดันเกตของ Q1 ขณะล็อกวัดได้ </w:t>
       </w:r>
       <w:r>
         <w:rPr>
@@ -3238,7 +3034,7 @@
           <w:szCs w:val="32"/>
           <w:bCs w:val="0"/>
         </w:rPr>
-        <w:t>การทดสอบนี้ประเมินความแม่นยำในการจำแนกสิทธิ์การเข้าถึงของโมดูล GM66 และเซิร์ฟเวอร์ รวมถึงการสั่งกลอนแม่เหล็กไฟฟ้า ทดสอบ 15 ครั้ง ประกอบด้วยรหัสที่ได้รับอนุญาต 10 ครั้ง และรหัสที่ไม่ได้รับอนุญาต 5 ครั้ง ได้แก่ รหัสหมดอายุ (Expired) 1 ครั้ง รหัสที่ใช้แล้ว (Used) 2 ครั้ง และรหัสที่ไม่ถูกต้อง (ไม่ใช่รูปแบบ UUID ของระบบ ซึ่งถูกปฏิเสธที่ตัวเครื่อง) 2 ครั้ง ตามสถานะในตารางที่ 3.7 บันทึกผลและระยะเวลาตอบสนองนับตั้งแต่สแกนจนกลอนทำงาน ดังภาพประกอบที่ 4.4 และตารางที่ 4.4</w:t>
+        <w:t>การทดสอบนี้ประเมินความแม่นยำในการจำแนกสิทธิ์การเข้าถึงของโมดูล GM66 และเซิร์ฟเวอร์ รวมถึงการสั่งกลอนแม่เหล็กไฟฟ้า ทดสอบ 15 ครั้ง ประกอบด้วยรหัสที่ได้รับอนุญาต 10 ครั้ง และรหัสที่ไม่ได้รับอนุญาต 5 ครั้ง ได้แก่ รหัสหมดอายุ (Expired) 1 ครั้ง รหัสที่ใช้แล้ว (Used) 2 ครั้ง และรหัสที่ไม่ถูกต้อง (ไม่ใช่รูปแบบ UUID ของระบบ ซึ่งถูกปฏิเสธที่ตัวเครื่อง) 2 ครั้ง ตามสถานะในตารางที่ 3.7 บันทึกผลและระยะเวลาตอบสนองนับตั้งแต่สแกนจนกลอนทำงาน ดังภาพประกอบที่ 4.3 และตารางที่ 4.4</w:t>
       </w:r>
     </w:p>
     <w:p>
@@ -3276,7 +3072,7 @@
           <w:szCs w:val="32"/>
           <w:bCs w:val="0"/>
         </w:rPr>
-        <w:t>ภาพประกอบที่ 4.4 การทดสอบสแกนรหัสคิวอาร์ผ่านโมดูล GM66</w:t>
+        <w:t>ภาพประกอบที่ 4.3 การทดสอบสแกนรหัสคิวอาร์ผ่านโมดูล GM66</w:t>
       </w:r>
     </w:p>
     <w:p>
@@ -5532,7 +5328,7 @@
           <w:szCs w:val="32"/>
           <w:bCs w:val="0"/>
         </w:rPr>
-        <w:t>การทดสอบนี้ตรวจสอบการเปลี่ยนสถานะจาก Door Open เป็น Locked ซึ่งเป็นตัวกระตุ้นให้บอร์ด ESP32 ส่งพัลส์ 200 ms ไปยัง ESP32-CAM ตามภาพประกอบที่ 3.9 จากนั้น ESP32-CAM สอบถามคำสั่งจากเซิร์ฟเวอร์ ถ่ายภาพ และส่งไปยังเซิร์ฟเวอร์ ทดสอบ 15 ครั้ง โดยปลดล็อกด้วยรหัสคิวอาร์ เปิดประตู วางพัสดุ แล้วปิดประตูด้วยมือจนสนิททุกครั้ง ผลแสดงดังตารางที่ 4.6 และตัวอย่างข้อความแจ้งเตือนพร้อมภาพหลักฐานที่ได้รับผ่าน LINE แสดงดังภาพประกอบที่ 4.5</w:t>
+        <w:t>การทดสอบนี้ตรวจสอบการเปลี่ยนสถานะจาก Door Open เป็น Locked ซึ่งเป็นตัวกระตุ้นให้บอร์ด ESP32 ส่งพัลส์ 200 ms ไปยัง ESP32-CAM ตามภาพประกอบที่ 3.9 จากนั้น ESP32-CAM สอบถามคำสั่งจากเซิร์ฟเวอร์ ถ่ายภาพ และส่งไปยังเซิร์ฟเวอร์ ทดสอบ 15 ครั้ง โดยปลดล็อกด้วยรหัสคิวอาร์ เปิดประตู วางพัสดุ แล้วปิดประตูด้วยมือจนสนิททุกครั้ง ผลแสดงดังตารางที่ 4.6 และตัวอย่างข้อความแจ้งเตือนพร้อมภาพหลักฐานที่ได้รับผ่าน LINE แสดงดังภาพประกอบที่ 4.4</w:t>
       </w:r>
     </w:p>
     <w:p>
@@ -6704,7 +6500,7 @@
           <w:szCs w:val="32"/>
           <w:bCs w:val="0"/>
         </w:rPr>
-        <w:t>ภาพประกอบที่ 4.5 ตัวอย่างข้อความแจ้งเตือนพร้อมภาพหลักฐานที่ได้รับผ่าน LINE</w:t>
+        <w:t>ภาพประกอบที่ 4.4 ตัวอย่างข้อความแจ้งเตือนพร้อมภาพหลักฐานที่ได้รับผ่าน LINE</w:t>
       </w:r>
     </w:p>
     <w:p>
@@ -7506,7 +7302,7 @@
           <w:szCs w:val="32"/>
           <w:bCs w:val="0"/>
         </w:rPr>
-        <w:t xml:space="preserve"> และสั่งล็อกกลอนทันที ผู้ทดสอบปิดประตูด้วยมือในทุกครั้ง ทดสอบ 15 ครั้ง ดังตารางที่ 4.8 และตัวอย่างการทดสอบแสดงดังภาพประกอบที่ 4.6</w:t>
+        <w:t xml:space="preserve"> และสั่งล็อกกลอนทันที ผู้ทดสอบปิดประตูด้วยมือในทุกครั้ง ทดสอบ 15 ครั้ง ดังตารางที่ 4.8 และตัวอย่างการทดสอบแสดงดังภาพประกอบที่ 4.5</w:t>
       </w:r>
     </w:p>
     <w:p>
@@ -8456,7 +8252,7 @@
           <w:szCs w:val="32"/>
           <w:bCs w:val="0"/>
         </w:rPr>
-        <w:t>ภาพประกอบที่ 4.6 การทดสอบการตรวจสอบสถานะประตูด้วย Reed Switch MC-38</w:t>
+        <w:t>ภาพประกอบที่ 4.5 การทดสอบการตรวจสอบสถานะประตูด้วย Reed Switch MC-38</w:t>
       </w:r>
     </w:p>
     <w:p>
@@ -8615,7 +8411,7 @@
           <w:szCs w:val="32"/>
           <w:bCs w:val="0"/>
         </w:rPr>
-        <w:t>เนื่องจากต้นแบบไม่มีโช้คอัพประตู ผู้ใช้ต้องปิดประตูด้วยมือ จึงมีโอกาสที่ประตูปิดไม่สนิท ระบบจึงออกแบบให้แจ้งเตือนเมื่อประตูเปิดค้างเกิน 60 วินาที (T_ajar) โดยส่งข้อความผ่าน LINE ครั้งเดียวและให้บัซเซอร์เตือนซ้ำจนกว่าจะปิดประตู การทดสอบนี้จำลองกรณีมีวัตถุกีดขวางทำให้ประตูปิดไม่สนิท เพื่อวัดความถูกต้องของการแจ้งเตือนด้วยเสียงและผ่าน LINE Messaging API ทดสอบ 15 ครั้ง ดังตารางที่ 4.9 และตัวอย่างข้อความแจ้งเตือนที่ได้รับแสดงดังภาพประกอบที่ 4.7</w:t>
+        <w:t>เนื่องจากต้นแบบไม่มีโช้คอัพประตู ผู้ใช้ต้องปิดประตูด้วยมือ จึงมีโอกาสที่ประตูปิดไม่สนิท ระบบจึงออกแบบให้แจ้งเตือนเมื่อประตูเปิดค้างเกิน 60 วินาที (T_ajar) โดยส่งข้อความผ่าน LINE ครั้งเดียวและให้บัซเซอร์เตือนซ้ำจนกว่าจะปิดประตู การทดสอบนี้จำลองกรณีมีวัตถุกีดขวางทำให้ประตูปิดไม่สนิท เพื่อวัดความถูกต้องของการแจ้งเตือนด้วยเสียงและผ่าน LINE Messaging API ทดสอบ 15 ครั้ง ดังตารางที่ 4.9 และตัวอย่างข้อความแจ้งเตือนที่ได้รับแสดงดังภาพประกอบที่ 4.6</w:t>
       </w:r>
     </w:p>
     <w:p>
@@ -9769,7 +9565,7 @@
           <w:szCs w:val="32"/>
           <w:bCs w:val="0"/>
         </w:rPr>
-        <w:t>ภาพประกอบที่ 4.7 ตัวอย่างข้อความแจ้งเตือนกรณีประตูปิดไม่สนิทผ่าน LINE</w:t>
+        <w:t>ภาพประกอบที่ 4.6 ตัวอย่างข้อความแจ้งเตือนกรณีประตูปิดไม่สนิทผ่าน LINE</w:t>
       </w:r>
     </w:p>
     <w:p>

</xml_diff>

<commit_message>
Chapter 4: align tests with real system (event names, beep patterns, timing measurement)
Co-Authored-By: Claude Sonnet 5.5 <noreply@anthropic.com>
Claude-Session: https://claude.ai/code/session_01VnBozHXF9mmTyHiTgVtwAM
</commit_message>
<xml_diff>
--- a/บทที่4_ไฟนอล_เฉพาะบท.docx
+++ b/บทที่4_ไฟนอล_เฉพาะบท.docx
@@ -2596,7 +2596,30 @@
                 <w:szCs w:val="28"/>
                 <w:bCs w:val="0"/>
               </w:rPr>
-              <w:t>ได้ภาพภายใน 30 s (ตารางที่ 3.6)</w:t>
+              <w:t xml:space="preserve">ได้ภาพภายใน </w:t>
+            </w:r>
+            <w:r>
+              <w:rPr>
+                <w:rFonts w:ascii="TH SarabunPSK" w:hAnsi="TH SarabunPSK" w:cs="TH SarabunPSK" w:eastAsia="TH SarabunPSK"/>
+                <w:b w:val="0"/>
+                <w:i w:val="0"/>
+                <w:sz w:val="28"/>
+                <w:szCs w:val="28"/>
+                <w:bCs w:val="0"/>
+                <w:highlight w:val="yellow"/>
+              </w:rPr>
+              <w:t>[30]</w:t>
+            </w:r>
+            <w:r>
+              <w:rPr>
+                <w:rFonts w:ascii="TH SarabunPSK" w:hAnsi="TH SarabunPSK" w:cs="TH SarabunPSK" w:eastAsia="TH SarabunPSK"/>
+                <w:b w:val="0"/>
+                <w:i w:val="0"/>
+                <w:sz w:val="28"/>
+                <w:szCs w:val="28"/>
+                <w:bCs w:val="0"/>
+              </w:rPr>
+              <w:t xml:space="preserve"> s (ตารางที่ 3.6)</w:t>
             </w:r>
           </w:p>
         </w:tc>
@@ -2999,6 +3022,58 @@
         </w:rPr>
         <w:t>[เกณฑ์ที่คณะผู้จัดทำกำหนดเอง ปรับได้ตามที่ปรึกษา]</w:t>
       </w:r>
+      <w:r>
+        <w:rPr>
+          <w:rFonts w:ascii="TH SarabunPSK" w:hAnsi="TH SarabunPSK" w:cs="TH SarabunPSK" w:eastAsia="TH SarabunPSK"/>
+          <w:b w:val="0"/>
+          <w:i w:val="0"/>
+          <w:sz w:val="32"/>
+          <w:szCs w:val="32"/>
+          <w:bCs w:val="0"/>
+        </w:rPr>
+        <w:t xml:space="preserve"> ส่วนเวลารอภาพที่เซิร์ฟเวอร์ตั้งไว้จริงคือ </w:t>
+      </w:r>
+      <w:r>
+        <w:rPr>
+          <w:rFonts w:ascii="TH SarabunPSK" w:hAnsi="TH SarabunPSK" w:cs="TH SarabunPSK" w:eastAsia="TH SarabunPSK"/>
+          <w:b w:val="0"/>
+          <w:i w:val="0"/>
+          <w:sz w:val="32"/>
+          <w:szCs w:val="32"/>
+          <w:bCs w:val="0"/>
+          <w:highlight w:val="yellow"/>
+        </w:rPr>
+        <w:t>[30]</w:t>
+      </w:r>
+      <w:r>
+        <w:rPr>
+          <w:rFonts w:ascii="TH SarabunPSK" w:hAnsi="TH SarabunPSK" w:cs="TH SarabunPSK" w:eastAsia="TH SarabunPSK"/>
+          <w:b w:val="0"/>
+          <w:i w:val="0"/>
+          <w:sz w:val="32"/>
+          <w:szCs w:val="32"/>
+          <w:bCs w:val="0"/>
+        </w:rPr>
+        <w:t xml:space="preserve"> วินาที (ค่า IMAGE_WAIT_SECONDS ในการตั้งค่าเซิร์ฟเวอร์ ค่าออกแบบในตารางที่ 3.6 คือ 30 วินาที)</w:t>
+      </w:r>
+    </w:p>
+    <w:p>
+      <w:pPr>
+        <w:spacing w:after="120" w:before="0" w:line="240" w:lineRule="auto"/>
+        <w:ind w:left="0" w:firstLine="850"/>
+        <w:jc w:val="both"/>
+      </w:pPr>
+      <w:r>
+        <w:rPr>
+          <w:rFonts w:ascii="TH SarabunPSK" w:hAnsi="TH SarabunPSK" w:cs="TH SarabunPSK" w:eastAsia="TH SarabunPSK"/>
+          <w:b w:val="0"/>
+          <w:i w:val="0"/>
+          <w:sz w:val="32"/>
+          <w:szCs w:val="32"/>
+          <w:bCs w:val="0"/>
+        </w:rPr>
+        <w:t>การวัดระยะเวลาในแต่ละการทดสอบใช้ข้อมูลจากระบบจริง ดังนี้ (1) เวลาตอบสนองการยืนยันรหัส วัดจากบันทึก Serial Monitor ของบอร์ด ESP32 ซึ่งแสดงเวลาเป็นมิลลิวินาที นับจากอ่านรหัสได้จนสั่งปลดล็อก (2) เวลารอภาพ วัดจากประวัติเหตุการณ์ (Access Log) บนแดชบอร์ดของเซิร์ฟเวอร์ โดยคำนวณผลต่างระหว่างเวลาของเหตุการณ์ locked และ image_capture และ (3) เวลาตั้งแต่เปิดค้างถึงแจ้งเตือน คำนวณจากผลต่างระหว่างเวลาของเหตุการณ์ door_open และ door_ajar ทั้งนี้ Access Log แสดงเวลาถึงระดับวินาที จึงมีความคลาดเคลื่อนไม่เกิน ±1 วินาที</w:t>
+      </w:r>
     </w:p>
     <w:p>
       <w:pPr>
@@ -3034,7 +3109,30 @@
           <w:szCs w:val="32"/>
           <w:bCs w:val="0"/>
         </w:rPr>
-        <w:t>การทดสอบนี้ประเมินความแม่นยำในการจำแนกสิทธิ์การเข้าถึงของโมดูล GM66 และเซิร์ฟเวอร์ รวมถึงการสั่งกลอนแม่เหล็กไฟฟ้า ทดสอบ 15 ครั้ง ประกอบด้วยรหัสที่ได้รับอนุญาต 10 ครั้ง และรหัสที่ไม่ได้รับอนุญาต 5 ครั้ง ได้แก่ รหัสหมดอายุ (Expired) 1 ครั้ง รหัสที่ใช้แล้ว (Used) 2 ครั้ง และรหัสที่ไม่ถูกต้อง (ไม่ใช่รูปแบบ UUID ของระบบ ซึ่งถูกปฏิเสธที่ตัวเครื่อง) 2 ครั้ง ตามสถานะในตารางที่ 3.7 บันทึกผลและระยะเวลาตอบสนองนับตั้งแต่สแกนจนกลอนทำงาน ดังภาพประกอบที่ 4.3 และตารางที่ 4.4</w:t>
+        <w:t xml:space="preserve">การทดสอบนี้ประเมินความแม่นยำในการจำแนกสิทธิ์การเข้าถึงของโมดูล GM66 และเซิร์ฟเวอร์ รวมถึงการสั่งกลอนแม่เหล็กไฟฟ้า ทดสอบ 15 ครั้ง ประกอบด้วยรหัสที่ได้รับอนุญาต 10 ครั้ง และรหัสที่ไม่ได้รับอนุญาต 5 ครั้ง ได้แก่ รหัสหมดอายุ (expired) 1 ครั้ง รหัสที่ใช้แล้ว (already_used) 2 ครั้ง และรหัสที่ไม่มีในระบบ (invalid_code) 2 ครั้ง ตามสถานะในตารางที่ 3.7 </w:t>
+      </w:r>
+      <w:r>
+        <w:rPr>
+          <w:rFonts w:ascii="TH SarabunPSK" w:hAnsi="TH SarabunPSK" w:cs="TH SarabunPSK" w:eastAsia="TH SarabunPSK"/>
+          <w:b w:val="0"/>
+          <w:i w:val="0"/>
+          <w:sz w:val="32"/>
+          <w:szCs w:val="32"/>
+          <w:bCs w:val="0"/>
+          <w:highlight w:val="yellow"/>
+        </w:rPr>
+        <w:t>[วิธีทดสอบรหัสหมดอายุ เช่น ตั้งอายุรหัสสั้นลงชั่วคราว]</w:t>
+      </w:r>
+      <w:r>
+        <w:rPr>
+          <w:rFonts w:ascii="TH SarabunPSK" w:hAnsi="TH SarabunPSK" w:cs="TH SarabunPSK" w:eastAsia="TH SarabunPSK"/>
+          <w:b w:val="0"/>
+          <w:i w:val="0"/>
+          <w:sz w:val="32"/>
+          <w:szCs w:val="32"/>
+          <w:bCs w:val="0"/>
+        </w:rPr>
+        <w:t xml:space="preserve"> กรณีรหัสได้รับอนุญาต กลอนต้องปลดล็อก 10 วินาทีพร้อมเสียงบัซเซอร์ 1 ครั้ง ส่วนกรณีไม่ได้รับอนุญาต กลอนต้องไม่ปลดล็อก บัซเซอร์ส่งเสียง 2 ครั้ง เซิร์ฟเวอร์บันทึกเหตุการณ์ qr_scan ผล denied พร้อมเหตุผลลงใน Access Log และแจ้งเตือนความพยายามเข้าถึงที่ถูกปฏิเสธผ่าน LINE บันทึกผลและระยะเวลาตอบสนองนับตั้งแต่อ่านรหัสจนกลอนทำงาน ดังภาพประกอบที่ 4.3 และตารางที่ 4.4</w:t>
       </w:r>
     </w:p>
     <w:p>
@@ -3542,7 +3640,7 @@
                 <w:szCs w:val="28"/>
                 <w:bCs w:val="0"/>
               </w:rPr>
-              <w:t>ไม่อนุญาต (หมดอายุ)</w:t>
+              <w:t>ไม่อนุญาต (expired)</w:t>
             </w:r>
           </w:p>
         </w:tc>
@@ -3802,7 +3900,7 @@
                 <w:szCs w:val="28"/>
                 <w:bCs w:val="0"/>
               </w:rPr>
-              <w:t>ไม่อนุญาต (ใช้แล้ว)</w:t>
+              <w:t>ไม่อนุญาต (already_used)</w:t>
             </w:r>
           </w:p>
         </w:tc>
@@ -4062,7 +4160,7 @@
                 <w:szCs w:val="28"/>
                 <w:bCs w:val="0"/>
               </w:rPr>
-              <w:t>ไม่อนุญาต (ไม่ถูกต้อง)</w:t>
+              <w:t>ไม่อนุญาต (invalid_code)</w:t>
             </w:r>
           </w:p>
         </w:tc>
@@ -4322,7 +4420,7 @@
                 <w:szCs w:val="28"/>
                 <w:bCs w:val="0"/>
               </w:rPr>
-              <w:t>ไม่อนุญาต (ใช้แล้ว)</w:t>
+              <w:t>ไม่อนุญาต (already_used)</w:t>
             </w:r>
           </w:p>
         </w:tc>
@@ -4408,7 +4506,7 @@
                 <w:szCs w:val="28"/>
                 <w:bCs w:val="0"/>
               </w:rPr>
-              <w:t>ไม่อนุญาต (ไม่ถูกต้อง)</w:t>
+              <w:t>ไม่อนุญาต (invalid_code)</w:t>
             </w:r>
           </w:p>
         </w:tc>
@@ -4565,7 +4663,7 @@
           <w:szCs w:val="28"/>
           <w:bCs w:val="0"/>
         </w:rPr>
-        <w:t>กรณีรหัสไม่ได้รับอนุญาต การตอบสนองของกลอนถูกต้อง หมายถึง กลอนไม่ปลดล็อกและบัซเซอร์ส่งเสียงปฏิเสธ</w:t>
+        <w:t>กรณีรหัสไม่ได้รับอนุญาต การตอบสนองของกลอนถูกต้อง หมายถึง กลอนไม่ปลดล็อกและบัซเซอร์ส่งเสียง 2 ครั้ง (ถ้าเซิร์ฟเวอร์ไม่ตอบภายใน 3 วินาที บัซเซอร์จะส่งเสียง 3 ครั้งและถือว่าปฏิเสธ)</w:t>
       </w:r>
     </w:p>
     <w:p>
@@ -4583,7 +4681,7 @@
           <w:szCs w:val="28"/>
           <w:bCs w:val="0"/>
         </w:rPr>
-        <w:t>ระยะเวลาตอบสนองเริ่มนับตั้งแต่สแกนรหัสจนถึงกลอนทำงาน (กรณีไม่อนุญาต นับจนระบบแสดงผลปฏิเสธ)</w:t>
+        <w:t>ระยะเวลาตอบสนองอ่านจาก Serial Monitor ของ ESP32 นับตั้งแต่อ่านรหัสจนถึงกลอนทำงาน (กรณีไม่อนุญาต นับจนระบบแสดงผลปฏิเสธ)</w:t>
       </w:r>
     </w:p>
     <w:p>
@@ -5328,7 +5426,7 @@
           <w:szCs w:val="32"/>
           <w:bCs w:val="0"/>
         </w:rPr>
-        <w:t>การทดสอบนี้ตรวจสอบการเปลี่ยนสถานะจาก Door Open เป็น Locked ซึ่งเป็นตัวกระตุ้นให้บอร์ด ESP32 ส่งพัลส์ 200 ms ไปยัง ESP32-CAM ตามภาพประกอบที่ 3.9 จากนั้น ESP32-CAM สอบถามคำสั่งจากเซิร์ฟเวอร์ ถ่ายภาพ และส่งไปยังเซิร์ฟเวอร์ ทดสอบ 15 ครั้ง โดยปลดล็อกด้วยรหัสคิวอาร์ เปิดประตู วางพัสดุ แล้วปิดประตูด้วยมือจนสนิททุกครั้ง ผลแสดงดังตารางที่ 4.6 และตัวอย่างข้อความแจ้งเตือนพร้อมภาพหลักฐานที่ได้รับผ่าน LINE แสดงดังภาพประกอบที่ 4.4</w:t>
+        <w:t>การทดสอบนี้ตรวจสอบการเปลี่ยนสถานะจาก Door Open เป็น Locked ซึ่งเป็นตัวกระตุ้นให้บอร์ด ESP32 ส่งพัลส์ 200 ms ไปยัง ESP32-CAM ตามภาพประกอบที่ 3.9 จากนั้น ESP32-CAM สอบถามเซิร์ฟเวอร์ว่ามีเหตุการณ์ใดรอภาพอยู่ ถ่ายภาพ (เปิดไฟแฟลช) และส่งไปยังเซิร์ฟเวอร์ ซึ่งแจ้งเตือนการส่งมอบพัสดุพร้อมภาพผ่าน LINE หากไม่ได้รับภาพภายในเวลาที่กำหนดจะส่งข้อความแจ้งเตือนแบบไม่มีรูปภาพ ทดสอบ 15 ครั้ง โดยปลดล็อกด้วยรหัสคิวอาร์ เปิดประตู วางพัสดุ แล้วปิดประตูด้วยมือจนสนิททุกครั้ง ผลแสดงดังตารางที่ 4.6 และตัวอย่างข้อความแจ้งเตือนพร้อมภาพหลักฐานที่ได้รับผ่าน LINE แสดงดังภาพประกอบที่ 4.4</w:t>
       </w:r>
     </w:p>
     <w:p>
@@ -6457,7 +6555,7 @@
           <w:szCs w:val="28"/>
           <w:bCs w:val="0"/>
         </w:rPr>
-        <w:t>เวลารอภาพนับจากประตูปิดสนิทจนเซิร์ฟเวอร์ได้รับภาพ</w:t>
+        <w:t>เวลารอภาพ = เวลาเหตุการณ์ image_capture − เวลาเหตุการณ์ locked ใน Access Log</w:t>
       </w:r>
     </w:p>
     <w:p>
@@ -7150,7 +7248,30 @@
           <w:szCs w:val="32"/>
           <w:bCs w:val="0"/>
         </w:rPr>
-        <w:t xml:space="preserve"> เกณฑ์ 30 วินาที (T_image) </w:t>
+        <w:t xml:space="preserve"> เกณฑ์ </w:t>
+      </w:r>
+      <w:r>
+        <w:rPr>
+          <w:rFonts w:ascii="TH SarabunPSK" w:hAnsi="TH SarabunPSK" w:cs="TH SarabunPSK" w:eastAsia="TH SarabunPSK"/>
+          <w:b w:val="0"/>
+          <w:i w:val="0"/>
+          <w:sz w:val="32"/>
+          <w:szCs w:val="32"/>
+          <w:bCs w:val="0"/>
+          <w:highlight w:val="yellow"/>
+        </w:rPr>
+        <w:t>[30]</w:t>
+      </w:r>
+      <w:r>
+        <w:rPr>
+          <w:rFonts w:ascii="TH SarabunPSK" w:hAnsi="TH SarabunPSK" w:cs="TH SarabunPSK" w:eastAsia="TH SarabunPSK"/>
+          <w:b w:val="0"/>
+          <w:i w:val="0"/>
+          <w:sz w:val="32"/>
+          <w:szCs w:val="32"/>
+          <w:bCs w:val="0"/>
+        </w:rPr>
+        <w:t xml:space="preserve"> วินาที (T_image) </w:t>
       </w:r>
       <w:r>
         <w:rPr>
@@ -8411,7 +8532,7 @@
           <w:szCs w:val="32"/>
           <w:bCs w:val="0"/>
         </w:rPr>
-        <w:t>เนื่องจากต้นแบบไม่มีโช้คอัพประตู ผู้ใช้ต้องปิดประตูด้วยมือ จึงมีโอกาสที่ประตูปิดไม่สนิท ระบบจึงออกแบบให้แจ้งเตือนเมื่อประตูเปิดค้างเกิน 60 วินาที (T_ajar) โดยส่งข้อความผ่าน LINE ครั้งเดียวและให้บัซเซอร์เตือนซ้ำจนกว่าจะปิดประตู การทดสอบนี้จำลองกรณีมีวัตถุกีดขวางทำให้ประตูปิดไม่สนิท เพื่อวัดความถูกต้องของการแจ้งเตือนด้วยเสียงและผ่าน LINE Messaging API ทดสอบ 15 ครั้ง ดังตารางที่ 4.9 และตัวอย่างข้อความแจ้งเตือนที่ได้รับแสดงดังภาพประกอบที่ 4.6</w:t>
+        <w:t>เนื่องจากต้นแบบไม่มีโช้คอัพประตู ผู้ใช้ต้องปิดประตูด้วยมือ จึงมีโอกาสที่ประตูปิดไม่สนิท ระบบจึงออกแบบให้แจ้งเตือนเมื่อประตูเปิดค้างเกิน 60 วินาที (T_ajar) โดยเซิร์ฟเวอร์บันทึกเหตุการณ์ door_ajar และส่งข้อความผ่าน LINE ครั้งเดียว ส่วนบัซเซอร์ที่ตัวเครื่องส่งเสียงเตือนซ้ำจนกว่าจะปิดประตู การทดสอบนี้จำลองกรณีมีวัตถุกีดขวางทำให้ประตูปิดไม่สนิท เพื่อวัดความถูกต้องของการแจ้งเตือนด้วยเสียงและผ่าน LINE Messaging API ทดสอบ 15 ครั้ง ดังตารางที่ 4.9 และตัวอย่างข้อความแจ้งเตือนที่ได้รับแสดงดังภาพประกอบที่ 4.6</w:t>
       </w:r>
     </w:p>
     <w:p>
@@ -9523,6 +9644,24 @@
           <w:bCs w:val="0"/>
         </w:rPr>
         <w:t>√ = มีเสียงเตือน/แจ้งเตือนเข้า LINE    × = ไม่มีการแจ้งเตือนเมื่อเกิดข้อผิดพลาด</w:t>
+      </w:r>
+    </w:p>
+    <w:p>
+      <w:pPr>
+        <w:spacing w:after="0"/>
+        <w:ind w:left="283"/>
+        <w:jc w:val="left"/>
+      </w:pPr>
+      <w:r>
+        <w:rPr>
+          <w:rFonts w:ascii="TH SarabunPSK" w:hAnsi="TH SarabunPSK" w:cs="TH SarabunPSK" w:eastAsia="TH SarabunPSK"/>
+          <w:b w:val="0"/>
+          <w:i w:val="0"/>
+          <w:sz w:val="28"/>
+          <w:szCs w:val="28"/>
+          <w:bCs w:val="0"/>
+        </w:rPr>
+        <w:t>เวลาตั้งแต่เปิดค้างถึงแจ้งเตือน = เวลาเหตุการณ์ door_ajar − เวลาเหตุการณ์ door_open ใน Access Log</w:t>
       </w:r>
     </w:p>
     <w:p>
@@ -13347,7 +13486,7 @@
           <w:szCs w:val="32"/>
           <w:bCs w:val="0"/>
         </w:rPr>
-        <w:t xml:space="preserve"> ที่ใช้รหัส OTP ปลดล็อกและบันทึกภาพ แต่ไม่มีระบบเตือนการเข้าถึงโดยไม่ได้รับอนุญาต ในขณะที่ต้นแบบนี้แจ้งเตือนทั้งกรณีประตูเปิดค้างและประตูถูกเปิดขณะล็อก</w:t>
+        <w:t xml:space="preserve"> ที่ใช้รหัส OTP ปลดล็อกและบันทึกภาพ แต่ไม่มีระบบเตือนการเข้าถึงโดยไม่ได้รับอนุญาต ในขณะที่ต้นแบบนี้แจ้งเตือนทั้งกรณีประตูเปิดค้างและประตูถูกเปิดขณะล็อก (กรณีหลังเป็นความสามารถของระบบ ไม่ได้อยู่ในแผนการทดสอบของบทนี้)</w:t>
       </w:r>
     </w:p>
     <w:p>

</xml_diff>

<commit_message>
Chapter 4: fix caption italics
Co-Authored-By: Claude Sonnet 5.5 <noreply@anthropic.com>
Claude-Session: https://claude.ai/code/session_01VnBozHXF9mmTyHiTgVtwAM
</commit_message>
<xml_diff>
--- a/บทที่4_ไฟนอล_เฉพาะบท.docx
+++ b/บทที่4_ไฟนอล_เฉพาะบท.docx
@@ -86,6 +86,7 @@
           <w:sz w:val="32"/>
           <w:szCs w:val="32"/>
           <w:bCs w:val="0"/>
+          <w:iCs w:val="0"/>
         </w:rPr>
         <w:t>ในบทนี้นำเสนอผลการสร้างและทดสอบต้นแบบกล่องรับพัสดุไอโอทีอัจฉริยะตามที่ออกแบบไว้ในบทที่ 3 โดยแบ่งเป็น 3 ส่วน ได้แก่ (1) ผลการสร้างต้นแบบ ประกอบด้วยโครงสร้างกล่องและวงจรควบคุมก่อนติดตั้ง (หัวข้อ 4.1 และ 4.2) (2) ผลการตรวจวัดแรงดันไฟเลี้ยงและวงจรขับกลอน (หัวข้อ 4.3) และ (3) ผลการทดสอบสมรรถนะของระบบ 5 ด้าน ได้แก่ การยืนยันตัวตนและการปลดล็อก การบันทึกภาพหลักฐาน การตรวจสอบสถานะประตู การแจ้งเตือน และการทำงานโดยรวม (หัวข้อ 4.4–4.9) จากนั้นอภิปรายผลเทียบกับวัตถุประสงค์และงานวิจัยที่เกี่ยวข้อง (หัวข้อ 4.10)</w:t>
       </w:r>
@@ -105,6 +106,7 @@
           <w:sz w:val="32"/>
           <w:szCs w:val="32"/>
           <w:bCs w:val="1"/>
+          <w:iCs w:val="0"/>
         </w:rPr>
         <w:t>4.1 แบบจำลองกล่องรับพัสดุไอโอทีอัจฉริยะ</w:t>
       </w:r>
@@ -123,6 +125,7 @@
           <w:sz w:val="32"/>
           <w:szCs w:val="32"/>
           <w:bCs w:val="1"/>
+          <w:iCs w:val="0"/>
         </w:rPr>
         <w:t>4.1.1 โครงสร้างกล่อง</w:t>
       </w:r>
@@ -141,6 +144,7 @@
           <w:sz w:val="32"/>
           <w:szCs w:val="32"/>
           <w:bCs w:val="0"/>
+          <w:iCs w:val="0"/>
         </w:rPr>
         <w:t>คณะผู้จัดทำสร้างโครงสร้างกล่องตามแบบจำลองสามมิติที่ออกแบบด้วยโปรแกรม SolidWorks (ภาพประกอบที่ 3.6–3.8) โดยใช้อลูมิเนียมโปรไฟล์ 2020 เป็นโครง ปิดผนังด้วยแผ่นอลูมิเนียมคอมโพสิตหนา 3 มิลลิเมตร ขนาดพื้นที่ภายในกว้าง 42 เซนติเมตร ยาว 51 เซนติเมตร และสูง 69 เซนติเมตร บานประตูติดตั้งบานพับและมือจับ ทั้งนี้ต้นแบบที่สร้างจริงไม่ได้ติดตั้งโช้คอัพประตู (Door Closer) ที่แสดงในภาพประกอบที่ 3.6–3.8 ผู้ใช้จึงต้องปิดประตูด้วยมือจนสนิท และการติดตั้งโช้คอัพประตูได้นำไปเสนอเป็นแนวทางพัฒนาต่อยอดในหัวข้อ 5.4 โครงสร้างที่ประกอบจริงแสดงดังภาพประกอบที่ 4.1</w:t>
       </w:r>
@@ -201,6 +205,7 @@
           <w:sz w:val="32"/>
           <w:szCs w:val="32"/>
           <w:bCs w:val="0"/>
+          <w:iCs w:val="0"/>
         </w:rPr>
         <w:t>ภาพประกอบที่ 4.1 โครงสร้างกล่องรับพัสดุไอโอทีอัจฉริยะที่ประกอบขึ้นจริง</w:t>
       </w:r>
@@ -219,6 +224,7 @@
           <w:sz w:val="32"/>
           <w:szCs w:val="32"/>
           <w:bCs w:val="1"/>
+          <w:iCs w:val="0"/>
         </w:rPr>
         <w:t>4.1.2 การติดตั้งอุปกรณ์</w:t>
       </w:r>
@@ -237,6 +243,7 @@
           <w:sz w:val="32"/>
           <w:szCs w:val="32"/>
           <w:bCs w:val="0"/>
+          <w:iCs w:val="0"/>
         </w:rPr>
         <w:t>การติดตั้งอุปกรณ์แบ่งเป็น 2 พื้นที่ตามที่ออกแบบไว้ในหัวข้อ 3.3.6 ดังตารางที่ 4.1</w:t>
       </w:r>
@@ -257,6 +264,7 @@
           <w:sz w:val="32"/>
           <w:szCs w:val="32"/>
           <w:bCs w:val="0"/>
+          <w:iCs w:val="0"/>
         </w:rPr>
         <w:t>ตารางที่ 4.1 ตำแหน่งการติดตั้งอุปกรณ์และหน้าที่</w:t>
       </w:r>
@@ -299,6 +307,7 @@
                 <w:sz w:val="28"/>
                 <w:szCs w:val="28"/>
                 <w:bCs w:val="1"/>
+                <w:iCs w:val="0"/>
               </w:rPr>
               <w:t>พื้นที่</w:t>
             </w:r>
@@ -323,6 +332,7 @@
                 <w:sz w:val="28"/>
                 <w:szCs w:val="28"/>
                 <w:bCs w:val="1"/>
+                <w:iCs w:val="0"/>
               </w:rPr>
               <w:t>อุปกรณ์</w:t>
             </w:r>
@@ -347,6 +357,7 @@
                 <w:sz w:val="28"/>
                 <w:szCs w:val="28"/>
                 <w:bCs w:val="1"/>
+                <w:iCs w:val="0"/>
               </w:rPr>
               <w:t>ตำแหน่งติดตั้ง</w:t>
             </w:r>
@@ -371,6 +382,7 @@
                 <w:sz w:val="28"/>
                 <w:szCs w:val="28"/>
                 <w:bCs w:val="1"/>
+                <w:iCs w:val="0"/>
               </w:rPr>
               <w:t>หน้าที่</w:t>
             </w:r>
@@ -399,6 +411,7 @@
                 <w:sz w:val="28"/>
                 <w:szCs w:val="28"/>
                 <w:bCs w:val="0"/>
+                <w:iCs w:val="0"/>
               </w:rPr>
               <w:t>ภายนอกตู้</w:t>
             </w:r>
@@ -421,6 +434,7 @@
                 <w:sz w:val="28"/>
                 <w:szCs w:val="28"/>
                 <w:bCs w:val="0"/>
+                <w:iCs w:val="0"/>
               </w:rPr>
               <w:t>โมดูลสแกนเนอร์ GM66</w:t>
             </w:r>
@@ -443,6 +457,7 @@
                 <w:sz w:val="28"/>
                 <w:szCs w:val="28"/>
                 <w:bCs w:val="0"/>
+                <w:iCs w:val="0"/>
               </w:rPr>
               <w:t>ผนังด้านหน้า เหนือบานประตู</w:t>
             </w:r>
@@ -466,6 +481,7 @@
                 <w:sz w:val="28"/>
                 <w:szCs w:val="28"/>
                 <w:bCs w:val="0"/>
+                <w:iCs w:val="0"/>
               </w:rPr>
               <w:t>อ่านรหัสคิวอาร์</w:t>
             </w:r>
@@ -494,6 +510,7 @@
                 <w:sz w:val="28"/>
                 <w:szCs w:val="28"/>
                 <w:bCs w:val="0"/>
+                <w:iCs w:val="0"/>
               </w:rPr>
               <w:t>ภายนอกตู้</w:t>
             </w:r>
@@ -516,6 +533,7 @@
                 <w:sz w:val="28"/>
                 <w:szCs w:val="28"/>
                 <w:bCs w:val="0"/>
+                <w:iCs w:val="0"/>
               </w:rPr>
               <w:t>กลอนแม่เหล็กไฟฟ้า (Solenoid Lock)</w:t>
             </w:r>
@@ -539,6 +557,7 @@
                 <w:sz w:val="28"/>
                 <w:szCs w:val="28"/>
                 <w:bCs w:val="0"/>
+                <w:iCs w:val="0"/>
               </w:rPr>
               <w:t>บริเวณขอบบานประตู</w:t>
             </w:r>
@@ -561,6 +580,7 @@
                 <w:sz w:val="28"/>
                 <w:szCs w:val="28"/>
                 <w:bCs w:val="0"/>
+                <w:iCs w:val="0"/>
               </w:rPr>
               <w:t>ล็อกและปลดล็อกประตู</w:t>
             </w:r>
@@ -589,6 +609,7 @@
                 <w:sz w:val="28"/>
                 <w:szCs w:val="28"/>
                 <w:bCs w:val="0"/>
+                <w:iCs w:val="0"/>
               </w:rPr>
               <w:t>ภายนอกตู้</w:t>
             </w:r>
@@ -611,6 +632,7 @@
                 <w:sz w:val="28"/>
                 <w:szCs w:val="28"/>
                 <w:bCs w:val="0"/>
+                <w:iCs w:val="0"/>
               </w:rPr>
               <w:t>กล่องพลาสติกกันน้ำ (ESP32, XL4015E1, วงจรขับกลอน)</w:t>
             </w:r>
@@ -634,6 +656,7 @@
                 <w:sz w:val="28"/>
                 <w:szCs w:val="28"/>
                 <w:bCs w:val="0"/>
+                <w:iCs w:val="0"/>
               </w:rPr>
               <w:t>ด้านข้างตู้</w:t>
             </w:r>
@@ -656,6 +679,7 @@
                 <w:sz w:val="28"/>
                 <w:szCs w:val="28"/>
                 <w:bCs w:val="0"/>
+                <w:iCs w:val="0"/>
               </w:rPr>
               <w:t>บรรจุบอร์ดควบคุมหลัก</w:t>
             </w:r>
@@ -684,6 +708,7 @@
                 <w:sz w:val="28"/>
                 <w:szCs w:val="28"/>
                 <w:bCs w:val="0"/>
+                <w:iCs w:val="0"/>
               </w:rPr>
               <w:t>ภายนอกตู้</w:t>
             </w:r>
@@ -706,6 +731,7 @@
                 <w:sz w:val="28"/>
                 <w:szCs w:val="28"/>
                 <w:bCs w:val="0"/>
+                <w:iCs w:val="0"/>
               </w:rPr>
               <w:t>ปุ่มกดปลดล็อก และบัซเซอร์</w:t>
             </w:r>
@@ -728,6 +754,7 @@
                 <w:sz w:val="28"/>
                 <w:szCs w:val="28"/>
                 <w:bCs w:val="0"/>
+                <w:iCs w:val="0"/>
                 <w:highlight w:val="yellow"/>
               </w:rPr>
               <w:t>[ระบุตำแหน่งที่ติดตั้งจริง]</w:t>
@@ -751,6 +778,7 @@
                 <w:sz w:val="28"/>
                 <w:szCs w:val="28"/>
                 <w:bCs w:val="0"/>
+                <w:iCs w:val="0"/>
               </w:rPr>
               <w:t>ปลดล็อกด้วยมือ และแจ้งเตือนด้วยเสียง</w:t>
             </w:r>
@@ -779,6 +807,7 @@
                 <w:sz w:val="28"/>
                 <w:szCs w:val="28"/>
                 <w:bCs w:val="0"/>
+                <w:iCs w:val="0"/>
               </w:rPr>
               <w:t>ภายในตู้</w:t>
             </w:r>
@@ -802,6 +831,7 @@
                 <w:sz w:val="28"/>
                 <w:szCs w:val="28"/>
                 <w:bCs w:val="0"/>
+                <w:iCs w:val="0"/>
               </w:rPr>
               <w:t>บอร์ด ESP32-CAM</w:t>
             </w:r>
@@ -825,6 +855,7 @@
                 <w:sz w:val="28"/>
                 <w:szCs w:val="28"/>
                 <w:bCs w:val="0"/>
+                <w:iCs w:val="0"/>
               </w:rPr>
               <w:t>เพดานตู้</w:t>
             </w:r>
@@ -848,6 +879,7 @@
                 <w:sz w:val="28"/>
                 <w:szCs w:val="28"/>
                 <w:bCs w:val="0"/>
+                <w:iCs w:val="0"/>
               </w:rPr>
               <w:t>บันทึกภาพหลักฐาน</w:t>
             </w:r>
@@ -875,6 +907,7 @@
                 <w:sz w:val="28"/>
                 <w:szCs w:val="28"/>
                 <w:bCs w:val="0"/>
+                <w:iCs w:val="0"/>
               </w:rPr>
               <w:t>ภายในตู้</w:t>
             </w:r>
@@ -894,6 +927,7 @@
                 <w:sz w:val="28"/>
                 <w:szCs w:val="28"/>
                 <w:bCs w:val="0"/>
+                <w:iCs w:val="0"/>
               </w:rPr>
               <w:t>Magnetic Reed Switch MC-38</w:t>
             </w:r>
@@ -916,6 +950,7 @@
                 <w:sz w:val="28"/>
                 <w:szCs w:val="28"/>
                 <w:bCs w:val="0"/>
+                <w:iCs w:val="0"/>
               </w:rPr>
               <w:t>กรอบประตูด้านบน</w:t>
             </w:r>
@@ -935,6 +970,7 @@
                 <w:sz w:val="28"/>
                 <w:szCs w:val="28"/>
                 <w:bCs w:val="0"/>
+                <w:iCs w:val="0"/>
               </w:rPr>
               <w:t>ตรวจสอบสถานะเปิด-ปิดประตู</w:t>
             </w:r>
@@ -961,6 +997,7 @@
           <w:sz w:val="32"/>
           <w:szCs w:val="32"/>
           <w:bCs w:val="0"/>
+          <w:iCs w:val="0"/>
         </w:rPr>
         <w:t>จากตารางที่ 4.1 บอร์ดควบคุมหลักถูกแยกไว้ในกล่องพลาสติกด้านนอกตู้ เนื่องจากแผ่นอลูมิเนียมคอมโพสิตลดทอนสัญญาณ Wi-Fi ส่วนบอร์ด ESP32-CAM อยู่ภายในตู้โลหะ จึงต้องติดตามผลกระทบต่อการส่งภาพในหัวข้อ 4.6</w:t>
       </w:r>
@@ -980,6 +1017,7 @@
           <w:sz w:val="32"/>
           <w:szCs w:val="32"/>
           <w:bCs w:val="1"/>
+          <w:iCs w:val="0"/>
         </w:rPr>
         <w:t>4.2 ภาพรวมวงจรก่อนลงตู้ระบบจริง</w:t>
       </w:r>
@@ -998,6 +1036,7 @@
           <w:sz w:val="32"/>
           <w:szCs w:val="32"/>
           <w:bCs w:val="0"/>
+          <w:iCs w:val="0"/>
         </w:rPr>
         <w:t>ก่อนติดตั้งเข้าตู้ คณะผู้จัดทำประกอบวงจรทั้งหมดไว้ในกล่องพลาสติกกันน้ำตามแผนผังวงจรในภาพประกอบที่ 3.4 และตรวจสอบนอกตู้ด้วยมัลติมิเตอร์ ดังภาพประกอบที่ 4.2 ตามขั้นตอนในหัวข้อ 3.3.4 คือ (1) ปรับเอาต์พุตของ XL4015E1 ให้ได้ 5.0 V ก่อนต่อโหลด (2) ต่อกราวด์ร่วมของทุกอุปกรณ์ (3) ต่อสายตามการกำหนดขา GPIO ในตารางที่ 3.8 และ (4) ตรวจสอบแรงดันของแต่ละรางไฟก่อนจ่ายไฟให้บอร์ด</w:t>
       </w:r>
@@ -1058,6 +1097,7 @@
           <w:sz w:val="32"/>
           <w:szCs w:val="32"/>
           <w:bCs w:val="0"/>
+          <w:iCs w:val="0"/>
         </w:rPr>
         <w:t>ภาพประกอบที่ 4.2 ภาพรวมวงจรควบคุมก่อนติดตั้งเข้าตู้</w:t>
       </w:r>
@@ -1076,6 +1116,7 @@
           <w:sz w:val="32"/>
           <w:szCs w:val="32"/>
           <w:bCs w:val="0"/>
+          <w:iCs w:val="0"/>
         </w:rPr>
         <w:t>การทดสอบวงจรนอกตู้ก่อนช่วยแยกปัญหาของวงจรออกจากปัญหาของโครงสร้างและการเดินสายภายในตู้ ผลการตรวจวัดแสดงในหัวข้อ 4.3</w:t>
       </w:r>
@@ -1095,6 +1136,7 @@
           <w:sz w:val="32"/>
           <w:szCs w:val="32"/>
           <w:bCs w:val="1"/>
+          <w:iCs w:val="0"/>
         </w:rPr>
         <w:t>4.3 ผลการตรวจวัดแรงดันไฟเลี้ยงและวงจรขับกลอน</w:t>
       </w:r>
@@ -1113,6 +1155,7 @@
           <w:sz w:val="32"/>
           <w:szCs w:val="32"/>
           <w:bCs w:val="0"/>
+          <w:iCs w:val="0"/>
         </w:rPr>
         <w:t>บทที่ 3 กำหนดให้ตรวจสอบค่าที่ได้จากการคำนวณออกแบบกับค่าที่วัดได้จริงในบทที่ 4 (หัวข้อ 3.2.1–3.2.3) คณะผู้จัดทำจึงวัดแรงดันและกระแสด้วยมัลติมิเตอร์ ผลแสดงดังตารางที่ 4.2</w:t>
       </w:r>
@@ -1133,6 +1176,7 @@
           <w:sz w:val="32"/>
           <w:szCs w:val="32"/>
           <w:bCs w:val="0"/>
+          <w:iCs w:val="0"/>
         </w:rPr>
         <w:t>ตารางที่ 4.2 ผลการตรวจวัดแรงดันและกระแสของแหล่งจ่ายไฟและวงจรขับกลอน</w:t>
       </w:r>
@@ -1176,6 +1220,7 @@
                 <w:sz w:val="28"/>
                 <w:szCs w:val="28"/>
                 <w:bCs w:val="1"/>
+                <w:iCs w:val="0"/>
               </w:rPr>
               <w:t>รายการตรวจวัด</w:t>
             </w:r>
@@ -1200,6 +1245,7 @@
                 <w:sz w:val="28"/>
                 <w:szCs w:val="28"/>
                 <w:bCs w:val="1"/>
+                <w:iCs w:val="0"/>
               </w:rPr>
               <w:t>จุดวัด</w:t>
             </w:r>
@@ -1224,6 +1270,7 @@
                 <w:sz w:val="28"/>
                 <w:szCs w:val="28"/>
                 <w:bCs w:val="1"/>
+                <w:iCs w:val="0"/>
               </w:rPr>
               <w:t>ค่าออกแบบ</w:t>
             </w:r>
@@ -1248,6 +1295,7 @@
                 <w:sz w:val="28"/>
                 <w:szCs w:val="28"/>
                 <w:bCs w:val="1"/>
+                <w:iCs w:val="0"/>
               </w:rPr>
               <w:t>ค่าที่วัดได้</w:t>
             </w:r>
@@ -1272,6 +1320,7 @@
                 <w:sz w:val="28"/>
                 <w:szCs w:val="28"/>
                 <w:bCs w:val="1"/>
+                <w:iCs w:val="0"/>
               </w:rPr>
               <w:t>ผล</w:t>
             </w:r>
@@ -1300,6 +1349,7 @@
                 <w:sz w:val="28"/>
                 <w:szCs w:val="28"/>
                 <w:bCs w:val="0"/>
+                <w:iCs w:val="0"/>
               </w:rPr>
               <w:t>แรงดันเอาต์พุต XL4015E1 (ไม่ต่อโหลด)</w:t>
             </w:r>
@@ -1323,6 +1373,7 @@
                 <w:sz w:val="28"/>
                 <w:szCs w:val="28"/>
                 <w:bCs w:val="0"/>
+                <w:iCs w:val="0"/>
               </w:rPr>
               <w:t>รางไฟ 5 V</w:t>
             </w:r>
@@ -1346,6 +1397,7 @@
                 <w:sz w:val="28"/>
                 <w:szCs w:val="28"/>
                 <w:bCs w:val="0"/>
+                <w:iCs w:val="0"/>
               </w:rPr>
               <w:t>5.0 V</w:t>
             </w:r>
@@ -1398,6 +1450,7 @@
                 <w:sz w:val="28"/>
                 <w:szCs w:val="28"/>
                 <w:bCs w:val="0"/>
+                <w:iCs w:val="0"/>
               </w:rPr>
               <w:t>แรงดันรางไฟ 5 V ขณะทำงานเต็มระบบ</w:t>
             </w:r>
@@ -1421,6 +1474,7 @@
                 <w:sz w:val="28"/>
                 <w:szCs w:val="28"/>
                 <w:bCs w:val="0"/>
+                <w:iCs w:val="0"/>
               </w:rPr>
               <w:t>ขา VIN ของ ESP32</w:t>
             </w:r>
@@ -1444,6 +1498,7 @@
                 <w:sz w:val="28"/>
                 <w:szCs w:val="28"/>
                 <w:bCs w:val="0"/>
+                <w:iCs w:val="0"/>
               </w:rPr>
               <w:t>5 V</w:t>
             </w:r>
@@ -1496,6 +1551,7 @@
                 <w:sz w:val="28"/>
                 <w:szCs w:val="28"/>
                 <w:bCs w:val="0"/>
+                <w:iCs w:val="0"/>
               </w:rPr>
               <w:t>กระแสรางไฟ 5 V</w:t>
             </w:r>
@@ -1519,6 +1575,7 @@
                 <w:sz w:val="28"/>
                 <w:szCs w:val="28"/>
                 <w:bCs w:val="0"/>
+                <w:iCs w:val="0"/>
               </w:rPr>
               <w:t>อนุกรมรางไฟ 5 V</w:t>
             </w:r>
@@ -1541,6 +1598,7 @@
                 <w:sz w:val="28"/>
                 <w:szCs w:val="28"/>
                 <w:bCs w:val="0"/>
+                <w:iCs w:val="0"/>
               </w:rPr>
               <w:t>0.78 A (ออกแบบ 1.17 A)</w:t>
             </w:r>
@@ -1593,6 +1651,7 @@
                 <w:sz w:val="28"/>
                 <w:szCs w:val="28"/>
                 <w:bCs w:val="0"/>
+                <w:iCs w:val="0"/>
               </w:rPr>
               <w:t>กระแสรางไฟ 12 V ขณะกลอนทำงาน</w:t>
             </w:r>
@@ -1616,6 +1675,7 @@
                 <w:sz w:val="28"/>
                 <w:szCs w:val="28"/>
                 <w:bCs w:val="0"/>
+                <w:iCs w:val="0"/>
               </w:rPr>
               <w:t>อนุกรมรางไฟ 12 V</w:t>
             </w:r>
@@ -1639,6 +1699,7 @@
                 <w:sz w:val="28"/>
                 <w:szCs w:val="28"/>
                 <w:bCs w:val="0"/>
+                <w:iCs w:val="0"/>
               </w:rPr>
               <w:t>1.38 A</w:t>
             </w:r>
@@ -1691,6 +1752,7 @@
                 <w:sz w:val="28"/>
                 <w:szCs w:val="28"/>
                 <w:bCs w:val="0"/>
+                <w:iCs w:val="0"/>
               </w:rPr>
               <w:t>แรงดันเกตของ Q1 ขณะล็อก</w:t>
             </w:r>
@@ -1714,6 +1776,7 @@
                 <w:sz w:val="28"/>
                 <w:szCs w:val="28"/>
                 <w:bCs w:val="0"/>
+                <w:iCs w:val="0"/>
               </w:rPr>
               <w:t>เกต IRFZ44N</w:t>
             </w:r>
@@ -1737,6 +1800,7 @@
                 <w:sz w:val="28"/>
                 <w:szCs w:val="28"/>
                 <w:bCs w:val="0"/>
+                <w:iCs w:val="0"/>
               </w:rPr>
               <w:t>ต่ำกว่า 2 V</w:t>
             </w:r>
@@ -1789,6 +1853,7 @@
                 <w:sz w:val="28"/>
                 <w:szCs w:val="28"/>
                 <w:bCs w:val="0"/>
+                <w:iCs w:val="0"/>
               </w:rPr>
               <w:t>แรงดันเกตของ Q1 ขณะปลดล็อก</w:t>
             </w:r>
@@ -1812,6 +1877,7 @@
                 <w:sz w:val="28"/>
                 <w:szCs w:val="28"/>
                 <w:bCs w:val="0"/>
+                <w:iCs w:val="0"/>
               </w:rPr>
               <w:t>เกต IRFZ44N</w:t>
             </w:r>
@@ -1835,6 +1901,7 @@
                 <w:sz w:val="28"/>
                 <w:szCs w:val="28"/>
                 <w:bCs w:val="0"/>
+                <w:iCs w:val="0"/>
               </w:rPr>
               <w:t>≈ 12 V</w:t>
             </w:r>
@@ -1886,6 +1953,7 @@
                 <w:sz w:val="28"/>
                 <w:szCs w:val="28"/>
                 <w:bCs w:val="0"/>
+                <w:iCs w:val="0"/>
               </w:rPr>
               <w:t>ระดับสัญญาณ TXD ของ GM66</w:t>
             </w:r>
@@ -1908,6 +1976,7 @@
                 <w:sz w:val="28"/>
                 <w:szCs w:val="28"/>
                 <w:bCs w:val="0"/>
+                <w:iCs w:val="0"/>
               </w:rPr>
               <w:t>ขา GPIO16</w:t>
             </w:r>
@@ -1927,6 +1996,7 @@
                 <w:sz w:val="28"/>
                 <w:szCs w:val="28"/>
                 <w:bCs w:val="0"/>
+                <w:iCs w:val="0"/>
               </w:rPr>
               <w:t>≈ 3.3 V (วัดเบื้องต้น 3.39 V ตามหัวข้อ 2.5.3)</w:t>
             </w:r>
@@ -1970,6 +2040,7 @@
           <w:sz w:val="28"/>
           <w:szCs w:val="28"/>
           <w:bCs w:val="0"/>
+          <w:iCs w:val="0"/>
         </w:rPr>
         <w:t>หมายเหตุ: ค่าออกแบบจากหัวข้อ 3.2.1–3.2.3 และตารางที่ 3.2 ถ้าอุปกรณ์จริงต่างจากบทที่ 3 ให้ระบุค่าจริงและแก้ค่าออกแบบในตารางให้ตรงกัน</w:t>
       </w:r>
@@ -1993,6 +2064,7 @@
           <w:sz w:val="32"/>
           <w:szCs w:val="32"/>
           <w:bCs w:val="0"/>
+          <w:iCs w:val="0"/>
         </w:rPr>
         <w:t xml:space="preserve">จากตารางที่ 4.2 พบว่า แรงดันรางไฟ 5 V วัดได้ </w:t>
       </w:r>
@@ -2004,6 +2076,7 @@
           <w:sz w:val="32"/>
           <w:szCs w:val="32"/>
           <w:bCs w:val="0"/>
+          <w:iCs w:val="0"/>
           <w:highlight w:val="yellow"/>
         </w:rPr>
         <w:t>[ ]</w:t>
@@ -2016,6 +2089,7 @@
           <w:sz w:val="32"/>
           <w:szCs w:val="32"/>
           <w:bCs w:val="0"/>
+          <w:iCs w:val="0"/>
         </w:rPr>
         <w:t xml:space="preserve"> V </w:t>
       </w:r>
@@ -2027,6 +2101,7 @@
           <w:sz w:val="32"/>
           <w:szCs w:val="32"/>
           <w:bCs w:val="0"/>
+          <w:iCs w:val="0"/>
           <w:highlight w:val="yellow"/>
         </w:rPr>
         <w:t>[ใกล้เคียง/ต่างจาก]</w:t>
@@ -2039,6 +2114,7 @@
           <w:sz w:val="32"/>
           <w:szCs w:val="32"/>
           <w:bCs w:val="0"/>
+          <w:iCs w:val="0"/>
         </w:rPr>
         <w:t xml:space="preserve"> ค่าออกแบบ ส่วนแรงดันเกตของ Q1 ขณะล็อกวัดได้ </w:t>
       </w:r>
@@ -2050,6 +2126,7 @@
           <w:sz w:val="32"/>
           <w:szCs w:val="32"/>
           <w:bCs w:val="0"/>
+          <w:iCs w:val="0"/>
           <w:highlight w:val="yellow"/>
         </w:rPr>
         <w:t>[ ]</w:t>
@@ -2062,6 +2139,7 @@
           <w:sz w:val="32"/>
           <w:szCs w:val="32"/>
           <w:bCs w:val="0"/>
+          <w:iCs w:val="0"/>
         </w:rPr>
         <w:t xml:space="preserve"> V ซึ่ง </w:t>
       </w:r>
@@ -2073,6 +2151,7 @@
           <w:sz w:val="32"/>
           <w:szCs w:val="32"/>
           <w:bCs w:val="0"/>
+          <w:iCs w:val="0"/>
           <w:highlight w:val="yellow"/>
         </w:rPr>
         <w:t>[ต่ำกว่า/สูงกว่า]</w:t>
@@ -2085,6 +2164,7 @@
           <w:sz w:val="32"/>
           <w:szCs w:val="32"/>
           <w:bCs w:val="0"/>
+          <w:iCs w:val="0"/>
         </w:rPr>
         <w:t xml:space="preserve"> 2 V จึง </w:t>
       </w:r>
@@ -2096,6 +2176,7 @@
           <w:sz w:val="32"/>
           <w:szCs w:val="32"/>
           <w:bCs w:val="0"/>
+          <w:iCs w:val="0"/>
           <w:highlight w:val="yellow"/>
         </w:rPr>
         <w:t>[ทำให้ Q1 ปิดสนิท/ยังทำให้ Q1 นำกระแส]</w:t>
@@ -2108,6 +2189,7 @@
           <w:sz w:val="32"/>
           <w:szCs w:val="32"/>
           <w:bCs w:val="0"/>
+          <w:iCs w:val="0"/>
         </w:rPr>
         <w:t xml:space="preserve"> และขณะปลดล็อกวัดได้ </w:t>
       </w:r>
@@ -2119,6 +2201,7 @@
           <w:sz w:val="32"/>
           <w:szCs w:val="32"/>
           <w:bCs w:val="0"/>
+          <w:iCs w:val="0"/>
           <w:highlight w:val="yellow"/>
         </w:rPr>
         <w:t>[ ]</w:t>
@@ -2131,6 +2214,7 @@
           <w:sz w:val="32"/>
           <w:szCs w:val="32"/>
           <w:bCs w:val="0"/>
+          <w:iCs w:val="0"/>
         </w:rPr>
         <w:t xml:space="preserve"> V แสดงว่าวงจรขับกลอนที่ใช้ 2N7000 และ IRFZ44N </w:t>
       </w:r>
@@ -2142,6 +2226,7 @@
           <w:sz w:val="32"/>
           <w:szCs w:val="32"/>
           <w:bCs w:val="0"/>
+          <w:iCs w:val="0"/>
           <w:highlight w:val="yellow"/>
         </w:rPr>
         <w:t>[ทำงานตามที่ออกแบบ/ต้องปรับปรุง]</w:t>
@@ -2154,6 +2239,7 @@
           <w:sz w:val="32"/>
           <w:szCs w:val="32"/>
           <w:bCs w:val="0"/>
+          <w:iCs w:val="0"/>
         </w:rPr>
         <w:t xml:space="preserve"> </w:t>
       </w:r>
@@ -2165,6 +2251,7 @@
           <w:sz w:val="32"/>
           <w:szCs w:val="32"/>
           <w:bCs w:val="0"/>
+          <w:iCs w:val="0"/>
           <w:highlight w:val="yellow"/>
         </w:rPr>
         <w:t>[ถ้าค่าที่วัดต่างจากค่าออกแบบ ให้อธิบายสาเหตุที่พบและวิธีแก้ไข]</w:t>
@@ -2185,6 +2272,7 @@
           <w:sz w:val="32"/>
           <w:szCs w:val="32"/>
           <w:bCs w:val="1"/>
+          <w:iCs w:val="0"/>
         </w:rPr>
         <w:t>4.4 แผนการทดสอบและเกณฑ์การประเมิน</w:t>
       </w:r>
@@ -2203,6 +2291,7 @@
           <w:sz w:val="32"/>
           <w:szCs w:val="32"/>
           <w:bCs w:val="0"/>
+          <w:iCs w:val="0"/>
         </w:rPr>
         <w:t>เพื่อให้สอดคล้องกับวัตถุประสงค์ของโครงงานในการพัฒนาต้นแบบกล่องรับพัสดุอัจฉริยะที่เพิ่มความปลอดภัยในการรับพัสดุ และยืนยันหลักฐานการส่งมอบพัสดุ (Proof of Delivery) ได้อย่างถูกต้อง คณะผู้จัดทำแบ่งการทดสอบเป็น 5 ส่วน ส่วนละ 15 ครั้ง ดังตารางที่ 4.3 โดยทุกการทดสอบผู้ทดสอบปิดประตูด้วยมือจนสนิท และใช้เครือข่าย Wi-Fi เดียวกันตลอดการทดสอบ</w:t>
       </w:r>
@@ -2223,6 +2312,7 @@
           <w:sz w:val="32"/>
           <w:szCs w:val="32"/>
           <w:bCs w:val="0"/>
+          <w:iCs w:val="0"/>
         </w:rPr>
         <w:t>ตารางที่ 4.3 แผนการทดสอบและเกณฑ์การประเมิน</w:t>
       </w:r>
@@ -2266,6 +2356,7 @@
                 <w:sz w:val="28"/>
                 <w:szCs w:val="28"/>
                 <w:bCs w:val="1"/>
+                <w:iCs w:val="0"/>
               </w:rPr>
               <w:t>ส่วนที่</w:t>
             </w:r>
@@ -2290,6 +2381,7 @@
                 <w:sz w:val="28"/>
                 <w:szCs w:val="28"/>
                 <w:bCs w:val="1"/>
+                <w:iCs w:val="0"/>
               </w:rPr>
               <w:t>หัวข้อทดสอบ</w:t>
             </w:r>
@@ -2314,6 +2406,7 @@
                 <w:sz w:val="28"/>
                 <w:szCs w:val="28"/>
                 <w:bCs w:val="1"/>
+                <w:iCs w:val="0"/>
               </w:rPr>
               <w:t>จำนวนครั้ง</w:t>
             </w:r>
@@ -2338,6 +2431,7 @@
                 <w:sz w:val="28"/>
                 <w:szCs w:val="28"/>
                 <w:bCs w:val="1"/>
+                <w:iCs w:val="0"/>
               </w:rPr>
               <w:t>ตัวชี้วัด</w:t>
             </w:r>
@@ -2362,6 +2456,7 @@
                 <w:sz w:val="28"/>
                 <w:szCs w:val="28"/>
                 <w:bCs w:val="1"/>
+                <w:iCs w:val="0"/>
               </w:rPr>
               <w:t>เกณฑ์ (ที่มา)</w:t>
             </w:r>
@@ -2390,6 +2485,7 @@
                 <w:sz w:val="28"/>
                 <w:szCs w:val="28"/>
                 <w:bCs w:val="0"/>
+                <w:iCs w:val="0"/>
               </w:rPr>
               <w:t>1</w:t>
             </w:r>
@@ -2412,6 +2508,7 @@
                 <w:sz w:val="28"/>
                 <w:szCs w:val="28"/>
                 <w:bCs w:val="0"/>
+                <w:iCs w:val="0"/>
               </w:rPr>
               <w:t>ความถูกต้องในการยืนยันตัวตนและการปลดล็อก (4.5)</w:t>
             </w:r>
@@ -2434,6 +2531,7 @@
                 <w:sz w:val="28"/>
                 <w:szCs w:val="28"/>
                 <w:bCs w:val="0"/>
+                <w:iCs w:val="0"/>
               </w:rPr>
               <w:t>15 (อนุญาต 10, ไม่อนุญาต 5)</w:t>
             </w:r>
@@ -2456,6 +2554,7 @@
                 <w:sz w:val="28"/>
                 <w:szCs w:val="28"/>
                 <w:bCs w:val="0"/>
+                <w:iCs w:val="0"/>
               </w:rPr>
               <w:t>อัตราตอบสนองถูกต้อง, เวลาตอบสนอง</w:t>
             </w:r>
@@ -2478,6 +2577,7 @@
                 <w:sz w:val="28"/>
                 <w:szCs w:val="28"/>
                 <w:bCs w:val="0"/>
+                <w:iCs w:val="0"/>
               </w:rPr>
               <w:t>เวลาตอบสนองไม่เกิน 3 s (ตารางที่ 3.6)</w:t>
             </w:r>
@@ -2506,6 +2606,7 @@
                 <w:sz w:val="28"/>
                 <w:szCs w:val="28"/>
                 <w:bCs w:val="0"/>
+                <w:iCs w:val="0"/>
               </w:rPr>
               <w:t>2</w:t>
             </w:r>
@@ -2528,6 +2629,7 @@
                 <w:sz w:val="28"/>
                 <w:szCs w:val="28"/>
                 <w:bCs w:val="0"/>
+                <w:iCs w:val="0"/>
               </w:rPr>
               <w:t>การบันทึกภาพหลักฐาน (4.6)</w:t>
             </w:r>
@@ -2551,6 +2653,7 @@
                 <w:sz w:val="28"/>
                 <w:szCs w:val="28"/>
                 <w:bCs w:val="0"/>
+                <w:iCs w:val="0"/>
               </w:rPr>
               <w:t>15</w:t>
             </w:r>
@@ -2573,6 +2676,7 @@
                 <w:sz w:val="28"/>
                 <w:szCs w:val="28"/>
                 <w:bCs w:val="0"/>
+                <w:iCs w:val="0"/>
               </w:rPr>
               <w:t>อัตราบันทึกและส่งภาพสำเร็จ, เวลารอภาพ</w:t>
             </w:r>
@@ -2595,6 +2699,7 @@
                 <w:sz w:val="28"/>
                 <w:szCs w:val="28"/>
                 <w:bCs w:val="0"/>
+                <w:iCs w:val="0"/>
               </w:rPr>
               <w:t xml:space="preserve">ได้ภาพภายใน </w:t>
             </w:r>
@@ -2606,6 +2711,7 @@
                 <w:sz w:val="28"/>
                 <w:szCs w:val="28"/>
                 <w:bCs w:val="0"/>
+                <w:iCs w:val="0"/>
                 <w:highlight w:val="yellow"/>
               </w:rPr>
               <w:t>[30]</w:t>
@@ -2618,6 +2724,7 @@
                 <w:sz w:val="28"/>
                 <w:szCs w:val="28"/>
                 <w:bCs w:val="0"/>
+                <w:iCs w:val="0"/>
               </w:rPr>
               <w:t xml:space="preserve"> s (ตารางที่ 3.6)</w:t>
             </w:r>
@@ -2646,6 +2753,7 @@
                 <w:sz w:val="28"/>
                 <w:szCs w:val="28"/>
                 <w:bCs w:val="0"/>
+                <w:iCs w:val="0"/>
               </w:rPr>
               <w:t>3</w:t>
             </w:r>
@@ -2668,6 +2776,7 @@
                 <w:sz w:val="28"/>
                 <w:szCs w:val="28"/>
                 <w:bCs w:val="0"/>
+                <w:iCs w:val="0"/>
               </w:rPr>
               <w:t>การตรวจสอบสถานะประตูและการล็อกอัตโนมัติด้วย Reed Switch (4.7)</w:t>
             </w:r>
@@ -2691,6 +2800,7 @@
                 <w:sz w:val="28"/>
                 <w:szCs w:val="28"/>
                 <w:bCs w:val="0"/>
+                <w:iCs w:val="0"/>
               </w:rPr>
               <w:t>15</w:t>
             </w:r>
@@ -2713,6 +2823,7 @@
                 <w:sz w:val="28"/>
                 <w:szCs w:val="28"/>
                 <w:bCs w:val="0"/>
+                <w:iCs w:val="0"/>
               </w:rPr>
               <w:t>อัตราตรวจพบประตูปิดและสั่งล็อกสำเร็จ</w:t>
             </w:r>
@@ -2735,6 +2846,7 @@
                 <w:sz w:val="28"/>
                 <w:szCs w:val="28"/>
                 <w:bCs w:val="0"/>
+                <w:iCs w:val="0"/>
               </w:rPr>
               <w:t>กรองสัญญาณ 100 ms (ตารางที่ 3.6)</w:t>
             </w:r>
@@ -2763,6 +2875,7 @@
                 <w:sz w:val="28"/>
                 <w:szCs w:val="28"/>
                 <w:bCs w:val="0"/>
+                <w:iCs w:val="0"/>
               </w:rPr>
               <w:t>4</w:t>
             </w:r>
@@ -2785,6 +2898,7 @@
                 <w:sz w:val="28"/>
                 <w:szCs w:val="28"/>
                 <w:bCs w:val="0"/>
+                <w:iCs w:val="0"/>
               </w:rPr>
               <w:t>การแจ้งเตือนกรณีประตูปิดไม่สนิท (4.8)</w:t>
             </w:r>
@@ -2808,6 +2922,7 @@
                 <w:sz w:val="28"/>
                 <w:szCs w:val="28"/>
                 <w:bCs w:val="0"/>
+                <w:iCs w:val="0"/>
               </w:rPr>
               <w:t>15</w:t>
             </w:r>
@@ -2830,6 +2945,7 @@
                 <w:sz w:val="28"/>
                 <w:szCs w:val="28"/>
                 <w:bCs w:val="0"/>
+                <w:iCs w:val="0"/>
               </w:rPr>
               <w:t>อัตราแจ้งเตือนด้วยเสียงและ LINE</w:t>
             </w:r>
@@ -2852,6 +2968,7 @@
                 <w:sz w:val="28"/>
                 <w:szCs w:val="28"/>
                 <w:bCs w:val="0"/>
+                <w:iCs w:val="0"/>
               </w:rPr>
               <w:t>แจ้งเตือนเมื่อค้างเกิน 60 s (ตารางที่ 3.6)</w:t>
             </w:r>
@@ -2879,6 +2996,7 @@
                 <w:sz w:val="28"/>
                 <w:szCs w:val="28"/>
                 <w:bCs w:val="0"/>
+                <w:iCs w:val="0"/>
               </w:rPr>
               <w:t>5</w:t>
             </w:r>
@@ -2898,6 +3016,7 @@
                 <w:sz w:val="28"/>
                 <w:szCs w:val="28"/>
                 <w:bCs w:val="0"/>
+                <w:iCs w:val="0"/>
               </w:rPr>
               <w:t>ประสิทธิภาพของระบบโดยรวม (4.9)</w:t>
             </w:r>
@@ -2920,6 +3039,7 @@
                 <w:sz w:val="28"/>
                 <w:szCs w:val="28"/>
                 <w:bCs w:val="0"/>
+                <w:iCs w:val="0"/>
               </w:rPr>
               <w:t>15</w:t>
             </w:r>
@@ -2939,6 +3059,7 @@
                 <w:sz w:val="28"/>
                 <w:szCs w:val="28"/>
                 <w:bCs w:val="0"/>
+                <w:iCs w:val="0"/>
               </w:rPr>
               <w:t>อัตราความสำเร็จของระบบต่อเนื่อง</w:t>
             </w:r>
@@ -2958,6 +3079,7 @@
                 <w:sz w:val="28"/>
                 <w:szCs w:val="28"/>
                 <w:bCs w:val="0"/>
+                <w:iCs w:val="0"/>
               </w:rPr>
               <w:t>สำเร็จทุกขั้นตอนในรอบเดียว</w:t>
             </w:r>
@@ -2984,6 +3106,7 @@
           <w:sz w:val="32"/>
           <w:szCs w:val="32"/>
           <w:bCs w:val="0"/>
+          <w:iCs w:val="0"/>
         </w:rPr>
         <w:t xml:space="preserve">อัตราความสำเร็จ (ร้อยละ) คำนวณจาก (จำนวนครั้งที่ทำงานถูกต้อง ÷ จำนวนครั้งที่ทดสอบ) × 100 และค่าเฉลี่ยของระยะเวลาคำนวณจากผลรวมของระยะเวลาทุกครั้งหารด้วยจำนวนครั้งที่ทดสอบ เกณฑ์ผ่านของอัตราความสำเร็จที่ใช้ประเมินคือ </w:t>
       </w:r>
@@ -2995,6 +3118,7 @@
           <w:sz w:val="32"/>
           <w:szCs w:val="32"/>
           <w:bCs w:val="0"/>
+          <w:iCs w:val="0"/>
           <w:highlight w:val="yellow"/>
         </w:rPr>
         <w:t>[ไม่น้อยกว่าร้อยละ 90]</w:t>
@@ -3007,6 +3131,7 @@
           <w:sz w:val="32"/>
           <w:szCs w:val="32"/>
           <w:bCs w:val="0"/>
+          <w:iCs w:val="0"/>
         </w:rPr>
         <w:t xml:space="preserve"> </w:t>
       </w:r>
@@ -3018,6 +3143,7 @@
           <w:sz w:val="32"/>
           <w:szCs w:val="32"/>
           <w:bCs w:val="0"/>
+          <w:iCs w:val="0"/>
           <w:highlight w:val="yellow"/>
         </w:rPr>
         <w:t>[เกณฑ์ที่คณะผู้จัดทำกำหนดเอง ปรับได้ตามที่ปรึกษา]</w:t>
@@ -3030,6 +3156,7 @@
           <w:sz w:val="32"/>
           <w:szCs w:val="32"/>
           <w:bCs w:val="0"/>
+          <w:iCs w:val="0"/>
         </w:rPr>
         <w:t xml:space="preserve"> ส่วนเวลารอภาพที่เซิร์ฟเวอร์ตั้งไว้จริงคือ </w:t>
       </w:r>
@@ -3041,6 +3168,7 @@
           <w:sz w:val="32"/>
           <w:szCs w:val="32"/>
           <w:bCs w:val="0"/>
+          <w:iCs w:val="0"/>
           <w:highlight w:val="yellow"/>
         </w:rPr>
         <w:t>[30]</w:t>
@@ -3053,6 +3181,7 @@
           <w:sz w:val="32"/>
           <w:szCs w:val="32"/>
           <w:bCs w:val="0"/>
+          <w:iCs w:val="0"/>
         </w:rPr>
         <w:t xml:space="preserve"> วินาที (ค่า IMAGE_WAIT_SECONDS ในการตั้งค่าเซิร์ฟเวอร์ ค่าออกแบบในตารางที่ 3.6 คือ 30 วินาที)</w:t>
       </w:r>
@@ -3071,6 +3200,7 @@
           <w:sz w:val="32"/>
           <w:szCs w:val="32"/>
           <w:bCs w:val="0"/>
+          <w:iCs w:val="0"/>
         </w:rPr>
         <w:t>การวัดระยะเวลาในแต่ละการทดสอบใช้ข้อมูลจากระบบจริง ดังนี้ (1) เวลาตอบสนองการยืนยันรหัส วัดจากบันทึก Serial Monitor ของบอร์ด ESP32 ซึ่งแสดงเวลาเป็นมิลลิวินาที นับจากอ่านรหัสได้จนสั่งปลดล็อก (2) เวลารอภาพ วัดจากประวัติเหตุการณ์ (Access Log) บนแดชบอร์ดของเซิร์ฟเวอร์ โดยคำนวณผลต่างระหว่างเวลาของเหตุการณ์ locked และ image_capture และ (3) เวลาตั้งแต่เปิดค้างถึงแจ้งเตือน คำนวณจากผลต่างระหว่างเวลาของเหตุการณ์ door_open และ door_ajar ทั้งนี้ Access Log แสดงเวลาถึงระดับวินาที จึงมีความคลาดเคลื่อนไม่เกิน ±1 วินาที</w:t>
       </w:r>
@@ -3090,6 +3220,7 @@
           <w:sz w:val="32"/>
           <w:szCs w:val="32"/>
           <w:bCs w:val="1"/>
+          <w:iCs w:val="0"/>
         </w:rPr>
         <w:t>4.5 ผลการทดสอบความถูกต้องในการยืนยันตัวตนและการปลดล็อก</w:t>
       </w:r>
@@ -3108,6 +3239,7 @@
           <w:sz w:val="32"/>
           <w:szCs w:val="32"/>
           <w:bCs w:val="0"/>
+          <w:iCs w:val="0"/>
         </w:rPr>
         <w:t xml:space="preserve">การทดสอบนี้ประเมินความแม่นยำในการจำแนกสิทธิ์การเข้าถึงของโมดูล GM66 และเซิร์ฟเวอร์ รวมถึงการสั่งกลอนแม่เหล็กไฟฟ้า ทดสอบ 15 ครั้ง ประกอบด้วยรหัสที่ได้รับอนุญาต 10 ครั้ง และรหัสที่ไม่ได้รับอนุญาต 5 ครั้ง ได้แก่ รหัสหมดอายุ (expired) 1 ครั้ง รหัสที่ใช้แล้ว (already_used) 2 ครั้ง และรหัสที่ไม่มีในระบบ (invalid_code) 2 ครั้ง ตามสถานะในตารางที่ 3.7 </w:t>
       </w:r>
@@ -3119,6 +3251,7 @@
           <w:sz w:val="32"/>
           <w:szCs w:val="32"/>
           <w:bCs w:val="0"/>
+          <w:iCs w:val="0"/>
           <w:highlight w:val="yellow"/>
         </w:rPr>
         <w:t>[วิธีทดสอบรหัสหมดอายุ เช่น ตั้งอายุรหัสสั้นลงชั่วคราว]</w:t>
@@ -3131,6 +3264,7 @@
           <w:sz w:val="32"/>
           <w:szCs w:val="32"/>
           <w:bCs w:val="0"/>
+          <w:iCs w:val="0"/>
         </w:rPr>
         <w:t xml:space="preserve"> กรณีรหัสได้รับอนุญาต กลอนต้องปลดล็อก 10 วินาทีพร้อมเสียงบัซเซอร์ 1 ครั้ง ส่วนกรณีไม่ได้รับอนุญาต กลอนต้องไม่ปลดล็อก บัซเซอร์ส่งเสียง 2 ครั้ง เซิร์ฟเวอร์บันทึกเหตุการณ์ qr_scan ผล denied พร้อมเหตุผลลงใน Access Log และแจ้งเตือนความพยายามเข้าถึงที่ถูกปฏิเสธผ่าน LINE บันทึกผลและระยะเวลาตอบสนองนับตั้งแต่อ่านรหัสจนกลอนทำงาน ดังภาพประกอบที่ 4.3 และตารางที่ 4.4</w:t>
       </w:r>
@@ -3150,6 +3284,7 @@
           <w:sz w:val="32"/>
           <w:szCs w:val="32"/>
           <w:bCs w:val="0"/>
+          <w:iCs w:val="0"/>
           <w:highlight w:val="yellow"/>
         </w:rPr>
         <w:t>[แทรกภาพการสแกนรหัสคิวอาร์ที่ GM66]</w:t>
@@ -3169,6 +3304,7 @@
           <w:sz w:val="32"/>
           <w:szCs w:val="32"/>
           <w:bCs w:val="0"/>
+          <w:iCs w:val="0"/>
         </w:rPr>
         <w:t>ภาพประกอบที่ 4.3 การทดสอบสแกนรหัสคิวอาร์ผ่านโมดูล GM66</w:t>
       </w:r>
@@ -3189,6 +3325,7 @@
           <w:sz w:val="32"/>
           <w:szCs w:val="32"/>
           <w:bCs w:val="0"/>
+          <w:iCs w:val="0"/>
         </w:rPr>
         <w:t>ตารางที่ 4.4 ผลการทดสอบความถูกต้องในการอ่านรหัสและการตอบสนองของระบบล็อก</w:t>
       </w:r>
@@ -3232,6 +3369,7 @@
                 <w:sz w:val="28"/>
                 <w:szCs w:val="28"/>
                 <w:bCs w:val="1"/>
+                <w:iCs w:val="0"/>
               </w:rPr>
               <w:t>ครั้งที่ทดสอบ</w:t>
             </w:r>
@@ -3256,6 +3394,7 @@
                 <w:sz w:val="28"/>
                 <w:szCs w:val="28"/>
                 <w:bCs w:val="1"/>
+                <w:iCs w:val="0"/>
               </w:rPr>
               <w:t>ประเภทรหัส</w:t>
             </w:r>
@@ -3280,6 +3419,7 @@
                 <w:sz w:val="28"/>
                 <w:szCs w:val="28"/>
                 <w:bCs w:val="1"/>
+                <w:iCs w:val="0"/>
               </w:rPr>
               <w:t>การอ่านรหัสสำเร็จ</w:t>
             </w:r>
@@ -3304,6 +3444,7 @@
                 <w:sz w:val="28"/>
                 <w:szCs w:val="28"/>
                 <w:bCs w:val="1"/>
+                <w:iCs w:val="0"/>
               </w:rPr>
               <w:t>การตอบสนองของกลอนถูกต้อง</w:t>
             </w:r>
@@ -3328,6 +3469,7 @@
                 <w:sz w:val="28"/>
                 <w:szCs w:val="28"/>
                 <w:bCs w:val="1"/>
+                <w:iCs w:val="0"/>
               </w:rPr>
               <w:t>ระยะเวลาตอบสนอง (วินาที)</w:t>
             </w:r>
@@ -3356,6 +3498,7 @@
                 <w:sz w:val="28"/>
                 <w:szCs w:val="28"/>
                 <w:bCs w:val="0"/>
+                <w:iCs w:val="0"/>
               </w:rPr>
               <w:t>1</w:t>
             </w:r>
@@ -3379,6 +3522,7 @@
                 <w:sz w:val="28"/>
                 <w:szCs w:val="28"/>
                 <w:bCs w:val="0"/>
+                <w:iCs w:val="0"/>
               </w:rPr>
               <w:t>ได้รับอนุญาต</w:t>
             </w:r>
@@ -3443,6 +3587,7 @@
                 <w:sz w:val="28"/>
                 <w:szCs w:val="28"/>
                 <w:bCs w:val="0"/>
+                <w:iCs w:val="0"/>
               </w:rPr>
               <w:t>2</w:t>
             </w:r>
@@ -3466,6 +3611,7 @@
                 <w:sz w:val="28"/>
                 <w:szCs w:val="28"/>
                 <w:bCs w:val="0"/>
+                <w:iCs w:val="0"/>
               </w:rPr>
               <w:t>ได้รับอนุญาต</w:t>
             </w:r>
@@ -3530,6 +3676,7 @@
                 <w:sz w:val="28"/>
                 <w:szCs w:val="28"/>
                 <w:bCs w:val="0"/>
+                <w:iCs w:val="0"/>
               </w:rPr>
               <w:t>3</w:t>
             </w:r>
@@ -3553,6 +3700,7 @@
                 <w:sz w:val="28"/>
                 <w:szCs w:val="28"/>
                 <w:bCs w:val="0"/>
+                <w:iCs w:val="0"/>
               </w:rPr>
               <w:t>ได้รับอนุญาต</w:t>
             </w:r>
@@ -3617,6 +3765,7 @@
                 <w:sz w:val="28"/>
                 <w:szCs w:val="28"/>
                 <w:bCs w:val="0"/>
+                <w:iCs w:val="0"/>
               </w:rPr>
               <w:t>4</w:t>
             </w:r>
@@ -3639,6 +3788,7 @@
                 <w:sz w:val="28"/>
                 <w:szCs w:val="28"/>
                 <w:bCs w:val="0"/>
+                <w:iCs w:val="0"/>
               </w:rPr>
               <w:t>ไม่อนุญาต (expired)</w:t>
             </w:r>
@@ -3703,6 +3853,7 @@
                 <w:sz w:val="28"/>
                 <w:szCs w:val="28"/>
                 <w:bCs w:val="0"/>
+                <w:iCs w:val="0"/>
               </w:rPr>
               <w:t>5</w:t>
             </w:r>
@@ -3726,6 +3877,7 @@
                 <w:sz w:val="28"/>
                 <w:szCs w:val="28"/>
                 <w:bCs w:val="0"/>
+                <w:iCs w:val="0"/>
               </w:rPr>
               <w:t>ได้รับอนุญาต</w:t>
             </w:r>
@@ -3790,6 +3942,7 @@
                 <w:sz w:val="28"/>
                 <w:szCs w:val="28"/>
                 <w:bCs w:val="0"/>
+                <w:iCs w:val="0"/>
               </w:rPr>
               <w:t>6</w:t>
             </w:r>
@@ -3813,6 +3966,7 @@
                 <w:sz w:val="28"/>
                 <w:szCs w:val="28"/>
                 <w:bCs w:val="0"/>
+                <w:iCs w:val="0"/>
               </w:rPr>
               <w:t>ได้รับอนุญาต</w:t>
             </w:r>
@@ -3877,6 +4031,7 @@
                 <w:sz w:val="28"/>
                 <w:szCs w:val="28"/>
                 <w:bCs w:val="0"/>
+                <w:iCs w:val="0"/>
               </w:rPr>
               <w:t>7</w:t>
             </w:r>
@@ -3899,6 +4054,7 @@
                 <w:sz w:val="28"/>
                 <w:szCs w:val="28"/>
                 <w:bCs w:val="0"/>
+                <w:iCs w:val="0"/>
               </w:rPr>
               <w:t>ไม่อนุญาต (already_used)</w:t>
             </w:r>
@@ -3963,6 +4119,7 @@
                 <w:sz w:val="28"/>
                 <w:szCs w:val="28"/>
                 <w:bCs w:val="0"/>
+                <w:iCs w:val="0"/>
               </w:rPr>
               <w:t>8</w:t>
             </w:r>
@@ -3986,6 +4143,7 @@
                 <w:sz w:val="28"/>
                 <w:szCs w:val="28"/>
                 <w:bCs w:val="0"/>
+                <w:iCs w:val="0"/>
               </w:rPr>
               <w:t>ได้รับอนุญาต</w:t>
             </w:r>
@@ -4050,6 +4208,7 @@
                 <w:sz w:val="28"/>
                 <w:szCs w:val="28"/>
                 <w:bCs w:val="0"/>
+                <w:iCs w:val="0"/>
               </w:rPr>
               <w:t>9</w:t>
             </w:r>
@@ -4073,6 +4232,7 @@
                 <w:sz w:val="28"/>
                 <w:szCs w:val="28"/>
                 <w:bCs w:val="0"/>
+                <w:iCs w:val="0"/>
               </w:rPr>
               <w:t>ได้รับอนุญาต</w:t>
             </w:r>
@@ -4137,6 +4297,7 @@
                 <w:sz w:val="28"/>
                 <w:szCs w:val="28"/>
                 <w:bCs w:val="0"/>
+                <w:iCs w:val="0"/>
               </w:rPr>
               <w:t>10</w:t>
             </w:r>
@@ -4159,6 +4320,7 @@
                 <w:sz w:val="28"/>
                 <w:szCs w:val="28"/>
                 <w:bCs w:val="0"/>
+                <w:iCs w:val="0"/>
               </w:rPr>
               <w:t>ไม่อนุญาต (invalid_code)</w:t>
             </w:r>
@@ -4223,6 +4385,7 @@
                 <w:sz w:val="28"/>
                 <w:szCs w:val="28"/>
                 <w:bCs w:val="0"/>
+                <w:iCs w:val="0"/>
               </w:rPr>
               <w:t>11</w:t>
             </w:r>
@@ -4246,6 +4409,7 @@
                 <w:sz w:val="28"/>
                 <w:szCs w:val="28"/>
                 <w:bCs w:val="0"/>
+                <w:iCs w:val="0"/>
               </w:rPr>
               <w:t>ได้รับอนุญาต</w:t>
             </w:r>
@@ -4310,6 +4474,7 @@
                 <w:sz w:val="28"/>
                 <w:szCs w:val="28"/>
                 <w:bCs w:val="0"/>
+                <w:iCs w:val="0"/>
               </w:rPr>
               <w:t>12</w:t>
             </w:r>
@@ -4333,6 +4498,7 @@
                 <w:sz w:val="28"/>
                 <w:szCs w:val="28"/>
                 <w:bCs w:val="0"/>
+                <w:iCs w:val="0"/>
               </w:rPr>
               <w:t>ได้รับอนุญาต</w:t>
             </w:r>
@@ -4397,6 +4563,7 @@
                 <w:sz w:val="28"/>
                 <w:szCs w:val="28"/>
                 <w:bCs w:val="0"/>
+                <w:iCs w:val="0"/>
               </w:rPr>
               <w:t>13</w:t>
             </w:r>
@@ -4419,6 +4586,7 @@
                 <w:sz w:val="28"/>
                 <w:szCs w:val="28"/>
                 <w:bCs w:val="0"/>
+                <w:iCs w:val="0"/>
               </w:rPr>
               <w:t>ไม่อนุญาต (already_used)</w:t>
             </w:r>
@@ -4483,6 +4651,7 @@
                 <w:sz w:val="28"/>
                 <w:szCs w:val="28"/>
                 <w:bCs w:val="0"/>
+                <w:iCs w:val="0"/>
               </w:rPr>
               <w:t>14</w:t>
             </w:r>
@@ -4505,6 +4674,7 @@
                 <w:sz w:val="28"/>
                 <w:szCs w:val="28"/>
                 <w:bCs w:val="0"/>
+                <w:iCs w:val="0"/>
               </w:rPr>
               <w:t>ไม่อนุญาต (invalid_code)</w:t>
             </w:r>
@@ -4568,6 +4738,7 @@
                 <w:sz w:val="28"/>
                 <w:szCs w:val="28"/>
                 <w:bCs w:val="0"/>
+                <w:iCs w:val="0"/>
               </w:rPr>
               <w:t>15</w:t>
             </w:r>
@@ -4590,6 +4761,7 @@
                 <w:sz w:val="28"/>
                 <w:szCs w:val="28"/>
                 <w:bCs w:val="0"/>
+                <w:iCs w:val="0"/>
               </w:rPr>
               <w:t>ได้รับอนุญาต</w:t>
             </w:r>
@@ -4644,6 +4816,7 @@
           <w:sz w:val="28"/>
           <w:szCs w:val="28"/>
           <w:bCs w:val="0"/>
+          <w:iCs w:val="0"/>
         </w:rPr>
         <w:t>√ = สำเร็จ/ถูกต้อง    × = ไม่สำเร็จ/ผิดพลาด</w:t>
       </w:r>
@@ -4662,6 +4835,7 @@
           <w:sz w:val="28"/>
           <w:szCs w:val="28"/>
           <w:bCs w:val="0"/>
+          <w:iCs w:val="0"/>
         </w:rPr>
         <w:t>กรณีรหัสไม่ได้รับอนุญาต การตอบสนองของกลอนถูกต้อง หมายถึง กลอนไม่ปลดล็อกและบัซเซอร์ส่งเสียง 2 ครั้ง (ถ้าเซิร์ฟเวอร์ไม่ตอบภายใน 3 วินาที บัซเซอร์จะส่งเสียง 3 ครั้งและถือว่าปฏิเสธ)</w:t>
       </w:r>
@@ -4680,6 +4854,7 @@
           <w:sz w:val="28"/>
           <w:szCs w:val="28"/>
           <w:bCs w:val="0"/>
+          <w:iCs w:val="0"/>
         </w:rPr>
         <w:t>ระยะเวลาตอบสนองอ่านจาก Serial Monitor ของ ESP32 นับตั้งแต่อ่านรหัสจนถึงกลอนทำงาน (กรณีไม่อนุญาต นับจนระบบแสดงผลปฏิเสธ)</w:t>
       </w:r>
@@ -4705,6 +4880,7 @@
           <w:sz w:val="32"/>
           <w:szCs w:val="32"/>
           <w:bCs w:val="0"/>
+          <w:iCs w:val="0"/>
         </w:rPr>
         <w:t>ตารางที่ 4.5 สรุปผลการทดสอบความถูกต้องในการยืนยันตัวตนและการปลดล็อก</w:t>
       </w:r>
@@ -4749,6 +4925,7 @@
                 <w:sz w:val="28"/>
                 <w:szCs w:val="28"/>
                 <w:bCs w:val="1"/>
+                <w:iCs w:val="0"/>
               </w:rPr>
               <w:t>กลุ่มรหัส</w:t>
             </w:r>
@@ -4773,6 +4950,7 @@
                 <w:sz w:val="28"/>
                 <w:szCs w:val="28"/>
                 <w:bCs w:val="1"/>
+                <w:iCs w:val="0"/>
               </w:rPr>
               <w:t>จำนวนที่ทดสอบ</w:t>
             </w:r>
@@ -4797,6 +4975,7 @@
                 <w:sz w:val="28"/>
                 <w:szCs w:val="28"/>
                 <w:bCs w:val="1"/>
+                <w:iCs w:val="0"/>
               </w:rPr>
               <w:t>ตอบสนองถูกต้อง</w:t>
             </w:r>
@@ -4821,6 +5000,7 @@
                 <w:sz w:val="28"/>
                 <w:szCs w:val="28"/>
                 <w:bCs w:val="1"/>
+                <w:iCs w:val="0"/>
               </w:rPr>
               <w:t>ร้อยละ</w:t>
             </w:r>
@@ -4845,6 +5025,7 @@
                 <w:sz w:val="28"/>
                 <w:szCs w:val="28"/>
                 <w:bCs w:val="1"/>
+                <w:iCs w:val="0"/>
               </w:rPr>
               <w:t>เวลาเฉลี่ย (s)</w:t>
             </w:r>
@@ -4869,6 +5050,7 @@
                 <w:sz w:val="28"/>
                 <w:szCs w:val="28"/>
                 <w:bCs w:val="1"/>
+                <w:iCs w:val="0"/>
               </w:rPr>
               <w:t>เวลาสูงสุด (s)</w:t>
             </w:r>
@@ -4897,6 +5079,7 @@
                 <w:sz w:val="28"/>
                 <w:szCs w:val="28"/>
                 <w:bCs w:val="0"/>
+                <w:iCs w:val="0"/>
               </w:rPr>
               <w:t>รหัสที่ได้รับอนุญาต</w:t>
             </w:r>
@@ -4920,6 +5103,7 @@
                 <w:sz w:val="28"/>
                 <w:szCs w:val="28"/>
                 <w:bCs w:val="0"/>
+                <w:iCs w:val="0"/>
               </w:rPr>
               <w:t>10</w:t>
             </w:r>
@@ -4996,6 +5180,7 @@
                 <w:sz w:val="28"/>
                 <w:szCs w:val="28"/>
                 <w:bCs w:val="0"/>
+                <w:iCs w:val="0"/>
               </w:rPr>
               <w:t>รหัสที่ไม่ได้รับอนุญาต</w:t>
             </w:r>
@@ -5019,6 +5204,7 @@
                 <w:sz w:val="28"/>
                 <w:szCs w:val="28"/>
                 <w:bCs w:val="0"/>
+                <w:iCs w:val="0"/>
               </w:rPr>
               <w:t>5</w:t>
             </w:r>
@@ -5095,6 +5281,7 @@
                 <w:sz w:val="28"/>
                 <w:szCs w:val="28"/>
                 <w:bCs w:val="1"/>
+                <w:iCs w:val="0"/>
               </w:rPr>
               <w:t>รวม</w:t>
             </w:r>
@@ -5118,6 +5305,7 @@
                 <w:sz w:val="28"/>
                 <w:szCs w:val="28"/>
                 <w:bCs w:val="1"/>
+                <w:iCs w:val="0"/>
               </w:rPr>
               <w:t>15</w:t>
             </w:r>
@@ -5192,6 +5380,7 @@
           <w:sz w:val="32"/>
           <w:szCs w:val="32"/>
           <w:bCs w:val="0"/>
+          <w:iCs w:val="0"/>
         </w:rPr>
         <w:t xml:space="preserve">จากตารางที่ 4.4 และ 4.5 พบว่า GM66 อ่านรหัสได้สำเร็จ </w:t>
       </w:r>
@@ -5203,6 +5392,7 @@
           <w:sz w:val="32"/>
           <w:szCs w:val="32"/>
           <w:bCs w:val="0"/>
+          <w:iCs w:val="0"/>
           <w:highlight w:val="yellow"/>
         </w:rPr>
         <w:t>[ ]</w:t>
@@ -5215,6 +5405,7 @@
           <w:sz w:val="32"/>
           <w:szCs w:val="32"/>
           <w:bCs w:val="0"/>
+          <w:iCs w:val="0"/>
         </w:rPr>
         <w:t xml:space="preserve"> ครั้งจาก 15 ครั้ง และกลอนตอบสนองถูกต้อง </w:t>
       </w:r>
@@ -5226,6 +5417,7 @@
           <w:sz w:val="32"/>
           <w:szCs w:val="32"/>
           <w:bCs w:val="0"/>
+          <w:iCs w:val="0"/>
           <w:highlight w:val="yellow"/>
         </w:rPr>
         <w:t>[ ]</w:t>
@@ -5238,6 +5430,7 @@
           <w:sz w:val="32"/>
           <w:szCs w:val="32"/>
           <w:bCs w:val="0"/>
+          <w:iCs w:val="0"/>
         </w:rPr>
         <w:t xml:space="preserve"> ครั้ง คิดเป็นร้อยละ </w:t>
       </w:r>
@@ -5249,6 +5442,7 @@
           <w:sz w:val="32"/>
           <w:szCs w:val="32"/>
           <w:bCs w:val="0"/>
+          <w:iCs w:val="0"/>
           <w:highlight w:val="yellow"/>
         </w:rPr>
         <w:t>[ ]</w:t>
@@ -5261,6 +5455,7 @@
           <w:sz w:val="32"/>
           <w:szCs w:val="32"/>
           <w:bCs w:val="0"/>
+          <w:iCs w:val="0"/>
         </w:rPr>
         <w:t xml:space="preserve"> โดยรหัสที่ได้รับอนุญาตปลดล็อกถูกต้อง </w:t>
       </w:r>
@@ -5272,6 +5467,7 @@
           <w:sz w:val="32"/>
           <w:szCs w:val="32"/>
           <w:bCs w:val="0"/>
+          <w:iCs w:val="0"/>
           <w:highlight w:val="yellow"/>
         </w:rPr>
         <w:t>[ ]</w:t>
@@ -5284,6 +5480,7 @@
           <w:sz w:val="32"/>
           <w:szCs w:val="32"/>
           <w:bCs w:val="0"/>
+          <w:iCs w:val="0"/>
         </w:rPr>
         <w:t xml:space="preserve"> ครั้งจาก 10 ครั้ง ส่วนรหัสที่ไม่ได้รับอนุญาตถูกปฏิเสธถูกต้อง </w:t>
       </w:r>
@@ -5295,6 +5492,7 @@
           <w:sz w:val="32"/>
           <w:szCs w:val="32"/>
           <w:bCs w:val="0"/>
+          <w:iCs w:val="0"/>
           <w:highlight w:val="yellow"/>
         </w:rPr>
         <w:t>[ ]</w:t>
@@ -5307,6 +5505,7 @@
           <w:sz w:val="32"/>
           <w:szCs w:val="32"/>
           <w:bCs w:val="0"/>
+          <w:iCs w:val="0"/>
         </w:rPr>
         <w:t xml:space="preserve"> ครั้งจาก 5 ครั้ง ระยะเวลาตอบสนองเฉลี่ย </w:t>
       </w:r>
@@ -5318,6 +5517,7 @@
           <w:sz w:val="32"/>
           <w:szCs w:val="32"/>
           <w:bCs w:val="0"/>
+          <w:iCs w:val="0"/>
           <w:highlight w:val="yellow"/>
         </w:rPr>
         <w:t>[ ]</w:t>
@@ -5330,6 +5530,7 @@
           <w:sz w:val="32"/>
           <w:szCs w:val="32"/>
           <w:bCs w:val="0"/>
+          <w:iCs w:val="0"/>
         </w:rPr>
         <w:t xml:space="preserve"> วินาที สูงสุด </w:t>
       </w:r>
@@ -5341,6 +5542,7 @@
           <w:sz w:val="32"/>
           <w:szCs w:val="32"/>
           <w:bCs w:val="0"/>
+          <w:iCs w:val="0"/>
           <w:highlight w:val="yellow"/>
         </w:rPr>
         <w:t>[ ]</w:t>
@@ -5353,6 +5555,7 @@
           <w:sz w:val="32"/>
           <w:szCs w:val="32"/>
           <w:bCs w:val="0"/>
+          <w:iCs w:val="0"/>
         </w:rPr>
         <w:t xml:space="preserve"> วินาที ซึ่ง </w:t>
       </w:r>
@@ -5364,6 +5567,7 @@
           <w:sz w:val="32"/>
           <w:szCs w:val="32"/>
           <w:bCs w:val="0"/>
+          <w:iCs w:val="0"/>
           <w:highlight w:val="yellow"/>
         </w:rPr>
         <w:t>[อยู่ภายใน/เกิน]</w:t>
@@ -5376,6 +5580,7 @@
           <w:sz w:val="32"/>
           <w:szCs w:val="32"/>
           <w:bCs w:val="0"/>
+          <w:iCs w:val="0"/>
         </w:rPr>
         <w:t xml:space="preserve"> เกณฑ์ 3 วินาทีในตารางที่ 3.6 </w:t>
       </w:r>
@@ -5387,6 +5592,7 @@
           <w:sz w:val="32"/>
           <w:szCs w:val="32"/>
           <w:bCs w:val="0"/>
+          <w:iCs w:val="0"/>
           <w:highlight w:val="yellow"/>
         </w:rPr>
         <w:t>[ถ้ามีครั้งที่ผิดพลาด ให้ระบุครั้งที่ สาเหตุ และผลที่ตามมา ซึ่งตามการออกแบบ หากเซิร์ฟเวอร์ไม่ตอบภายใน 3 วินาทีจะถือว่าปฏิเสธและกลอนไม่ปลด]</w:t>
@@ -5407,6 +5613,7 @@
           <w:sz w:val="32"/>
           <w:szCs w:val="32"/>
           <w:bCs w:val="1"/>
+          <w:iCs w:val="0"/>
         </w:rPr>
         <w:t>4.6 ผลการทดสอบประสิทธิภาพการบันทึกภาพหลักฐาน</w:t>
       </w:r>
@@ -5425,6 +5632,7 @@
           <w:sz w:val="32"/>
           <w:szCs w:val="32"/>
           <w:bCs w:val="0"/>
+          <w:iCs w:val="0"/>
         </w:rPr>
         <w:t>การทดสอบนี้ตรวจสอบการเปลี่ยนสถานะจาก Door Open เป็น Locked ซึ่งเป็นตัวกระตุ้นให้บอร์ด ESP32 ส่งพัลส์ 200 ms ไปยัง ESP32-CAM ตามภาพประกอบที่ 3.9 จากนั้น ESP32-CAM สอบถามเซิร์ฟเวอร์ว่ามีเหตุการณ์ใดรอภาพอยู่ ถ่ายภาพ (เปิดไฟแฟลช) และส่งไปยังเซิร์ฟเวอร์ ซึ่งแจ้งเตือนการส่งมอบพัสดุพร้อมภาพผ่าน LINE หากไม่ได้รับภาพภายในเวลาที่กำหนดจะส่งข้อความแจ้งเตือนแบบไม่มีรูปภาพ ทดสอบ 15 ครั้ง โดยปลดล็อกด้วยรหัสคิวอาร์ เปิดประตู วางพัสดุ แล้วปิดประตูด้วยมือจนสนิททุกครั้ง ผลแสดงดังตารางที่ 4.6 และตัวอย่างข้อความแจ้งเตือนพร้อมภาพหลักฐานที่ได้รับผ่าน LINE แสดงดังภาพประกอบที่ 4.4</w:t>
       </w:r>
@@ -5445,6 +5653,7 @@
           <w:sz w:val="32"/>
           <w:szCs w:val="32"/>
           <w:bCs w:val="0"/>
+          <w:iCs w:val="0"/>
         </w:rPr>
         <w:t>ตารางที่ 4.6 ผลการตรวจสอบสถานะการล็อกและการทำงานของระบบบันทึกภาพหลักฐาน</w:t>
       </w:r>
@@ -5487,6 +5696,7 @@
                 <w:sz w:val="28"/>
                 <w:szCs w:val="28"/>
                 <w:bCs w:val="1"/>
+                <w:iCs w:val="0"/>
               </w:rPr>
               <w:t>ครั้งที่ทดสอบ</w:t>
             </w:r>
@@ -5511,6 +5721,7 @@
                 <w:sz w:val="28"/>
                 <w:szCs w:val="28"/>
                 <w:bCs w:val="1"/>
+                <w:iCs w:val="0"/>
               </w:rPr>
               <w:t>กลอนแม่เหล็กสั่งล็อกสำเร็จ</w:t>
             </w:r>
@@ -5535,6 +5746,7 @@
                 <w:sz w:val="28"/>
                 <w:szCs w:val="28"/>
                 <w:bCs w:val="1"/>
+                <w:iCs w:val="0"/>
               </w:rPr>
               <w:t>การบันทึกและส่งภาพสำเร็จ</w:t>
             </w:r>
@@ -5559,6 +5771,7 @@
                 <w:sz w:val="28"/>
                 <w:szCs w:val="28"/>
                 <w:bCs w:val="1"/>
+                <w:iCs w:val="0"/>
               </w:rPr>
               <w:t>เวลารอภาพ (วินาที)</w:t>
             </w:r>
@@ -5587,6 +5800,7 @@
                 <w:sz w:val="28"/>
                 <w:szCs w:val="28"/>
                 <w:bCs w:val="0"/>
+                <w:iCs w:val="0"/>
               </w:rPr>
               <w:t>1</w:t>
             </w:r>
@@ -5651,6 +5865,7 @@
                 <w:sz w:val="28"/>
                 <w:szCs w:val="28"/>
                 <w:bCs w:val="0"/>
+                <w:iCs w:val="0"/>
               </w:rPr>
               <w:t>2</w:t>
             </w:r>
@@ -5715,6 +5930,7 @@
                 <w:sz w:val="28"/>
                 <w:szCs w:val="28"/>
                 <w:bCs w:val="0"/>
+                <w:iCs w:val="0"/>
               </w:rPr>
               <w:t>3</w:t>
             </w:r>
@@ -5779,6 +5995,7 @@
                 <w:sz w:val="28"/>
                 <w:szCs w:val="28"/>
                 <w:bCs w:val="0"/>
+                <w:iCs w:val="0"/>
               </w:rPr>
               <w:t>4</w:t>
             </w:r>
@@ -5843,6 +6060,7 @@
                 <w:sz w:val="28"/>
                 <w:szCs w:val="28"/>
                 <w:bCs w:val="0"/>
+                <w:iCs w:val="0"/>
               </w:rPr>
               <w:t>5</w:t>
             </w:r>
@@ -5907,6 +6125,7 @@
                 <w:sz w:val="28"/>
                 <w:szCs w:val="28"/>
                 <w:bCs w:val="0"/>
+                <w:iCs w:val="0"/>
               </w:rPr>
               <w:t>6</w:t>
             </w:r>
@@ -5971,6 +6190,7 @@
                 <w:sz w:val="28"/>
                 <w:szCs w:val="28"/>
                 <w:bCs w:val="0"/>
+                <w:iCs w:val="0"/>
               </w:rPr>
               <w:t>7</w:t>
             </w:r>
@@ -6035,6 +6255,7 @@
                 <w:sz w:val="28"/>
                 <w:szCs w:val="28"/>
                 <w:bCs w:val="0"/>
+                <w:iCs w:val="0"/>
               </w:rPr>
               <w:t>8</w:t>
             </w:r>
@@ -6099,6 +6320,7 @@
                 <w:sz w:val="28"/>
                 <w:szCs w:val="28"/>
                 <w:bCs w:val="0"/>
+                <w:iCs w:val="0"/>
               </w:rPr>
               <w:t>9</w:t>
             </w:r>
@@ -6163,6 +6385,7 @@
                 <w:sz w:val="28"/>
                 <w:szCs w:val="28"/>
                 <w:bCs w:val="0"/>
+                <w:iCs w:val="0"/>
               </w:rPr>
               <w:t>10</w:t>
             </w:r>
@@ -6227,6 +6450,7 @@
                 <w:sz w:val="28"/>
                 <w:szCs w:val="28"/>
                 <w:bCs w:val="0"/>
+                <w:iCs w:val="0"/>
               </w:rPr>
               <w:t>11</w:t>
             </w:r>
@@ -6291,6 +6515,7 @@
                 <w:sz w:val="28"/>
                 <w:szCs w:val="28"/>
                 <w:bCs w:val="0"/>
+                <w:iCs w:val="0"/>
               </w:rPr>
               <w:t>12</w:t>
             </w:r>
@@ -6355,6 +6580,7 @@
                 <w:sz w:val="28"/>
                 <w:szCs w:val="28"/>
                 <w:bCs w:val="0"/>
+                <w:iCs w:val="0"/>
               </w:rPr>
               <w:t>13</w:t>
             </w:r>
@@ -6419,6 +6645,7 @@
                 <w:sz w:val="28"/>
                 <w:szCs w:val="28"/>
                 <w:bCs w:val="0"/>
+                <w:iCs w:val="0"/>
               </w:rPr>
               <w:t>14</w:t>
             </w:r>
@@ -6482,6 +6709,7 @@
                 <w:sz w:val="28"/>
                 <w:szCs w:val="28"/>
                 <w:bCs w:val="0"/>
+                <w:iCs w:val="0"/>
               </w:rPr>
               <w:t>15</w:t>
             </w:r>
@@ -6536,6 +6764,7 @@
           <w:sz w:val="28"/>
           <w:szCs w:val="28"/>
           <w:bCs w:val="0"/>
+          <w:iCs w:val="0"/>
         </w:rPr>
         <w:t>√ = บันทึกและส่งภาพสำเร็จ    × = ไม่สำเร็จ/ไม่ได้รับภาพ</w:t>
       </w:r>
@@ -6554,6 +6783,7 @@
           <w:sz w:val="28"/>
           <w:szCs w:val="28"/>
           <w:bCs w:val="0"/>
+          <w:iCs w:val="0"/>
         </w:rPr>
         <w:t>เวลารอภาพ = เวลาเหตุการณ์ image_capture − เวลาเหตุการณ์ locked ใน Access Log</w:t>
       </w:r>
@@ -6578,6 +6808,7 @@
           <w:sz w:val="32"/>
           <w:szCs w:val="32"/>
           <w:bCs w:val="0"/>
+          <w:iCs w:val="0"/>
           <w:highlight w:val="yellow"/>
         </w:rPr>
         <w:t>[แทรกภาพหน้าจอ LINE ที่ได้รับข้อความพร้อมภาพหลักฐาน]</w:t>
@@ -6597,6 +6828,7 @@
           <w:sz w:val="32"/>
           <w:szCs w:val="32"/>
           <w:bCs w:val="0"/>
+          <w:iCs w:val="0"/>
         </w:rPr>
         <w:t>ภาพประกอบที่ 4.4 ตัวอย่างข้อความแจ้งเตือนพร้อมภาพหลักฐานที่ได้รับผ่าน LINE</w:t>
       </w:r>
@@ -6615,6 +6847,7 @@
           <w:sz w:val="32"/>
           <w:szCs w:val="32"/>
           <w:bCs w:val="0"/>
+          <w:iCs w:val="0"/>
         </w:rPr>
         <w:t xml:space="preserve">ตามที่ออกแบบ การปลดล็อกด้วยปุ่มกดต้องไม่สั่งถ่ายภาพ คณะผู้จัดทำจึงทดสอบเพิ่ม </w:t>
       </w:r>
@@ -6626,6 +6859,7 @@
           <w:sz w:val="32"/>
           <w:szCs w:val="32"/>
           <w:bCs w:val="0"/>
+          <w:iCs w:val="0"/>
           <w:highlight w:val="yellow"/>
         </w:rPr>
         <w:t>[5 ครั้ง]</w:t>
@@ -6638,6 +6872,7 @@
           <w:sz w:val="32"/>
           <w:szCs w:val="32"/>
           <w:bCs w:val="0"/>
+          <w:iCs w:val="0"/>
         </w:rPr>
         <w:t xml:space="preserve"> ดังตารางที่ 4.7</w:t>
       </w:r>
@@ -6658,6 +6893,7 @@
           <w:sz w:val="32"/>
           <w:szCs w:val="32"/>
           <w:bCs w:val="0"/>
+          <w:iCs w:val="0"/>
         </w:rPr>
         <w:t>ตารางที่ 4.7 ผลการตรวจสอบการปลดล็อกด้วยปุ่มกดว่าไม่มีการบันทึกภาพ</w:t>
       </w:r>
@@ -6700,6 +6936,7 @@
                 <w:sz w:val="28"/>
                 <w:szCs w:val="28"/>
                 <w:bCs w:val="1"/>
+                <w:iCs w:val="0"/>
               </w:rPr>
               <w:t>ครั้งที่ทดสอบ</w:t>
             </w:r>
@@ -6724,6 +6961,7 @@
                 <w:sz w:val="28"/>
                 <w:szCs w:val="28"/>
                 <w:bCs w:val="1"/>
+                <w:iCs w:val="0"/>
               </w:rPr>
               <w:t>ปลดล็อกด้วยปุ่มสำเร็จ</w:t>
             </w:r>
@@ -6748,6 +6986,7 @@
                 <w:sz w:val="28"/>
                 <w:szCs w:val="28"/>
                 <w:bCs w:val="1"/>
+                <w:iCs w:val="0"/>
               </w:rPr>
               <w:t>ไม่มีการบันทึกภาพ</w:t>
             </w:r>
@@ -6772,6 +7011,7 @@
                 <w:sz w:val="28"/>
                 <w:szCs w:val="28"/>
                 <w:bCs w:val="1"/>
+                <w:iCs w:val="0"/>
               </w:rPr>
               <w:t>มีบันทึกเหตุการณ์ปลดล็อกด้วยมือ</w:t>
             </w:r>
@@ -6800,6 +7040,7 @@
                 <w:sz w:val="28"/>
                 <w:szCs w:val="28"/>
                 <w:bCs w:val="0"/>
+                <w:iCs w:val="0"/>
               </w:rPr>
               <w:t>1</w:t>
             </w:r>
@@ -6864,6 +7105,7 @@
                 <w:sz w:val="28"/>
                 <w:szCs w:val="28"/>
                 <w:bCs w:val="0"/>
+                <w:iCs w:val="0"/>
               </w:rPr>
               <w:t>2</w:t>
             </w:r>
@@ -6928,6 +7170,7 @@
                 <w:sz w:val="28"/>
                 <w:szCs w:val="28"/>
                 <w:bCs w:val="0"/>
+                <w:iCs w:val="0"/>
               </w:rPr>
               <w:t>3</w:t>
             </w:r>
@@ -6992,6 +7235,7 @@
                 <w:sz w:val="28"/>
                 <w:szCs w:val="28"/>
                 <w:bCs w:val="0"/>
+                <w:iCs w:val="0"/>
               </w:rPr>
               <w:t>4</w:t>
             </w:r>
@@ -7055,6 +7299,7 @@
                 <w:sz w:val="28"/>
                 <w:szCs w:val="28"/>
                 <w:bCs w:val="0"/>
+                <w:iCs w:val="0"/>
               </w:rPr>
               <w:t>5</w:t>
             </w:r>
@@ -7109,6 +7354,7 @@
           <w:sz w:val="28"/>
           <w:szCs w:val="28"/>
           <w:bCs w:val="0"/>
+          <w:iCs w:val="0"/>
         </w:rPr>
         <w:t>√ = เป็นไปตามที่ออกแบบ    × = ไม่เป็นไปตามที่ออกแบบ</w:t>
       </w:r>
@@ -7132,6 +7378,7 @@
           <w:sz w:val="32"/>
           <w:szCs w:val="32"/>
           <w:bCs w:val="0"/>
+          <w:iCs w:val="0"/>
         </w:rPr>
         <w:t xml:space="preserve">จากตารางที่ 4.6 พบว่า กลอนสั่งล็อกสำเร็จ </w:t>
       </w:r>
@@ -7143,6 +7390,7 @@
           <w:sz w:val="32"/>
           <w:szCs w:val="32"/>
           <w:bCs w:val="0"/>
+          <w:iCs w:val="0"/>
           <w:highlight w:val="yellow"/>
         </w:rPr>
         <w:t>[ ]</w:t>
@@ -7155,6 +7403,7 @@
           <w:sz w:val="32"/>
           <w:szCs w:val="32"/>
           <w:bCs w:val="0"/>
+          <w:iCs w:val="0"/>
         </w:rPr>
         <w:t xml:space="preserve"> ครั้ง และบันทึกและส่งภาพสำเร็จ </w:t>
       </w:r>
@@ -7166,6 +7415,7 @@
           <w:sz w:val="32"/>
           <w:szCs w:val="32"/>
           <w:bCs w:val="0"/>
+          <w:iCs w:val="0"/>
           <w:highlight w:val="yellow"/>
         </w:rPr>
         <w:t>[ ]</w:t>
@@ -7178,6 +7428,7 @@
           <w:sz w:val="32"/>
           <w:szCs w:val="32"/>
           <w:bCs w:val="0"/>
+          <w:iCs w:val="0"/>
         </w:rPr>
         <w:t xml:space="preserve"> ครั้งจาก 15 ครั้ง คิดเป็นร้อยละ </w:t>
       </w:r>
@@ -7189,6 +7440,7 @@
           <w:sz w:val="32"/>
           <w:szCs w:val="32"/>
           <w:bCs w:val="0"/>
+          <w:iCs w:val="0"/>
           <w:highlight w:val="yellow"/>
         </w:rPr>
         <w:t>[ ]</w:t>
@@ -7201,6 +7453,7 @@
           <w:sz w:val="32"/>
           <w:szCs w:val="32"/>
           <w:bCs w:val="0"/>
+          <w:iCs w:val="0"/>
         </w:rPr>
         <w:t xml:space="preserve"> เวลารอภาพเฉลี่ย </w:t>
       </w:r>
@@ -7212,6 +7465,7 @@
           <w:sz w:val="32"/>
           <w:szCs w:val="32"/>
           <w:bCs w:val="0"/>
+          <w:iCs w:val="0"/>
           <w:highlight w:val="yellow"/>
         </w:rPr>
         <w:t>[ ]</w:t>
@@ -7224,6 +7478,7 @@
           <w:sz w:val="32"/>
           <w:szCs w:val="32"/>
           <w:bCs w:val="0"/>
+          <w:iCs w:val="0"/>
         </w:rPr>
         <w:t xml:space="preserve"> วินาที </w:t>
       </w:r>
@@ -7235,6 +7490,7 @@
           <w:sz w:val="32"/>
           <w:szCs w:val="32"/>
           <w:bCs w:val="0"/>
+          <w:iCs w:val="0"/>
           <w:highlight w:val="yellow"/>
         </w:rPr>
         <w:t>[ภายใน/เกิน]</w:t>
@@ -7247,6 +7503,7 @@
           <w:sz w:val="32"/>
           <w:szCs w:val="32"/>
           <w:bCs w:val="0"/>
+          <w:iCs w:val="0"/>
         </w:rPr>
         <w:t xml:space="preserve"> เกณฑ์ </w:t>
       </w:r>
@@ -7258,6 +7515,7 @@
           <w:sz w:val="32"/>
           <w:szCs w:val="32"/>
           <w:bCs w:val="0"/>
+          <w:iCs w:val="0"/>
           <w:highlight w:val="yellow"/>
         </w:rPr>
         <w:t>[30]</w:t>
@@ -7270,6 +7528,7 @@
           <w:sz w:val="32"/>
           <w:szCs w:val="32"/>
           <w:bCs w:val="0"/>
+          <w:iCs w:val="0"/>
         </w:rPr>
         <w:t xml:space="preserve"> วินาที (T_image) </w:t>
       </w:r>
@@ -7281,6 +7540,7 @@
           <w:sz w:val="32"/>
           <w:szCs w:val="32"/>
           <w:bCs w:val="0"/>
+          <w:iCs w:val="0"/>
           <w:highlight w:val="yellow"/>
         </w:rPr>
         <w:t>[กรณีไม่ได้รับภาพ ระบบแจ้งเตือนแบบไม่มีรูปภาพตามที่ออกแบบ ให้ระบุจำนวนครั้ง]</w:t>
@@ -7293,6 +7553,7 @@
           <w:sz w:val="32"/>
           <w:szCs w:val="32"/>
           <w:bCs w:val="0"/>
+          <w:iCs w:val="0"/>
         </w:rPr>
         <w:t xml:space="preserve"> ผลจากตารางที่ 4.7 แสดงว่าการปลดล็อกด้วยปุ่ม </w:t>
       </w:r>
@@ -7304,6 +7565,7 @@
           <w:sz w:val="32"/>
           <w:szCs w:val="32"/>
           <w:bCs w:val="0"/>
+          <w:iCs w:val="0"/>
           <w:highlight w:val="yellow"/>
         </w:rPr>
         <w:t>[ไม่มี/มี]</w:t>
@@ -7316,6 +7578,7 @@
           <w:sz w:val="32"/>
           <w:szCs w:val="32"/>
           <w:bCs w:val="0"/>
+          <w:iCs w:val="0"/>
         </w:rPr>
         <w:t xml:space="preserve"> การถ่ายภาพ </w:t>
       </w:r>
@@ -7327,6 +7590,7 @@
           <w:sz w:val="32"/>
           <w:szCs w:val="32"/>
           <w:bCs w:val="0"/>
+          <w:iCs w:val="0"/>
           <w:highlight w:val="yellow"/>
         </w:rPr>
         <w:t>[ตรง/ไม่ตรง]</w:t>
@@ -7339,6 +7603,7 @@
           <w:sz w:val="32"/>
           <w:szCs w:val="32"/>
           <w:bCs w:val="0"/>
+          <w:iCs w:val="0"/>
         </w:rPr>
         <w:t xml:space="preserve"> ตามที่ออกแบบ และการที่ ESP32-CAM อยู่ภายในตู้อลูมิเนียม </w:t>
       </w:r>
@@ -7350,6 +7615,7 @@
           <w:sz w:val="32"/>
           <w:szCs w:val="32"/>
           <w:bCs w:val="0"/>
+          <w:iCs w:val="0"/>
           <w:highlight w:val="yellow"/>
         </w:rPr>
         <w:t>[ไม่ส่งผล/ส่งผล]</w:t>
@@ -7362,6 +7628,7 @@
           <w:sz w:val="32"/>
           <w:szCs w:val="32"/>
           <w:bCs w:val="0"/>
+          <w:iCs w:val="0"/>
         </w:rPr>
         <w:t xml:space="preserve"> ต่อการส่งภาพ ซึ่งพิจารณาจากเวลารอภาพและจำนวนครั้งที่ไม่ได้รับภาพ</w:t>
       </w:r>
@@ -7381,6 +7648,7 @@
           <w:sz w:val="32"/>
           <w:szCs w:val="32"/>
           <w:bCs w:val="1"/>
+          <w:iCs w:val="0"/>
         </w:rPr>
         <w:t>4.7 ผลการทดสอบการตรวจสอบสถานะประตูและการล็อกอัตโนมัติด้วย Reed Switch MC-38</w:t>
       </w:r>
@@ -7399,6 +7667,7 @@
           <w:sz w:val="32"/>
           <w:szCs w:val="32"/>
           <w:bCs w:val="0"/>
+          <w:iCs w:val="0"/>
         </w:rPr>
         <w:t xml:space="preserve">การทดสอบนี้ตรวจสอบว่าระบบรับรู้สถานะประตูปิดสนิทได้ถูกต้องผ่านเซนเซอร์ Reed Switch MC-38 ซึ่งกรองสัญญาณสั่นของหน้าสัมผัสด้วยซอฟต์แวร์ 100 ms </w:t>
       </w:r>
@@ -7410,6 +7679,7 @@
           <w:sz w:val="32"/>
           <w:szCs w:val="32"/>
           <w:bCs w:val="0"/>
+          <w:iCs w:val="0"/>
           <w:highlight w:val="yellow"/>
         </w:rPr>
         <w:t>[16]</w:t>
@@ -7422,6 +7692,7 @@
           <w:sz w:val="32"/>
           <w:szCs w:val="32"/>
           <w:bCs w:val="0"/>
+          <w:iCs w:val="0"/>
         </w:rPr>
         <w:t xml:space="preserve"> และสั่งล็อกกลอนทันที ผู้ทดสอบปิดประตูด้วยมือในทุกครั้ง ทดสอบ 15 ครั้ง ดังตารางที่ 4.8 และตัวอย่างการทดสอบแสดงดังภาพประกอบที่ 4.5</w:t>
       </w:r>
@@ -7442,6 +7713,7 @@
           <w:sz w:val="32"/>
           <w:szCs w:val="32"/>
           <w:bCs w:val="0"/>
+          <w:iCs w:val="0"/>
         </w:rPr>
         <w:t>ตารางที่ 4.8 ผลการทำงานของระบบการตรวจสอบสถานะประตูและการล็อก</w:t>
       </w:r>
@@ -7483,6 +7755,7 @@
                 <w:sz w:val="28"/>
                 <w:szCs w:val="28"/>
                 <w:bCs w:val="1"/>
+                <w:iCs w:val="0"/>
               </w:rPr>
               <w:t>ครั้งที่ทดสอบ</w:t>
             </w:r>
@@ -7507,6 +7780,7 @@
                 <w:sz w:val="28"/>
                 <w:szCs w:val="28"/>
                 <w:bCs w:val="1"/>
+                <w:iCs w:val="0"/>
               </w:rPr>
               <w:t>ประตูปิดสนิท</w:t>
             </w:r>
@@ -7531,6 +7805,7 @@
                 <w:sz w:val="28"/>
                 <w:szCs w:val="28"/>
                 <w:bCs w:val="1"/>
+                <w:iCs w:val="0"/>
               </w:rPr>
               <w:t>กลอนแม่เหล็กสั่งล็อกสำเร็จ</w:t>
             </w:r>
@@ -7559,6 +7834,7 @@
                 <w:sz w:val="28"/>
                 <w:szCs w:val="28"/>
                 <w:bCs w:val="0"/>
+                <w:iCs w:val="0"/>
               </w:rPr>
               <w:t>1</w:t>
             </w:r>
@@ -7611,6 +7887,7 @@
                 <w:sz w:val="28"/>
                 <w:szCs w:val="28"/>
                 <w:bCs w:val="0"/>
+                <w:iCs w:val="0"/>
               </w:rPr>
               <w:t>2</w:t>
             </w:r>
@@ -7663,6 +7940,7 @@
                 <w:sz w:val="28"/>
                 <w:szCs w:val="28"/>
                 <w:bCs w:val="0"/>
+                <w:iCs w:val="0"/>
               </w:rPr>
               <w:t>3</w:t>
             </w:r>
@@ -7715,6 +7993,7 @@
                 <w:sz w:val="28"/>
                 <w:szCs w:val="28"/>
                 <w:bCs w:val="0"/>
+                <w:iCs w:val="0"/>
               </w:rPr>
               <w:t>4</w:t>
             </w:r>
@@ -7767,6 +8046,7 @@
                 <w:sz w:val="28"/>
                 <w:szCs w:val="28"/>
                 <w:bCs w:val="0"/>
+                <w:iCs w:val="0"/>
               </w:rPr>
               <w:t>5</w:t>
             </w:r>
@@ -7819,6 +8099,7 @@
                 <w:sz w:val="28"/>
                 <w:szCs w:val="28"/>
                 <w:bCs w:val="0"/>
+                <w:iCs w:val="0"/>
               </w:rPr>
               <w:t>6</w:t>
             </w:r>
@@ -7871,6 +8152,7 @@
                 <w:sz w:val="28"/>
                 <w:szCs w:val="28"/>
                 <w:bCs w:val="0"/>
+                <w:iCs w:val="0"/>
               </w:rPr>
               <w:t>7</w:t>
             </w:r>
@@ -7923,6 +8205,7 @@
                 <w:sz w:val="28"/>
                 <w:szCs w:val="28"/>
                 <w:bCs w:val="0"/>
+                <w:iCs w:val="0"/>
               </w:rPr>
               <w:t>8</w:t>
             </w:r>
@@ -7975,6 +8258,7 @@
                 <w:sz w:val="28"/>
                 <w:szCs w:val="28"/>
                 <w:bCs w:val="0"/>
+                <w:iCs w:val="0"/>
               </w:rPr>
               <w:t>9</w:t>
             </w:r>
@@ -8027,6 +8311,7 @@
                 <w:sz w:val="28"/>
                 <w:szCs w:val="28"/>
                 <w:bCs w:val="0"/>
+                <w:iCs w:val="0"/>
               </w:rPr>
               <w:t>10</w:t>
             </w:r>
@@ -8079,6 +8364,7 @@
                 <w:sz w:val="28"/>
                 <w:szCs w:val="28"/>
                 <w:bCs w:val="0"/>
+                <w:iCs w:val="0"/>
               </w:rPr>
               <w:t>11</w:t>
             </w:r>
@@ -8131,6 +8417,7 @@
                 <w:sz w:val="28"/>
                 <w:szCs w:val="28"/>
                 <w:bCs w:val="0"/>
+                <w:iCs w:val="0"/>
               </w:rPr>
               <w:t>12</w:t>
             </w:r>
@@ -8183,6 +8470,7 @@
                 <w:sz w:val="28"/>
                 <w:szCs w:val="28"/>
                 <w:bCs w:val="0"/>
+                <w:iCs w:val="0"/>
               </w:rPr>
               <w:t>13</w:t>
             </w:r>
@@ -8235,6 +8523,7 @@
                 <w:sz w:val="28"/>
                 <w:szCs w:val="28"/>
                 <w:bCs w:val="0"/>
+                <w:iCs w:val="0"/>
               </w:rPr>
               <w:t>14</w:t>
             </w:r>
@@ -8286,6 +8575,7 @@
                 <w:sz w:val="28"/>
                 <w:szCs w:val="28"/>
                 <w:bCs w:val="0"/>
+                <w:iCs w:val="0"/>
               </w:rPr>
               <w:t>15</w:t>
             </w:r>
@@ -8329,6 +8619,7 @@
           <w:sz w:val="28"/>
           <w:szCs w:val="28"/>
           <w:bCs w:val="0"/>
+          <w:iCs w:val="0"/>
         </w:rPr>
         <w:t>√ = ประตูปิดเข้าตำแหน่ง/ล็อกสำเร็จ    × = ประตูปิดไม่สนิท/ล็อกไม่สำเร็จ</w:t>
       </w:r>
@@ -8353,6 +8644,7 @@
           <w:sz w:val="32"/>
           <w:szCs w:val="32"/>
           <w:bCs w:val="0"/>
+          <w:iCs w:val="0"/>
           <w:highlight w:val="yellow"/>
         </w:rPr>
         <w:t>[แทรกภาพการติดตั้ง Reed Switch และการทดสอบปิดประตู]</w:t>
@@ -8372,6 +8664,7 @@
           <w:sz w:val="32"/>
           <w:szCs w:val="32"/>
           <w:bCs w:val="0"/>
+          <w:iCs w:val="0"/>
         </w:rPr>
         <w:t>ภาพประกอบที่ 4.5 การทดสอบการตรวจสอบสถานะประตูด้วย Reed Switch MC-38</w:t>
       </w:r>
@@ -8390,6 +8683,7 @@
           <w:sz w:val="32"/>
           <w:szCs w:val="32"/>
           <w:bCs w:val="0"/>
+          <w:iCs w:val="0"/>
         </w:rPr>
         <w:t xml:space="preserve">จากตารางที่ 4.8 พบว่า ระบบตรวจพบสถานะประตูปิดสนิทถูกต้อง </w:t>
       </w:r>
@@ -8401,6 +8695,7 @@
           <w:sz w:val="32"/>
           <w:szCs w:val="32"/>
           <w:bCs w:val="0"/>
+          <w:iCs w:val="0"/>
           <w:highlight w:val="yellow"/>
         </w:rPr>
         <w:t>[ ]</w:t>
@@ -8413,6 +8708,7 @@
           <w:sz w:val="32"/>
           <w:szCs w:val="32"/>
           <w:bCs w:val="0"/>
+          <w:iCs w:val="0"/>
         </w:rPr>
         <w:t xml:space="preserve"> ครั้ง และสั่งล็อกสำเร็จ </w:t>
       </w:r>
@@ -8424,6 +8720,7 @@
           <w:sz w:val="32"/>
           <w:szCs w:val="32"/>
           <w:bCs w:val="0"/>
+          <w:iCs w:val="0"/>
           <w:highlight w:val="yellow"/>
         </w:rPr>
         <w:t>[ ]</w:t>
@@ -8436,6 +8733,7 @@
           <w:sz w:val="32"/>
           <w:szCs w:val="32"/>
           <w:bCs w:val="0"/>
+          <w:iCs w:val="0"/>
         </w:rPr>
         <w:t xml:space="preserve"> ครั้งจาก 15 ครั้ง คิดเป็นร้อยละ </w:t>
       </w:r>
@@ -8447,6 +8745,7 @@
           <w:sz w:val="32"/>
           <w:szCs w:val="32"/>
           <w:bCs w:val="0"/>
+          <w:iCs w:val="0"/>
           <w:highlight w:val="yellow"/>
         </w:rPr>
         <w:t>[ ]</w:t>
@@ -8459,6 +8758,7 @@
           <w:sz w:val="32"/>
           <w:szCs w:val="32"/>
           <w:bCs w:val="0"/>
+          <w:iCs w:val="0"/>
         </w:rPr>
         <w:t xml:space="preserve"> แสดงว่าเซนเซอร์แบบ Event-Driven </w:t>
       </w:r>
@@ -8470,6 +8770,7 @@
           <w:sz w:val="32"/>
           <w:szCs w:val="32"/>
           <w:bCs w:val="0"/>
+          <w:iCs w:val="0"/>
           <w:highlight w:val="yellow"/>
         </w:rPr>
         <w:t>[ตรวจจับสถานะได้แม่นยำ/มีข้อผิดพลาดบางครั้ง]</w:t>
@@ -8482,6 +8783,7 @@
           <w:sz w:val="32"/>
           <w:szCs w:val="32"/>
           <w:bCs w:val="0"/>
+          <w:iCs w:val="0"/>
         </w:rPr>
         <w:t xml:space="preserve"> </w:t>
       </w:r>
@@ -8493,6 +8795,7 @@
           <w:sz w:val="32"/>
           <w:szCs w:val="32"/>
           <w:bCs w:val="0"/>
+          <w:iCs w:val="0"/>
           <w:highlight w:val="yellow"/>
         </w:rPr>
         <w:t>[ถ้ามีครั้งที่ล้มเหลว ให้ระบุสาเหตุ เช่น ระยะระหว่างแม่เหล็กกับสวิตช์ หรือผู้ทดสอบปิดประตูไม่สนิท]</w:t>
@@ -8513,6 +8816,7 @@
           <w:sz w:val="32"/>
           <w:szCs w:val="32"/>
           <w:bCs w:val="1"/>
+          <w:iCs w:val="0"/>
         </w:rPr>
         <w:t>4.8 ผลการทดสอบการแจ้งเตือนกรณีประตูปิดไม่สนิทและความเสถียรของระบบ</w:t>
       </w:r>
@@ -8531,6 +8835,7 @@
           <w:sz w:val="32"/>
           <w:szCs w:val="32"/>
           <w:bCs w:val="0"/>
+          <w:iCs w:val="0"/>
         </w:rPr>
         <w:t>เนื่องจากต้นแบบไม่มีโช้คอัพประตู ผู้ใช้ต้องปิดประตูด้วยมือ จึงมีโอกาสที่ประตูปิดไม่สนิท ระบบจึงออกแบบให้แจ้งเตือนเมื่อประตูเปิดค้างเกิน 60 วินาที (T_ajar) โดยเซิร์ฟเวอร์บันทึกเหตุการณ์ door_ajar และส่งข้อความผ่าน LINE ครั้งเดียว ส่วนบัซเซอร์ที่ตัวเครื่องส่งเสียงเตือนซ้ำจนกว่าจะปิดประตู การทดสอบนี้จำลองกรณีมีวัตถุกีดขวางทำให้ประตูปิดไม่สนิท เพื่อวัดความถูกต้องของการแจ้งเตือนด้วยเสียงและผ่าน LINE Messaging API ทดสอบ 15 ครั้ง ดังตารางที่ 4.9 และตัวอย่างข้อความแจ้งเตือนที่ได้รับแสดงดังภาพประกอบที่ 4.6</w:t>
       </w:r>
@@ -8551,6 +8856,7 @@
           <w:sz w:val="32"/>
           <w:szCs w:val="32"/>
           <w:bCs w:val="0"/>
+          <w:iCs w:val="0"/>
         </w:rPr>
         <w:t>ตารางที่ 4.9 ผลการส่งสัญญาณแจ้งเตือนความปลอดภัยและแจ้งเตือนผ่าน IoT</w:t>
       </w:r>
@@ -8593,6 +8899,7 @@
                 <w:sz w:val="28"/>
                 <w:szCs w:val="28"/>
                 <w:bCs w:val="1"/>
+                <w:iCs w:val="0"/>
               </w:rPr>
               <w:t>ครั้งที่ทดสอบ</w:t>
             </w:r>
@@ -8617,6 +8924,7 @@
                 <w:sz w:val="28"/>
                 <w:szCs w:val="28"/>
                 <w:bCs w:val="1"/>
+                <w:iCs w:val="0"/>
               </w:rPr>
               <w:t>สัญญาณเสียงแจ้งเตือนสำเร็จ</w:t>
             </w:r>
@@ -8641,6 +8949,7 @@
                 <w:sz w:val="28"/>
                 <w:szCs w:val="28"/>
                 <w:bCs w:val="1"/>
+                <w:iCs w:val="0"/>
               </w:rPr>
               <w:t>การแจ้งเตือนผ่าน LINE สำเร็จ</w:t>
             </w:r>
@@ -8665,6 +8974,7 @@
                 <w:sz w:val="28"/>
                 <w:szCs w:val="28"/>
                 <w:bCs w:val="1"/>
+                <w:iCs w:val="0"/>
               </w:rPr>
               <w:t>เวลาตั้งแต่เปิดค้างถึงแจ้งเตือน (วินาที)</w:t>
             </w:r>
@@ -8693,6 +9003,7 @@
                 <w:sz w:val="28"/>
                 <w:szCs w:val="28"/>
                 <w:bCs w:val="0"/>
+                <w:iCs w:val="0"/>
               </w:rPr>
               <w:t>1</w:t>
             </w:r>
@@ -8757,6 +9068,7 @@
                 <w:sz w:val="28"/>
                 <w:szCs w:val="28"/>
                 <w:bCs w:val="0"/>
+                <w:iCs w:val="0"/>
               </w:rPr>
               <w:t>2</w:t>
             </w:r>
@@ -8821,6 +9133,7 @@
                 <w:sz w:val="28"/>
                 <w:szCs w:val="28"/>
                 <w:bCs w:val="0"/>
+                <w:iCs w:val="0"/>
               </w:rPr>
               <w:t>3</w:t>
             </w:r>
@@ -8885,6 +9198,7 @@
                 <w:sz w:val="28"/>
                 <w:szCs w:val="28"/>
                 <w:bCs w:val="0"/>
+                <w:iCs w:val="0"/>
               </w:rPr>
               <w:t>4</w:t>
             </w:r>
@@ -8949,6 +9263,7 @@
                 <w:sz w:val="28"/>
                 <w:szCs w:val="28"/>
                 <w:bCs w:val="0"/>
+                <w:iCs w:val="0"/>
               </w:rPr>
               <w:t>5</w:t>
             </w:r>
@@ -9013,6 +9328,7 @@
                 <w:sz w:val="28"/>
                 <w:szCs w:val="28"/>
                 <w:bCs w:val="0"/>
+                <w:iCs w:val="0"/>
               </w:rPr>
               <w:t>6</w:t>
             </w:r>
@@ -9077,6 +9393,7 @@
                 <w:sz w:val="28"/>
                 <w:szCs w:val="28"/>
                 <w:bCs w:val="0"/>
+                <w:iCs w:val="0"/>
               </w:rPr>
               <w:t>7</w:t>
             </w:r>
@@ -9141,6 +9458,7 @@
                 <w:sz w:val="28"/>
                 <w:szCs w:val="28"/>
                 <w:bCs w:val="0"/>
+                <w:iCs w:val="0"/>
               </w:rPr>
               <w:t>8</w:t>
             </w:r>
@@ -9205,6 +9523,7 @@
                 <w:sz w:val="28"/>
                 <w:szCs w:val="28"/>
                 <w:bCs w:val="0"/>
+                <w:iCs w:val="0"/>
               </w:rPr>
               <w:t>9</w:t>
             </w:r>
@@ -9269,6 +9588,7 @@
                 <w:sz w:val="28"/>
                 <w:szCs w:val="28"/>
                 <w:bCs w:val="0"/>
+                <w:iCs w:val="0"/>
               </w:rPr>
               <w:t>10</w:t>
             </w:r>
@@ -9333,6 +9653,7 @@
                 <w:sz w:val="28"/>
                 <w:szCs w:val="28"/>
                 <w:bCs w:val="0"/>
+                <w:iCs w:val="0"/>
               </w:rPr>
               <w:t>11</w:t>
             </w:r>
@@ -9397,6 +9718,7 @@
                 <w:sz w:val="28"/>
                 <w:szCs w:val="28"/>
                 <w:bCs w:val="0"/>
+                <w:iCs w:val="0"/>
               </w:rPr>
               <w:t>12</w:t>
             </w:r>
@@ -9461,6 +9783,7 @@
                 <w:sz w:val="28"/>
                 <w:szCs w:val="28"/>
                 <w:bCs w:val="0"/>
+                <w:iCs w:val="0"/>
               </w:rPr>
               <w:t>13</w:t>
             </w:r>
@@ -9525,6 +9848,7 @@
                 <w:sz w:val="28"/>
                 <w:szCs w:val="28"/>
                 <w:bCs w:val="0"/>
+                <w:iCs w:val="0"/>
               </w:rPr>
               <w:t>14</w:t>
             </w:r>
@@ -9588,6 +9912,7 @@
                 <w:sz w:val="28"/>
                 <w:szCs w:val="28"/>
                 <w:bCs w:val="0"/>
+                <w:iCs w:val="0"/>
               </w:rPr>
               <w:t>15</w:t>
             </w:r>
@@ -9642,6 +9967,7 @@
           <w:sz w:val="28"/>
           <w:szCs w:val="28"/>
           <w:bCs w:val="0"/>
+          <w:iCs w:val="0"/>
         </w:rPr>
         <w:t>√ = มีเสียงเตือน/แจ้งเตือนเข้า LINE    × = ไม่มีการแจ้งเตือนเมื่อเกิดข้อผิดพลาด</w:t>
       </w:r>
@@ -9660,6 +9986,7 @@
           <w:sz w:val="28"/>
           <w:szCs w:val="28"/>
           <w:bCs w:val="0"/>
+          <w:iCs w:val="0"/>
         </w:rPr>
         <w:t>เวลาตั้งแต่เปิดค้างถึงแจ้งเตือน = เวลาเหตุการณ์ door_ajar − เวลาเหตุการณ์ door_open ใน Access Log</w:t>
       </w:r>
@@ -9684,6 +10011,7 @@
           <w:sz w:val="32"/>
           <w:szCs w:val="32"/>
           <w:bCs w:val="0"/>
+          <w:iCs w:val="0"/>
           <w:highlight w:val="yellow"/>
         </w:rPr>
         <w:t>[แทรกภาพหน้าจอ LINE ที่ได้รับแจ้งเตือนประตูเปิดค้าง]</w:t>
@@ -9703,6 +10031,7 @@
           <w:sz w:val="32"/>
           <w:szCs w:val="32"/>
           <w:bCs w:val="0"/>
+          <w:iCs w:val="0"/>
         </w:rPr>
         <w:t>ภาพประกอบที่ 4.6 ตัวอย่างข้อความแจ้งเตือนกรณีประตูปิดไม่สนิทผ่าน LINE</w:t>
       </w:r>
@@ -9721,6 +10050,7 @@
           <w:sz w:val="32"/>
           <w:szCs w:val="32"/>
           <w:bCs w:val="0"/>
+          <w:iCs w:val="0"/>
         </w:rPr>
         <w:t xml:space="preserve">จากตารางที่ 4.9 พบว่า มีเสียงเตือน </w:t>
       </w:r>
@@ -9732,6 +10062,7 @@
           <w:sz w:val="32"/>
           <w:szCs w:val="32"/>
           <w:bCs w:val="0"/>
+          <w:iCs w:val="0"/>
           <w:highlight w:val="yellow"/>
         </w:rPr>
         <w:t>[ ]</w:t>
@@ -9744,6 +10075,7 @@
           <w:sz w:val="32"/>
           <w:szCs w:val="32"/>
           <w:bCs w:val="0"/>
+          <w:iCs w:val="0"/>
         </w:rPr>
         <w:t xml:space="preserve"> ครั้ง และแจ้งเตือนเข้า LINE </w:t>
       </w:r>
@@ -9755,6 +10087,7 @@
           <w:sz w:val="32"/>
           <w:szCs w:val="32"/>
           <w:bCs w:val="0"/>
+          <w:iCs w:val="0"/>
           <w:highlight w:val="yellow"/>
         </w:rPr>
         <w:t>[ ]</w:t>
@@ -9767,6 +10100,7 @@
           <w:sz w:val="32"/>
           <w:szCs w:val="32"/>
           <w:bCs w:val="0"/>
+          <w:iCs w:val="0"/>
         </w:rPr>
         <w:t xml:space="preserve"> ครั้งจาก 15 ครั้ง คิดเป็นร้อยละ </w:t>
       </w:r>
@@ -9778,6 +10112,7 @@
           <w:sz w:val="32"/>
           <w:szCs w:val="32"/>
           <w:bCs w:val="0"/>
+          <w:iCs w:val="0"/>
           <w:highlight w:val="yellow"/>
         </w:rPr>
         <w:t>[ ]</w:t>
@@ -9790,6 +10125,7 @@
           <w:sz w:val="32"/>
           <w:szCs w:val="32"/>
           <w:bCs w:val="0"/>
+          <w:iCs w:val="0"/>
         </w:rPr>
         <w:t xml:space="preserve"> และ </w:t>
       </w:r>
@@ -9801,6 +10137,7 @@
           <w:sz w:val="32"/>
           <w:szCs w:val="32"/>
           <w:bCs w:val="0"/>
+          <w:iCs w:val="0"/>
           <w:highlight w:val="yellow"/>
         </w:rPr>
         <w:t>[ ]</w:t>
@@ -9813,6 +10150,7 @@
           <w:sz w:val="32"/>
           <w:szCs w:val="32"/>
           <w:bCs w:val="0"/>
+          <w:iCs w:val="0"/>
         </w:rPr>
         <w:t xml:space="preserve"> ตามลำดับ เวลาตั้งแต่เปิดค้างถึงแจ้งเตือนเฉลี่ย </w:t>
       </w:r>
@@ -9824,6 +10162,7 @@
           <w:sz w:val="32"/>
           <w:szCs w:val="32"/>
           <w:bCs w:val="0"/>
+          <w:iCs w:val="0"/>
           <w:highlight w:val="yellow"/>
         </w:rPr>
         <w:t>[ ]</w:t>
@@ -9836,6 +10175,7 @@
           <w:sz w:val="32"/>
           <w:szCs w:val="32"/>
           <w:bCs w:val="0"/>
+          <w:iCs w:val="0"/>
         </w:rPr>
         <w:t xml:space="preserve"> วินาที </w:t>
       </w:r>
@@ -9847,6 +10187,7 @@
           <w:sz w:val="32"/>
           <w:szCs w:val="32"/>
           <w:bCs w:val="0"/>
+          <w:iCs w:val="0"/>
           <w:highlight w:val="yellow"/>
         </w:rPr>
         <w:t>[ใกล้เคียง/ต่างจาก]</w:t>
@@ -9859,6 +10200,7 @@
           <w:sz w:val="32"/>
           <w:szCs w:val="32"/>
           <w:bCs w:val="0"/>
+          <w:iCs w:val="0"/>
         </w:rPr>
         <w:t xml:space="preserve"> 60 วินาทีที่กำหนด </w:t>
       </w:r>
@@ -9870,6 +10212,7 @@
           <w:sz w:val="32"/>
           <w:szCs w:val="32"/>
           <w:bCs w:val="0"/>
+          <w:iCs w:val="0"/>
           <w:highlight w:val="yellow"/>
         </w:rPr>
         <w:t>[ถ้ามีครั้งที่ไม่ได้รับ LINE ให้ระบุสาเหตุ และสังเกตว่าเสียงเตือนที่ตัวเครื่องไม่ขึ้นกับเครือข่าย]</w:t>
@@ -9890,6 +10233,7 @@
           <w:sz w:val="32"/>
           <w:szCs w:val="32"/>
           <w:bCs w:val="1"/>
+          <w:iCs w:val="0"/>
         </w:rPr>
         <w:t>4.9 ผลการทดสอบประสิทธิภาพและความต่อเนื่องของระบบโดยรวม</w:t>
       </w:r>
@@ -9908,6 +10252,7 @@
           <w:sz w:val="32"/>
           <w:szCs w:val="32"/>
           <w:bCs w:val="0"/>
+          <w:iCs w:val="0"/>
         </w:rPr>
         <w:t>การทดสอบนี้ประเมินการทำงานร่วมกันของระบบแบบครบวงจร (End-to-End Testing) ทั้งฮาร์ดแวร์และซอฟต์แวร์ ตั้งแต่การอ่านรหัสคิวอาร์จนถึงการแจ้งเตือนผู้ใช้งาน ทดสอบซ้ำ 15 ครั้ง ผู้ทดสอบปิดประตูด้วยมือจนสนิท แต่ละครั้งประกอบด้วย 7 ขั้นตอน ดังตารางที่ 4.10</w:t>
       </w:r>
@@ -9928,6 +10273,7 @@
           <w:sz w:val="32"/>
           <w:szCs w:val="32"/>
           <w:bCs w:val="0"/>
+          <w:iCs w:val="0"/>
         </w:rPr>
         <w:t>ตารางที่ 4.10 ผลการทดสอบประสิทธิภาพและอัตราความสำเร็จของระบบโดยรวม</w:t>
       </w:r>
@@ -9975,6 +10321,7 @@
                 <w:sz w:val="28"/>
                 <w:szCs w:val="28"/>
                 <w:bCs w:val="1"/>
+                <w:iCs w:val="0"/>
               </w:rPr>
               <w:t>ครั้งที่</w:t>
             </w:r>
@@ -9999,6 +10346,7 @@
                 <w:sz w:val="28"/>
                 <w:szCs w:val="28"/>
                 <w:bCs w:val="1"/>
+                <w:iCs w:val="0"/>
               </w:rPr>
               <w:t>การอ่านรหัส</w:t>
             </w:r>
@@ -10023,6 +10371,7 @@
                 <w:sz w:val="28"/>
                 <w:szCs w:val="28"/>
                 <w:bCs w:val="1"/>
+                <w:iCs w:val="0"/>
               </w:rPr>
               <w:t>สัญญาณเสียงแจ้งเตือน</w:t>
             </w:r>
@@ -10047,6 +10396,7 @@
                 <w:sz w:val="28"/>
                 <w:szCs w:val="28"/>
                 <w:bCs w:val="1"/>
+                <w:iCs w:val="0"/>
               </w:rPr>
               <w:t>การสั่งปลดล็อก</w:t>
             </w:r>
@@ -10071,6 +10421,7 @@
                 <w:sz w:val="28"/>
                 <w:szCs w:val="28"/>
                 <w:bCs w:val="1"/>
+                <w:iCs w:val="0"/>
               </w:rPr>
               <w:t>ประตูปิดสนิท</w:t>
             </w:r>
@@ -10095,6 +10446,7 @@
                 <w:sz w:val="28"/>
                 <w:szCs w:val="28"/>
                 <w:bCs w:val="1"/>
+                <w:iCs w:val="0"/>
               </w:rPr>
               <w:t>กลอนแม่เหล็กสั่งล็อก</w:t>
             </w:r>
@@ -10119,6 +10471,7 @@
                 <w:sz w:val="28"/>
                 <w:szCs w:val="28"/>
                 <w:bCs w:val="1"/>
+                <w:iCs w:val="0"/>
               </w:rPr>
               <w:t>การบันทึกและส่งภาพ</w:t>
             </w:r>
@@ -10143,6 +10496,7 @@
                 <w:sz w:val="28"/>
                 <w:szCs w:val="28"/>
                 <w:bCs w:val="1"/>
+                <w:iCs w:val="0"/>
               </w:rPr>
               <w:t>การแจ้งเตือนผ่าน LINE</w:t>
             </w:r>
@@ -10167,6 +10521,7 @@
                 <w:sz w:val="28"/>
                 <w:szCs w:val="28"/>
                 <w:bCs w:val="1"/>
+                <w:iCs w:val="0"/>
               </w:rPr>
               <w:t>อัตราความสำเร็จ (%)</w:t>
             </w:r>
@@ -10195,6 +10550,7 @@
                 <w:sz w:val="28"/>
                 <w:szCs w:val="28"/>
                 <w:bCs w:val="0"/>
+                <w:iCs w:val="0"/>
               </w:rPr>
               <w:t>1</w:t>
             </w:r>
@@ -10319,6 +10675,7 @@
                 <w:sz w:val="28"/>
                 <w:szCs w:val="28"/>
                 <w:bCs w:val="0"/>
+                <w:iCs w:val="0"/>
               </w:rPr>
               <w:t>2</w:t>
             </w:r>
@@ -10443,6 +10800,7 @@
                 <w:sz w:val="28"/>
                 <w:szCs w:val="28"/>
                 <w:bCs w:val="0"/>
+                <w:iCs w:val="0"/>
               </w:rPr>
               <w:t>3</w:t>
             </w:r>
@@ -10567,6 +10925,7 @@
                 <w:sz w:val="28"/>
                 <w:szCs w:val="28"/>
                 <w:bCs w:val="0"/>
+                <w:iCs w:val="0"/>
               </w:rPr>
               <w:t>4</w:t>
             </w:r>
@@ -10691,6 +11050,7 @@
                 <w:sz w:val="28"/>
                 <w:szCs w:val="28"/>
                 <w:bCs w:val="0"/>
+                <w:iCs w:val="0"/>
               </w:rPr>
               <w:t>5</w:t>
             </w:r>
@@ -10815,6 +11175,7 @@
                 <w:sz w:val="28"/>
                 <w:szCs w:val="28"/>
                 <w:bCs w:val="0"/>
+                <w:iCs w:val="0"/>
               </w:rPr>
               <w:t>6</w:t>
             </w:r>
@@ -10939,6 +11300,7 @@
                 <w:sz w:val="28"/>
                 <w:szCs w:val="28"/>
                 <w:bCs w:val="0"/>
+                <w:iCs w:val="0"/>
               </w:rPr>
               <w:t>7</w:t>
             </w:r>
@@ -11063,6 +11425,7 @@
                 <w:sz w:val="28"/>
                 <w:szCs w:val="28"/>
                 <w:bCs w:val="0"/>
+                <w:iCs w:val="0"/>
               </w:rPr>
               <w:t>8</w:t>
             </w:r>
@@ -11187,6 +11550,7 @@
                 <w:sz w:val="28"/>
                 <w:szCs w:val="28"/>
                 <w:bCs w:val="0"/>
+                <w:iCs w:val="0"/>
               </w:rPr>
               <w:t>9</w:t>
             </w:r>
@@ -11311,6 +11675,7 @@
                 <w:sz w:val="28"/>
                 <w:szCs w:val="28"/>
                 <w:bCs w:val="0"/>
+                <w:iCs w:val="0"/>
               </w:rPr>
               <w:t>10</w:t>
             </w:r>
@@ -11435,6 +11800,7 @@
                 <w:sz w:val="28"/>
                 <w:szCs w:val="28"/>
                 <w:bCs w:val="0"/>
+                <w:iCs w:val="0"/>
               </w:rPr>
               <w:t>11</w:t>
             </w:r>
@@ -11559,6 +11925,7 @@
                 <w:sz w:val="28"/>
                 <w:szCs w:val="28"/>
                 <w:bCs w:val="0"/>
+                <w:iCs w:val="0"/>
               </w:rPr>
               <w:t>12</w:t>
             </w:r>
@@ -11683,6 +12050,7 @@
                 <w:sz w:val="28"/>
                 <w:szCs w:val="28"/>
                 <w:bCs w:val="0"/>
+                <w:iCs w:val="0"/>
               </w:rPr>
               <w:t>13</w:t>
             </w:r>
@@ -11807,6 +12175,7 @@
                 <w:sz w:val="28"/>
                 <w:szCs w:val="28"/>
                 <w:bCs w:val="0"/>
+                <w:iCs w:val="0"/>
               </w:rPr>
               <w:t>14</w:t>
             </w:r>
@@ -11931,6 +12300,7 @@
                 <w:sz w:val="28"/>
                 <w:szCs w:val="28"/>
                 <w:bCs w:val="0"/>
+                <w:iCs w:val="0"/>
               </w:rPr>
               <w:t>15</w:t>
             </w:r>
@@ -12055,6 +12425,7 @@
                 <w:sz w:val="28"/>
                 <w:szCs w:val="28"/>
                 <w:bCs w:val="1"/>
+                <w:iCs w:val="0"/>
               </w:rPr>
               <w:t>รวมสำเร็จ</w:t>
             </w:r>
@@ -12172,6 +12543,7 @@
           <w:sz w:val="28"/>
           <w:szCs w:val="28"/>
           <w:bCs w:val="0"/>
+          <w:iCs w:val="0"/>
         </w:rPr>
         <w:t>√ = สำเร็จ    × = ไม่สำเร็จ</w:t>
       </w:r>
@@ -12190,6 +12562,7 @@
           <w:sz w:val="28"/>
           <w:szCs w:val="28"/>
           <w:bCs w:val="0"/>
+          <w:iCs w:val="0"/>
         </w:rPr>
         <w:t>อัตราความสำเร็จต่อครั้ง = (จำนวนขั้นตอนที่ √ ÷ 7) × 100</w:t>
       </w:r>
@@ -12213,6 +12586,7 @@
           <w:sz w:val="32"/>
           <w:szCs w:val="32"/>
           <w:bCs w:val="0"/>
+          <w:iCs w:val="0"/>
         </w:rPr>
         <w:t xml:space="preserve">จากตารางที่ 4.10 พบว่า ระบบทำงานครบทั้ง 7 ขั้นตอนอย่างสมบูรณ์ </w:t>
       </w:r>
@@ -12224,6 +12598,7 @@
           <w:sz w:val="32"/>
           <w:szCs w:val="32"/>
           <w:bCs w:val="0"/>
+          <w:iCs w:val="0"/>
           <w:highlight w:val="yellow"/>
         </w:rPr>
         <w:t>[ ]</w:t>
@@ -12236,6 +12611,7 @@
           <w:sz w:val="32"/>
           <w:szCs w:val="32"/>
           <w:bCs w:val="0"/>
+          <w:iCs w:val="0"/>
         </w:rPr>
         <w:t xml:space="preserve"> ครั้งจาก 15 ครั้ง คิดเป็นร้อยละ </w:t>
       </w:r>
@@ -12247,6 +12623,7 @@
           <w:sz w:val="32"/>
           <w:szCs w:val="32"/>
           <w:bCs w:val="0"/>
+          <w:iCs w:val="0"/>
           <w:highlight w:val="yellow"/>
         </w:rPr>
         <w:t>[ ]</w:t>
@@ -12259,6 +12636,7 @@
           <w:sz w:val="32"/>
           <w:szCs w:val="32"/>
           <w:bCs w:val="0"/>
+          <w:iCs w:val="0"/>
         </w:rPr>
         <w:t xml:space="preserve"> และมีอัตราความสำเร็จเฉลี่ยร้อยละ </w:t>
       </w:r>
@@ -12270,6 +12648,7 @@
           <w:sz w:val="32"/>
           <w:szCs w:val="32"/>
           <w:bCs w:val="0"/>
+          <w:iCs w:val="0"/>
           <w:highlight w:val="yellow"/>
         </w:rPr>
         <w:t>[ ]</w:t>
@@ -12282,6 +12661,7 @@
           <w:sz w:val="32"/>
           <w:szCs w:val="32"/>
           <w:bCs w:val="0"/>
+          <w:iCs w:val="0"/>
         </w:rPr>
         <w:t xml:space="preserve"> ซึ่ง </w:t>
       </w:r>
@@ -12293,6 +12673,7 @@
           <w:sz w:val="32"/>
           <w:szCs w:val="32"/>
           <w:bCs w:val="0"/>
+          <w:iCs w:val="0"/>
           <w:highlight w:val="yellow"/>
         </w:rPr>
         <w:t>[สูงกว่า/ต่ำกว่า]</w:t>
@@ -12305,6 +12686,7 @@
           <w:sz w:val="32"/>
           <w:szCs w:val="32"/>
           <w:bCs w:val="0"/>
+          <w:iCs w:val="0"/>
         </w:rPr>
         <w:t xml:space="preserve"> เกณฑ์ที่กำหนด ขั้นตอนที่มีอัตราสำเร็จต่ำสุดคือ </w:t>
       </w:r>
@@ -12316,6 +12698,7 @@
           <w:sz w:val="32"/>
           <w:szCs w:val="32"/>
           <w:bCs w:val="0"/>
+          <w:iCs w:val="0"/>
           <w:highlight w:val="yellow"/>
         </w:rPr>
         <w:t>[ ]</w:t>
@@ -12328,6 +12711,7 @@
           <w:sz w:val="32"/>
           <w:szCs w:val="32"/>
           <w:bCs w:val="0"/>
+          <w:iCs w:val="0"/>
         </w:rPr>
         <w:t xml:space="preserve"> ที่ </w:t>
       </w:r>
@@ -12339,6 +12723,7 @@
           <w:sz w:val="32"/>
           <w:szCs w:val="32"/>
           <w:bCs w:val="0"/>
+          <w:iCs w:val="0"/>
           <w:highlight w:val="yellow"/>
         </w:rPr>
         <w:t>[ ]</w:t>
@@ -12351,6 +12736,7 @@
           <w:sz w:val="32"/>
           <w:szCs w:val="32"/>
           <w:bCs w:val="0"/>
+          <w:iCs w:val="0"/>
         </w:rPr>
         <w:t xml:space="preserve"> ครั้งจาก 15 ครั้ง </w:t>
       </w:r>
@@ -12362,6 +12748,7 @@
           <w:sz w:val="32"/>
           <w:szCs w:val="32"/>
           <w:bCs w:val="0"/>
+          <w:iCs w:val="0"/>
           <w:highlight w:val="yellow"/>
         </w:rPr>
         <w:t>[วิเคราะห์ว่าขั้นตอนนั้นขึ้นกับปัจจัยใด เช่น เครือข่าย แสง หรือการติดตั้ง]</w:t>
@@ -12382,6 +12769,7 @@
           <w:sz w:val="32"/>
           <w:szCs w:val="32"/>
           <w:bCs w:val="1"/>
+          <w:iCs w:val="0"/>
         </w:rPr>
         <w:t>4.10 อภิปรายผล</w:t>
       </w:r>
@@ -12400,6 +12788,7 @@
           <w:sz w:val="32"/>
           <w:szCs w:val="32"/>
           <w:bCs w:val="1"/>
+          <w:iCs w:val="0"/>
         </w:rPr>
         <w:t>4.10.1 เปรียบเทียบผลกับวัตถุประสงค์</w:t>
       </w:r>
@@ -12419,6 +12808,7 @@
           <w:sz w:val="32"/>
           <w:szCs w:val="32"/>
           <w:bCs w:val="0"/>
+          <w:iCs w:val="0"/>
         </w:rPr>
         <w:t>ผลการเปรียบเทียบผลการทดลองกับขอบเขตการศึกษาตามหัวข้อ 1.3 แสดงดังตารางที่ 4.11</w:t>
       </w:r>
@@ -12439,6 +12829,7 @@
           <w:sz w:val="32"/>
           <w:szCs w:val="32"/>
           <w:bCs w:val="0"/>
+          <w:iCs w:val="0"/>
         </w:rPr>
         <w:t>ตารางที่ 4.11 เปรียบเทียบผลการทดลองกับขอบเขตการศึกษา</w:t>
       </w:r>
@@ -12481,6 +12872,7 @@
                 <w:sz w:val="28"/>
                 <w:szCs w:val="28"/>
                 <w:bCs w:val="1"/>
+                <w:iCs w:val="0"/>
               </w:rPr>
               <w:t>ขอบเขต (หัวข้อ 1.3)</w:t>
             </w:r>
@@ -12505,6 +12897,7 @@
                 <w:sz w:val="28"/>
                 <w:szCs w:val="28"/>
                 <w:bCs w:val="1"/>
+                <w:iCs w:val="0"/>
               </w:rPr>
               <w:t>ผลที่ใช้ประเมิน</w:t>
             </w:r>
@@ -12529,6 +12922,7 @@
                 <w:sz w:val="28"/>
                 <w:szCs w:val="28"/>
                 <w:bCs w:val="1"/>
+                <w:iCs w:val="0"/>
               </w:rPr>
               <w:t>ผลที่ได้</w:t>
             </w:r>
@@ -12553,6 +12947,7 @@
                 <w:sz w:val="28"/>
                 <w:szCs w:val="28"/>
                 <w:bCs w:val="1"/>
+                <w:iCs w:val="0"/>
               </w:rPr>
               <w:t>สรุป</w:t>
             </w:r>
@@ -12581,6 +12976,7 @@
                 <w:sz w:val="28"/>
                 <w:szCs w:val="28"/>
                 <w:bCs w:val="0"/>
+                <w:iCs w:val="0"/>
               </w:rPr>
               <w:t>1.3.1 โครงสร้างกล่องและกลอนแม่เหล็กไฟฟ้า</w:t>
             </w:r>
@@ -12603,6 +12999,7 @@
                 <w:sz w:val="28"/>
                 <w:szCs w:val="28"/>
                 <w:bCs w:val="0"/>
+                <w:iCs w:val="0"/>
               </w:rPr>
               <w:t>หัวข้อ 4.1 และ 4.3</w:t>
             </w:r>
@@ -12626,6 +13023,7 @@
                 <w:sz w:val="28"/>
                 <w:szCs w:val="28"/>
                 <w:bCs w:val="0"/>
+                <w:iCs w:val="0"/>
                 <w:highlight w:val="yellow"/>
               </w:rPr>
               <w:t>[ ]</w:t>
@@ -12649,6 +13047,7 @@
                 <w:sz w:val="28"/>
                 <w:szCs w:val="28"/>
                 <w:bCs w:val="0"/>
+                <w:iCs w:val="0"/>
                 <w:highlight w:val="yellow"/>
               </w:rPr>
               <w:t>[บรรลุ/บรรลุบางส่วน]</w:t>
@@ -12678,6 +13077,7 @@
                 <w:sz w:val="28"/>
                 <w:szCs w:val="28"/>
                 <w:bCs w:val="0"/>
+                <w:iCs w:val="0"/>
               </w:rPr>
               <w:t>1.3.2 ชุดควบคุมและการยืนยันตัวตนด้วยรหัสคิวอาร์</w:t>
             </w:r>
@@ -12701,6 +13101,7 @@
                 <w:sz w:val="28"/>
                 <w:szCs w:val="28"/>
                 <w:bCs w:val="0"/>
+                <w:iCs w:val="0"/>
               </w:rPr>
               <w:t>ตารางที่ 4.4–4.5</w:t>
             </w:r>
@@ -12724,6 +13125,7 @@
                 <w:sz w:val="28"/>
                 <w:szCs w:val="28"/>
                 <w:bCs w:val="0"/>
+                <w:iCs w:val="0"/>
                 <w:highlight w:val="yellow"/>
               </w:rPr>
               <w:t>[ ]</w:t>
@@ -12748,6 +13150,7 @@
                 <w:sz w:val="28"/>
                 <w:szCs w:val="28"/>
                 <w:bCs w:val="0"/>
+                <w:iCs w:val="0"/>
                 <w:highlight w:val="yellow"/>
               </w:rPr>
               <w:t>[ ]</w:t>
@@ -12777,6 +13180,7 @@
                 <w:sz w:val="28"/>
                 <w:szCs w:val="28"/>
                 <w:bCs w:val="0"/>
+                <w:iCs w:val="0"/>
               </w:rPr>
               <w:t>1.3.3 Reed Switch และการบันทึกภาพแบบ Event-Driven</w:t>
             </w:r>
@@ -12800,6 +13204,7 @@
                 <w:sz w:val="28"/>
                 <w:szCs w:val="28"/>
                 <w:bCs w:val="0"/>
+                <w:iCs w:val="0"/>
               </w:rPr>
               <w:t>ตารางที่ 4.6–4.8</w:t>
             </w:r>
@@ -12823,6 +13228,7 @@
                 <w:sz w:val="28"/>
                 <w:szCs w:val="28"/>
                 <w:bCs w:val="0"/>
+                <w:iCs w:val="0"/>
                 <w:highlight w:val="yellow"/>
               </w:rPr>
               <w:t>[ ]</w:t>
@@ -12847,6 +13253,7 @@
                 <w:sz w:val="28"/>
                 <w:szCs w:val="28"/>
                 <w:bCs w:val="0"/>
+                <w:iCs w:val="0"/>
                 <w:highlight w:val="yellow"/>
               </w:rPr>
               <w:t>[ ]</w:t>
@@ -12876,6 +13283,7 @@
                 <w:sz w:val="28"/>
                 <w:szCs w:val="28"/>
                 <w:bCs w:val="0"/>
+                <w:iCs w:val="0"/>
               </w:rPr>
               <w:t>1.3.4 ระบบแจ้งเตือนผ่านเครือข่าย IoT</w:t>
             </w:r>
@@ -12899,6 +13307,7 @@
                 <w:sz w:val="28"/>
                 <w:szCs w:val="28"/>
                 <w:bCs w:val="0"/>
+                <w:iCs w:val="0"/>
               </w:rPr>
               <w:t>ตารางที่ 4.9</w:t>
             </w:r>
@@ -12922,6 +13331,7 @@
                 <w:sz w:val="28"/>
                 <w:szCs w:val="28"/>
                 <w:bCs w:val="0"/>
+                <w:iCs w:val="0"/>
                 <w:highlight w:val="yellow"/>
               </w:rPr>
               <w:t>[ ]</w:t>
@@ -12946,6 +13356,7 @@
                 <w:sz w:val="28"/>
                 <w:szCs w:val="28"/>
                 <w:bCs w:val="0"/>
+                <w:iCs w:val="0"/>
                 <w:highlight w:val="yellow"/>
               </w:rPr>
               <w:t>[ ]</w:t>
@@ -12974,6 +13385,7 @@
                 <w:sz w:val="28"/>
                 <w:szCs w:val="28"/>
                 <w:bCs w:val="0"/>
+                <w:iCs w:val="0"/>
               </w:rPr>
               <w:t>1.3.5 ประสิทธิภาพของระบบต้นแบบ</w:t>
             </w:r>
@@ -12996,6 +13408,7 @@
                 <w:sz w:val="28"/>
                 <w:szCs w:val="28"/>
                 <w:bCs w:val="0"/>
+                <w:iCs w:val="0"/>
               </w:rPr>
               <w:t>ตารางที่ 4.10</w:t>
             </w:r>
@@ -13018,6 +13431,7 @@
                 <w:sz w:val="28"/>
                 <w:szCs w:val="28"/>
                 <w:bCs w:val="0"/>
+                <w:iCs w:val="0"/>
                 <w:highlight w:val="yellow"/>
               </w:rPr>
               <w:t>[ ]</w:t>
@@ -13041,6 +13455,7 @@
                 <w:sz w:val="28"/>
                 <w:szCs w:val="28"/>
                 <w:bCs w:val="0"/>
+                <w:iCs w:val="0"/>
                 <w:highlight w:val="yellow"/>
               </w:rPr>
               <w:t>[ ]</w:t>
@@ -13068,6 +13483,7 @@
           <w:sz w:val="32"/>
           <w:szCs w:val="32"/>
           <w:bCs w:val="1"/>
+          <w:iCs w:val="0"/>
         </w:rPr>
         <w:t>4.10.2 อภิปราย</w:t>
       </w:r>
@@ -13086,6 +13502,7 @@
           <w:sz w:val="32"/>
           <w:szCs w:val="32"/>
           <w:bCs w:val="0"/>
+          <w:iCs w:val="0"/>
         </w:rPr>
         <w:t xml:space="preserve">(1) การยืนยันตัวตน ต้นแบบใช้รหัสคิวอาร์สุ่มแบบ UUID ใช้ได้ครั้งเดียว มีอายุ 24 ชั่วโมง และตรวจสอบภายใน 3 วินาที ผลในตารางที่ 4.5 </w:t>
       </w:r>
@@ -13097,6 +13514,7 @@
           <w:sz w:val="32"/>
           <w:szCs w:val="32"/>
           <w:bCs w:val="0"/>
+          <w:iCs w:val="0"/>
           <w:highlight w:val="yellow"/>
         </w:rPr>
         <w:t>[ ]</w:t>
@@ -13109,6 +13527,7 @@
           <w:sz w:val="32"/>
           <w:szCs w:val="32"/>
           <w:bCs w:val="0"/>
+          <w:iCs w:val="0"/>
         </w:rPr>
         <w:t xml:space="preserve"> สอดคล้องกับแนวทางของ Tahyuddin และคณะ </w:t>
       </w:r>
@@ -13120,6 +13539,7 @@
           <w:sz w:val="32"/>
           <w:szCs w:val="32"/>
           <w:bCs w:val="0"/>
+          <w:iCs w:val="0"/>
           <w:highlight w:val="yellow"/>
         </w:rPr>
         <w:t>[38]</w:t>
@@ -13132,6 +13552,7 @@
           <w:sz w:val="32"/>
           <w:szCs w:val="32"/>
           <w:bCs w:val="0"/>
+          <w:iCs w:val="0"/>
         </w:rPr>
         <w:t xml:space="preserve"> ที่ใช้ QR Code ในการขออนุญาตเปิดกล่อง แต่ต้นแบบนี้ไม่ต้องเข้าเว็บเบราว์เซอร์ เนื่องจากสร้างรหัสผ่าน LINE LIFF ภายในแอป LINE และใช้การล็อกระดับแถวในฐานข้อมูล </w:t>
       </w:r>
@@ -13143,6 +13564,7 @@
           <w:sz w:val="32"/>
           <w:szCs w:val="32"/>
           <w:bCs w:val="0"/>
+          <w:iCs w:val="0"/>
           <w:highlight w:val="yellow"/>
         </w:rPr>
         <w:t>[29]</w:t>
@@ -13155,6 +13577,7 @@
           <w:sz w:val="32"/>
           <w:szCs w:val="32"/>
           <w:bCs w:val="0"/>
+          <w:iCs w:val="0"/>
         </w:rPr>
         <w:t xml:space="preserve"> ป้องกันการใช้รหัสซ้ำ</w:t>
       </w:r>
@@ -13173,6 +13596,7 @@
           <w:sz w:val="32"/>
           <w:szCs w:val="32"/>
           <w:bCs w:val="0"/>
+          <w:iCs w:val="0"/>
         </w:rPr>
         <w:t xml:space="preserve">(2) ความปลอดภัยของกลอน กลอนเป็นแบบ Fail-Secure </w:t>
       </w:r>
@@ -13184,6 +13608,7 @@
           <w:sz w:val="32"/>
           <w:szCs w:val="32"/>
           <w:bCs w:val="0"/>
+          <w:iCs w:val="0"/>
           <w:highlight w:val="yellow"/>
         </w:rPr>
         <w:t>[24]</w:t>
@@ -13196,6 +13621,7 @@
           <w:sz w:val="32"/>
           <w:szCs w:val="32"/>
           <w:bCs w:val="0"/>
+          <w:iCs w:val="0"/>
         </w:rPr>
         <w:t xml:space="preserve"> คือล็อกเมื่อไม่มีไฟและปลดล็อกเมื่อจ่ายไฟ ผลการวัดแรงดันเกตในตารางที่ 4.2 </w:t>
       </w:r>
@@ -13207,6 +13633,7 @@
           <w:sz w:val="32"/>
           <w:szCs w:val="32"/>
           <w:bCs w:val="0"/>
+          <w:iCs w:val="0"/>
           <w:highlight w:val="yellow"/>
         </w:rPr>
         <w:t>[ ]</w:t>
@@ -13219,6 +13646,7 @@
           <w:sz w:val="32"/>
           <w:szCs w:val="32"/>
           <w:bCs w:val="0"/>
+          <w:iCs w:val="0"/>
         </w:rPr>
         <w:t xml:space="preserve"> ข้อจำกัดที่ทราบคือ หากรางไฟ 3.3 V ขาดขณะที่รางไฟ 12 V ยังมี กลอนจะปลดล็อก (ตารางที่ 3.4)</w:t>
       </w:r>
@@ -13237,6 +13665,7 @@
           <w:sz w:val="32"/>
           <w:szCs w:val="32"/>
           <w:bCs w:val="0"/>
+          <w:iCs w:val="0"/>
         </w:rPr>
         <w:t xml:space="preserve">(3) การตรวจสอบสถานะประตู การเลือก Reed Switch แทนเซนเซอร์อินฟราเรดและอัลตราโซนิกซึ่งขึ้นกับรูปทรงและตำแหน่งของพัสดุ </w:t>
       </w:r>
@@ -13248,6 +13677,7 @@
           <w:sz w:val="32"/>
           <w:szCs w:val="32"/>
           <w:bCs w:val="0"/>
+          <w:iCs w:val="0"/>
           <w:highlight w:val="yellow"/>
         </w:rPr>
         <w:t>[35]</w:t>
@@ -13260,6 +13690,7 @@
           <w:sz w:val="32"/>
           <w:szCs w:val="32"/>
           <w:bCs w:val="0"/>
+          <w:iCs w:val="0"/>
         </w:rPr>
         <w:t xml:space="preserve">, </w:t>
       </w:r>
@@ -13271,6 +13702,7 @@
           <w:sz w:val="32"/>
           <w:szCs w:val="32"/>
           <w:bCs w:val="0"/>
+          <w:iCs w:val="0"/>
           <w:highlight w:val="yellow"/>
         </w:rPr>
         <w:t>[36]</w:t>
@@ -13283,6 +13715,7 @@
           <w:sz w:val="32"/>
           <w:szCs w:val="32"/>
           <w:bCs w:val="0"/>
+          <w:iCs w:val="0"/>
         </w:rPr>
         <w:t xml:space="preserve"> ให้สถานะแบบไบนารีที่ชัดเจน ผลในตารางที่ 4.8 </w:t>
       </w:r>
@@ -13294,6 +13727,7 @@
           <w:sz w:val="32"/>
           <w:szCs w:val="32"/>
           <w:bCs w:val="0"/>
+          <w:iCs w:val="0"/>
           <w:highlight w:val="yellow"/>
         </w:rPr>
         <w:t>[ ]</w:t>
@@ -13306,6 +13740,7 @@
           <w:sz w:val="32"/>
           <w:szCs w:val="32"/>
           <w:bCs w:val="0"/>
+          <w:iCs w:val="0"/>
         </w:rPr>
         <w:t xml:space="preserve"> อย่างไรก็ตามระบบยังยืนยันจำนวนหรือการมีอยู่ของพัสดุไม่ได้ (หัวข้อ 2.7) และเมื่อไม่มีโช้คอัพประตู ผลการทดสอบขึ้นกับการปิดประตูด้วยมือของผู้ใช้</w:t>
       </w:r>
@@ -13324,6 +13759,7 @@
           <w:sz w:val="32"/>
           <w:szCs w:val="32"/>
           <w:bCs w:val="0"/>
+          <w:iCs w:val="0"/>
         </w:rPr>
         <w:t xml:space="preserve">(4) การบันทึกภาพและการแจ้งเตือน ผลในตารางที่ 4.6 และ 4.9 </w:t>
       </w:r>
@@ -13335,6 +13771,7 @@
           <w:sz w:val="32"/>
           <w:szCs w:val="32"/>
           <w:bCs w:val="0"/>
+          <w:iCs w:val="0"/>
           <w:highlight w:val="yellow"/>
         </w:rPr>
         <w:t>[ ]</w:t>
@@ -13347,6 +13784,7 @@
           <w:sz w:val="32"/>
           <w:szCs w:val="32"/>
           <w:bCs w:val="0"/>
+          <w:iCs w:val="0"/>
         </w:rPr>
         <w:t xml:space="preserve"> เมื่อเทียบกับงานที่ใช้ LINE Notify ซึ่งสิ้นสุดการให้บริการแล้ว </w:t>
       </w:r>
@@ -13358,6 +13796,7 @@
           <w:sz w:val="32"/>
           <w:szCs w:val="32"/>
           <w:bCs w:val="0"/>
+          <w:iCs w:val="0"/>
           <w:highlight w:val="yellow"/>
         </w:rPr>
         <w:t>[40]</w:t>
@@ -13370,6 +13809,7 @@
           <w:sz w:val="32"/>
           <w:szCs w:val="32"/>
           <w:bCs w:val="0"/>
+          <w:iCs w:val="0"/>
         </w:rPr>
         <w:t xml:space="preserve">, </w:t>
       </w:r>
@@ -13381,6 +13821,7 @@
           <w:sz w:val="32"/>
           <w:szCs w:val="32"/>
           <w:bCs w:val="0"/>
+          <w:iCs w:val="0"/>
           <w:highlight w:val="yellow"/>
         </w:rPr>
         <w:t>[41]</w:t>
@@ -13393,6 +13834,7 @@
           <w:sz w:val="32"/>
           <w:szCs w:val="32"/>
           <w:bCs w:val="0"/>
+          <w:iCs w:val="0"/>
         </w:rPr>
         <w:t xml:space="preserve"> ต้นแบบนี้ใช้ LINE Messaging API </w:t>
       </w:r>
@@ -13404,6 +13846,7 @@
           <w:sz w:val="32"/>
           <w:szCs w:val="32"/>
           <w:bCs w:val="0"/>
+          <w:iCs w:val="0"/>
           <w:highlight w:val="yellow"/>
         </w:rPr>
         <w:t>[30]</w:t>
@@ -13416,6 +13859,7 @@
           <w:sz w:val="32"/>
           <w:szCs w:val="32"/>
           <w:bCs w:val="0"/>
+          <w:iCs w:val="0"/>
         </w:rPr>
         <w:t xml:space="preserve"> ผ่านเซิร์ฟเวอร์ FastAPI </w:t>
       </w:r>
@@ -13427,6 +13871,7 @@
           <w:sz w:val="32"/>
           <w:szCs w:val="32"/>
           <w:bCs w:val="0"/>
+          <w:iCs w:val="0"/>
           <w:highlight w:val="yellow"/>
         </w:rPr>
         <w:t>[27]</w:t>
@@ -13439,6 +13884,7 @@
           <w:sz w:val="32"/>
           <w:szCs w:val="32"/>
           <w:bCs w:val="0"/>
+          <w:iCs w:val="0"/>
         </w:rPr>
         <w:t xml:space="preserve"> ที่เปิดให้เข้าถึงด้วย Tailscale Funnel </w:t>
       </w:r>
@@ -13450,6 +13896,7 @@
           <w:sz w:val="32"/>
           <w:szCs w:val="32"/>
           <w:bCs w:val="0"/>
+          <w:iCs w:val="0"/>
           <w:highlight w:val="yellow"/>
         </w:rPr>
         <w:t>[26]</w:t>
@@ -13462,6 +13909,7 @@
           <w:sz w:val="32"/>
           <w:szCs w:val="32"/>
           <w:bCs w:val="0"/>
+          <w:iCs w:val="0"/>
         </w:rPr>
         <w:t xml:space="preserve"> ส่งทั้งข้อความและภาพ และต่างจากงานของ Cacapit และคณะ </w:t>
       </w:r>
@@ -13473,6 +13921,7 @@
           <w:sz w:val="32"/>
           <w:szCs w:val="32"/>
           <w:bCs w:val="0"/>
+          <w:iCs w:val="0"/>
           <w:highlight w:val="yellow"/>
         </w:rPr>
         <w:t>[39]</w:t>
@@ -13485,6 +13934,7 @@
           <w:sz w:val="32"/>
           <w:szCs w:val="32"/>
           <w:bCs w:val="0"/>
+          <w:iCs w:val="0"/>
         </w:rPr>
         <w:t xml:space="preserve"> ที่ใช้รหัส OTP ปลดล็อกและบันทึกภาพ แต่ไม่มีระบบเตือนการเข้าถึงโดยไม่ได้รับอนุญาต ในขณะที่ต้นแบบนี้แจ้งเตือนทั้งกรณีประตูเปิดค้างและประตูถูกเปิดขณะล็อก (กรณีหลังเป็นความสามารถของระบบ ไม่ได้อยู่ในแผนการทดสอบของบทนี้)</w:t>
       </w:r>
@@ -13503,6 +13953,7 @@
           <w:sz w:val="32"/>
           <w:szCs w:val="32"/>
           <w:bCs w:val="0"/>
+          <w:iCs w:val="0"/>
         </w:rPr>
         <w:t xml:space="preserve">(5) ความเสถียรโดยรวม ผลในตารางที่ 4.10 </w:t>
       </w:r>
@@ -13514,6 +13965,7 @@
           <w:sz w:val="32"/>
           <w:szCs w:val="32"/>
           <w:bCs w:val="0"/>
+          <w:iCs w:val="0"/>
           <w:highlight w:val="yellow"/>
         </w:rPr>
         <w:t>[ ]</w:t>
@@ -13526,6 +13978,7 @@
           <w:sz w:val="32"/>
           <w:szCs w:val="32"/>
           <w:bCs w:val="0"/>
+          <w:iCs w:val="0"/>
         </w:rPr>
         <w:t xml:space="preserve"> สอดคล้องกับการออกแบบที่แยกการปลดล็อกด้วยปุ่มไม่ให้ขึ้นกับเครือข่าย ผู้ใช้จึงปลดล็อกได้แม้ Wi-Fi หลุด</w:t>
       </w:r>
@@ -13544,6 +13997,7 @@
           <w:sz w:val="32"/>
           <w:szCs w:val="32"/>
           <w:bCs w:val="1"/>
+          <w:iCs w:val="0"/>
         </w:rPr>
         <w:t>4.10.3 ข้อจำกัดของระบบ</w:t>
       </w:r>
@@ -13562,6 +14016,7 @@
           <w:sz w:val="32"/>
           <w:szCs w:val="32"/>
           <w:bCs w:val="0"/>
+          <w:iCs w:val="0"/>
         </w:rPr>
         <w:t>(1) ระบบตรวจสอบได้เพียงสถานะเปิด-ปิดของประตู ไม่สามารถยืนยันจำนวนพัสดุได้</w:t>
       </w:r>
@@ -13580,6 +14035,7 @@
           <w:sz w:val="32"/>
           <w:szCs w:val="32"/>
           <w:bCs w:val="0"/>
+          <w:iCs w:val="0"/>
         </w:rPr>
         <w:t>(2) ต้นแบบไม่ได้ติดตั้งโช้คอัพประตู ผู้ใช้ต้องปิดประตูด้วยมือจนสนิท หากปิดไม่สนิทกลอนจะไม่ล็อกและระบบจะแจ้งเตือนเมื่อประตูเปิดค้างเกิน 60 วินาที</w:t>
       </w:r>
@@ -13598,6 +14054,7 @@
           <w:sz w:val="32"/>
           <w:szCs w:val="32"/>
           <w:bCs w:val="0"/>
+          <w:iCs w:val="0"/>
         </w:rPr>
         <w:t>(3) วงจรขับกลอนแบบสองภาคทำให้กลอนปลดล็อกได้หากรางไฟ 3.3 V ขาดขณะที่รางไฟ 12 V ยังมี (ตารางที่ 3.4)</w:t>
       </w:r>
@@ -13616,6 +14073,7 @@
           <w:sz w:val="32"/>
           <w:szCs w:val="32"/>
           <w:bCs w:val="0"/>
+          <w:iCs w:val="0"/>
         </w:rPr>
         <w:t>(4) การตรวจสอบรหัสและการแจ้งเตือนพึ่งพาเครือข่าย Wi-Fi และบริการภายนอก ได้แก่ LINE Messaging API และ Tailscale Funnel</w:t>
       </w:r>
@@ -13634,6 +14092,7 @@
           <w:sz w:val="32"/>
           <w:szCs w:val="32"/>
           <w:bCs w:val="0"/>
+          <w:iCs w:val="0"/>
         </w:rPr>
         <w:t>(5) ผลการทดสอบมีจำนวนครั้งจำกัด (15 ครั้งต่อหัวข้อ) และทดสอบบนชิ้นงานต้นแบบ</w:t>
       </w:r>

</xml_diff>

<commit_message>
Chapter 4 final: add software section, installation photos, test procedures; renumber
Co-Authored-By: Claude Sonnet 5.5 <noreply@anthropic.com>
Claude-Session: https://claude.ai/code/session_01VnBozHXF9mmTyHiTgVtwAM
</commit_message>
<xml_diff>
--- a/บทที่4_ไฟนอล_เฉพาะบท.docx
+++ b/บทที่4_ไฟนอล_เฉพาะบท.docx
@@ -88,7 +88,7 @@
           <w:bCs w:val="0"/>
           <w:iCs w:val="0"/>
         </w:rPr>
-        <w:t>ในบทนี้นำเสนอผลการสร้างและทดสอบต้นแบบกล่องรับพัสดุไอโอทีอัจฉริยะตามที่ออกแบบไว้ในบทที่ 3 โดยแบ่งเป็น 3 ส่วน ได้แก่ (1) ผลการสร้างต้นแบบ ประกอบด้วยโครงสร้างกล่องและวงจรควบคุมก่อนติดตั้ง (หัวข้อ 4.1 และ 4.2) (2) ผลการตรวจวัดแรงดันไฟเลี้ยงและวงจรขับกลอน (หัวข้อ 4.3) และ (3) ผลการทดสอบสมรรถนะของระบบ 5 ด้าน ได้แก่ การยืนยันตัวตนและการปลดล็อก การบันทึกภาพหลักฐาน การตรวจสอบสถานะประตู การแจ้งเตือน และการทำงานโดยรวม (หัวข้อ 4.4–4.9) จากนั้นอภิปรายผลเทียบกับวัตถุประสงค์และงานวิจัยที่เกี่ยวข้อง (หัวข้อ 4.10)</w:t>
+        <w:t>ในบทนี้นำเสนอผลการสร้างและทดสอบต้นแบบกล่องรับพัสดุไอโอทีอัจฉริยะตามที่ออกแบบไว้ในบทที่ 3 โดยแบ่งเป็น 3 ส่วน ได้แก่ (1) ผลการสร้างต้นแบบ ประกอบด้วยโครงสร้างกล่อง การติดตั้งอุปกรณ์ วงจรควบคุมก่อนติดตั้ง และระบบซอฟต์แวร์ที่ผู้ใช้งานมองเห็น (หัวข้อ 4.1–4.3) (2) ผลการตรวจวัดแรงดันไฟเลี้ยงและวงจรขับกลอน (หัวข้อ 4.4) และ (3) ผลการทดสอบสมรรถนะของระบบ 5 ด้าน ได้แก่ การยืนยันตัวตนและการปลดล็อก การบันทึกภาพหลักฐาน การตรวจสอบสถานะประตู การแจ้งเตือน และการทำงานโดยรวม (หัวข้อ 4.5–4.10) จากนั้นอภิปรายผลเทียบกับวัตถุประสงค์และงานวิจัยที่เกี่ยวข้อง (หัวข้อ 4.11)</w:t>
       </w:r>
     </w:p>
     <w:p>
@@ -245,7 +245,7 @@
           <w:bCs w:val="0"/>
           <w:iCs w:val="0"/>
         </w:rPr>
-        <w:t>การติดตั้งอุปกรณ์แบ่งเป็น 2 พื้นที่ตามที่ออกแบบไว้ในหัวข้อ 3.3.6 ดังตารางที่ 4.1</w:t>
+        <w:t>การติดตั้งอุปกรณ์แบ่งเป็น 2 พื้นที่ตามที่ออกแบบไว้ในหัวข้อ 3.3.6 ดังตารางที่ 4.1 โดยอุปกรณ์ภายนอกตู้แสดงในภาพประกอบที่ 4.2 และอุปกรณ์ภายในตู้แสดงในภาพประกอบที่ 4.3</w:t>
       </w:r>
     </w:p>
     <w:p>
@@ -985,6 +985,86 @@
     </w:p>
     <w:p>
       <w:pPr>
+        <w:keepNext/>
+        <w:spacing w:after="80"/>
+        <w:ind w:firstLine="0"/>
+        <w:jc w:val="center"/>
+      </w:pPr>
+      <w:r>
+        <w:rPr>
+          <w:rFonts w:ascii="TH SarabunPSK" w:hAnsi="TH SarabunPSK" w:cs="TH SarabunPSK" w:eastAsia="TH SarabunPSK"/>
+          <w:b w:val="0"/>
+          <w:i w:val="0"/>
+          <w:sz w:val="32"/>
+          <w:szCs w:val="32"/>
+          <w:bCs w:val="0"/>
+          <w:iCs w:val="0"/>
+          <w:highlight w:val="yellow"/>
+        </w:rPr>
+        <w:t>[แทรกภาพถ่ายการติดตั้งอุปกรณ์ภายนอกตู้ พร้อมระบุตำแหน่งอุปกรณ์]</w:t>
+      </w:r>
+    </w:p>
+    <w:p>
+      <w:pPr>
+        <w:spacing w:after="160"/>
+        <w:ind w:firstLine="0"/>
+        <w:jc w:val="center"/>
+      </w:pPr>
+      <w:r>
+        <w:rPr>
+          <w:rFonts w:ascii="TH SarabunPSK" w:hAnsi="TH SarabunPSK" w:cs="TH SarabunPSK" w:eastAsia="TH SarabunPSK"/>
+          <w:b w:val="0"/>
+          <w:i w:val="0"/>
+          <w:sz w:val="32"/>
+          <w:szCs w:val="32"/>
+          <w:bCs w:val="0"/>
+          <w:iCs w:val="0"/>
+        </w:rPr>
+        <w:t>ภาพประกอบที่ 4.2 การติดตั้งอุปกรณ์ภายนอกตู้ (GM66, กลอนแม่เหล็กไฟฟ้า, กล่องควบคุม, ปุ่มกดปลดล็อกและบัซเซอร์)</w:t>
+      </w:r>
+    </w:p>
+    <w:p>
+      <w:pPr>
+        <w:keepNext/>
+        <w:spacing w:after="80"/>
+        <w:ind w:firstLine="0"/>
+        <w:jc w:val="center"/>
+      </w:pPr>
+      <w:r>
+        <w:rPr>
+          <w:rFonts w:ascii="TH SarabunPSK" w:hAnsi="TH SarabunPSK" w:cs="TH SarabunPSK" w:eastAsia="TH SarabunPSK"/>
+          <w:b w:val="0"/>
+          <w:i w:val="0"/>
+          <w:sz w:val="32"/>
+          <w:szCs w:val="32"/>
+          <w:bCs w:val="0"/>
+          <w:iCs w:val="0"/>
+          <w:highlight w:val="yellow"/>
+        </w:rPr>
+        <w:t>[แทรกภาพถ่ายการติดตั้งอุปกรณ์ภายในตู้ พร้อมระบุตำแหน่งอุปกรณ์]</w:t>
+      </w:r>
+    </w:p>
+    <w:p>
+      <w:pPr>
+        <w:spacing w:after="160"/>
+        <w:ind w:firstLine="0"/>
+        <w:jc w:val="center"/>
+      </w:pPr>
+      <w:r>
+        <w:rPr>
+          <w:rFonts w:ascii="TH SarabunPSK" w:hAnsi="TH SarabunPSK" w:cs="TH SarabunPSK" w:eastAsia="TH SarabunPSK"/>
+          <w:b w:val="0"/>
+          <w:i w:val="0"/>
+          <w:sz w:val="32"/>
+          <w:szCs w:val="32"/>
+          <w:bCs w:val="0"/>
+          <w:iCs w:val="0"/>
+        </w:rPr>
+        <w:t>ภาพประกอบที่ 4.3 การติดตั้งอุปกรณ์ภายในตู้ (ESP32-CAM และ Reed Switch MC-38)</w:t>
+      </w:r>
+    </w:p>
+    <w:p>
+      <w:pPr>
         <w:spacing w:after="120" w:before="0" w:line="240" w:lineRule="auto"/>
         <w:ind w:left="0" w:firstLine="850"/>
         <w:jc w:val="both"/>
@@ -999,7 +1079,7 @@
           <w:bCs w:val="0"/>
           <w:iCs w:val="0"/>
         </w:rPr>
-        <w:t>จากตารางที่ 4.1 บอร์ดควบคุมหลักถูกแยกไว้ในกล่องพลาสติกด้านนอกตู้ เนื่องจากแผ่นอลูมิเนียมคอมโพสิตลดทอนสัญญาณ Wi-Fi ส่วนบอร์ด ESP32-CAM อยู่ภายในตู้โลหะ จึงต้องติดตามผลกระทบต่อการส่งภาพในหัวข้อ 4.6</w:t>
+        <w:t>จากตารางที่ 4.1 บอร์ดควบคุมหลักถูกแยกไว้ในกล่องพลาสติกด้านนอกตู้ เนื่องจากแผ่นอลูมิเนียมคอมโพสิตลดทอนสัญญาณ Wi-Fi ส่วนบอร์ด ESP32-CAM อยู่ภายในตู้โลหะ จึงต้องติดตามผลกระทบต่อการส่งภาพในหัวข้อ 4.7</w:t>
       </w:r>
     </w:p>
     <w:p>
@@ -1038,7 +1118,7 @@
           <w:bCs w:val="0"/>
           <w:iCs w:val="0"/>
         </w:rPr>
-        <w:t>ก่อนติดตั้งเข้าตู้ คณะผู้จัดทำประกอบวงจรทั้งหมดไว้ในกล่องพลาสติกกันน้ำตามแผนผังวงจรในภาพประกอบที่ 3.4 และตรวจสอบนอกตู้ด้วยมัลติมิเตอร์ ดังภาพประกอบที่ 4.2 ตามขั้นตอนในหัวข้อ 3.3.4 คือ (1) ปรับเอาต์พุตของ XL4015E1 ให้ได้ 5.0 V ก่อนต่อโหลด (2) ต่อกราวด์ร่วมของทุกอุปกรณ์ (3) ต่อสายตามการกำหนดขา GPIO ในตารางที่ 3.8 และ (4) ตรวจสอบแรงดันของแต่ละรางไฟก่อนจ่ายไฟให้บอร์ด</w:t>
+        <w:t>ก่อนติดตั้งเข้าตู้ คณะผู้จัดทำประกอบวงจรทั้งหมดไว้ในกล่องพลาสติกกันน้ำตามแผนผังวงจรในภาพประกอบที่ 3.4 และตรวจสอบนอกตู้ด้วยมัลติมิเตอร์ ดังภาพประกอบที่ 4.4 ตามขั้นตอนในหัวข้อ 3.3.4 คือ (1) ปรับเอาต์พุตของ XL4015E1 ให้ได้ 5.0 V ก่อนต่อโหลด (2) ต่อกราวด์ร่วมของทุกอุปกรณ์ (3) ต่อสายตามการกำหนดขา GPIO ในตารางที่ 3.8 และ (4) ตรวจสอบแรงดันของแต่ละรางไฟก่อนจ่ายไฟให้บอร์ด</w:t>
       </w:r>
     </w:p>
     <w:p>
@@ -1099,7 +1179,7 @@
           <w:bCs w:val="0"/>
           <w:iCs w:val="0"/>
         </w:rPr>
-        <w:t>ภาพประกอบที่ 4.2 ภาพรวมวงจรควบคุมก่อนติดตั้งเข้าตู้</w:t>
+        <w:t>ภาพประกอบที่ 4.4 ภาพรวมวงจรควบคุมก่อนติดตั้งเข้าตู้</w:t>
       </w:r>
     </w:p>
     <w:p>
@@ -1118,7 +1198,7 @@
           <w:bCs w:val="0"/>
           <w:iCs w:val="0"/>
         </w:rPr>
-        <w:t>การทดสอบวงจรนอกตู้ก่อนช่วยแยกปัญหาของวงจรออกจากปัญหาของโครงสร้างและการเดินสายภายในตู้ ผลการตรวจวัดแสดงในหัวข้อ 4.3</w:t>
+        <w:t>การทดสอบวงจรนอกตู้ก่อนช่วยแยกปัญหาของวงจรออกจากปัญหาของโครงสร้างและการเดินสายภายในตู้ ผลการตรวจวัดแสดงในหัวข้อ 4.4</w:t>
       </w:r>
     </w:p>
     <w:p>
@@ -1138,7 +1218,7 @@
           <w:bCs w:val="1"/>
           <w:iCs w:val="0"/>
         </w:rPr>
-        <w:t>4.3 ผลการตรวจวัดแรงดันไฟเลี้ยงและวงจรขับกลอน</w:t>
+        <w:t>4.3 ผลการพัฒนาระบบซอฟต์แวร์</w:t>
       </w:r>
     </w:p>
     <w:p>
@@ -1157,7 +1237,310 @@
           <w:bCs w:val="0"/>
           <w:iCs w:val="0"/>
         </w:rPr>
-        <w:t>บทที่ 3 กำหนดให้ตรวจสอบค่าที่ได้จากการคำนวณออกแบบกับค่าที่วัดได้จริงในบทที่ 4 (หัวข้อ 3.2.1–3.2.3) คณะผู้จัดทำจึงวัดแรงดันและกระแสด้วยมัลติมิเตอร์ ผลแสดงดังตารางที่ 4.2</w:t>
+        <w:t>ระบบซอฟต์แวร์ของต้นแบบประกอบด้วยเฟิร์มแวร์ของ ESP32 และ ESP32-CAM แอปพลิเคชันฝั่งเซิร์ฟเวอร์ที่พัฒนาด้วย FastAPI ร่วมกับฐานข้อมูล MariaDB และส่วนติดต่อผู้ใช้ ตามสถาปัตยกรรมในหัวข้อ 3.3.1–3.3.3 ในหัวข้อนี้แสดงผลของส่วนติดต่อผู้ใช้ที่ผู้ใช้งานและผู้ดูแลระบบมองเห็นจริง 3 ส่วน ได้แก่ หน้า LINE LIFF แดชบอร์ด และข้อความแจ้งเตือนผ่าน LINE</w:t>
+      </w:r>
+    </w:p>
+    <w:p>
+      <w:pPr>
+        <w:keepNext/>
+        <w:spacing w:before="120" w:after="80"/>
+        <w:ind w:left="567"/>
+      </w:pPr>
+      <w:r>
+        <w:rPr>
+          <w:rFonts w:ascii="TH SarabunPSK" w:hAnsi="TH SarabunPSK" w:cs="TH SarabunPSK" w:eastAsia="TH SarabunPSK"/>
+          <w:b/>
+          <w:i w:val="0"/>
+          <w:sz w:val="32"/>
+          <w:szCs w:val="32"/>
+          <w:bCs w:val="1"/>
+          <w:iCs w:val="0"/>
+        </w:rPr>
+        <w:t>4.3.1 หน้า LINE LIFF สำหรับสร้างรหัสคิวอาร์</w:t>
+      </w:r>
+    </w:p>
+    <w:p>
+      <w:pPr>
+        <w:spacing w:after="120" w:before="0" w:line="240" w:lineRule="auto"/>
+        <w:ind w:left="0" w:firstLine="850"/>
+        <w:jc w:val="both"/>
+      </w:pPr>
+      <w:r>
+        <w:rPr>
+          <w:rFonts w:ascii="TH SarabunPSK" w:hAnsi="TH SarabunPSK" w:cs="TH SarabunPSK" w:eastAsia="TH SarabunPSK"/>
+          <w:b w:val="0"/>
+          <w:i w:val="0"/>
+          <w:sz w:val="32"/>
+          <w:szCs w:val="32"/>
+          <w:bCs w:val="0"/>
+          <w:iCs w:val="0"/>
+        </w:rPr>
+        <w:t xml:space="preserve">ผู้ใช้งานเปิดหน้า LINE LIFF ภายในแอป LINE ระบบตรวจสอบตัวตนด้วย ID Token ของ LINE ตามหัวข้อ 3.3.2 จากนั้นผู้ใช้สร้างรหัสคิวอาร์ซึ่งเป็นรหัส UUID แบบสุ่ม มีอายุ 24 ชั่วโมง และใช้ได้ครั้งเดียว ผู้ส่งพัสดุนำรหัสที่แสดงบนหน้าจอมาสแกนที่โมดูล GM66 ที่ตัวกล่อง ดังภาพประกอบที่ 4.5 </w:t>
+      </w:r>
+      <w:r>
+        <w:rPr>
+          <w:rFonts w:ascii="TH SarabunPSK" w:hAnsi="TH SarabunPSK" w:cs="TH SarabunPSK" w:eastAsia="TH SarabunPSK"/>
+          <w:b w:val="0"/>
+          <w:i w:val="0"/>
+          <w:sz w:val="32"/>
+          <w:szCs w:val="32"/>
+          <w:bCs w:val="0"/>
+          <w:iCs w:val="0"/>
+          <w:highlight w:val="yellow"/>
+        </w:rPr>
+        <w:t>[อธิบายองค์ประกอบของหน้าจอตามภาพจริง เช่น ปุ่มสร้างรหัส รหัสคิวอาร์ และเวลาหมดอายุ]</w:t>
+      </w:r>
+    </w:p>
+    <w:p>
+      <w:pPr>
+        <w:keepNext/>
+        <w:spacing w:after="80"/>
+        <w:ind w:firstLine="0"/>
+        <w:jc w:val="center"/>
+      </w:pPr>
+      <w:r>
+        <w:rPr>
+          <w:rFonts w:ascii="TH SarabunPSK" w:hAnsi="TH SarabunPSK" w:cs="TH SarabunPSK" w:eastAsia="TH SarabunPSK"/>
+          <w:b w:val="0"/>
+          <w:i w:val="0"/>
+          <w:sz w:val="32"/>
+          <w:szCs w:val="32"/>
+          <w:bCs w:val="0"/>
+          <w:iCs w:val="0"/>
+          <w:highlight w:val="yellow"/>
+        </w:rPr>
+        <w:t>[แทรกภาพหน้าจอโทรศัพท์ที่แสดงหน้า LINE LIFF และรหัสคิวอาร์]</w:t>
+      </w:r>
+    </w:p>
+    <w:p>
+      <w:pPr>
+        <w:spacing w:after="160"/>
+        <w:ind w:firstLine="0"/>
+        <w:jc w:val="center"/>
+      </w:pPr>
+      <w:r>
+        <w:rPr>
+          <w:rFonts w:ascii="TH SarabunPSK" w:hAnsi="TH SarabunPSK" w:cs="TH SarabunPSK" w:eastAsia="TH SarabunPSK"/>
+          <w:b w:val="0"/>
+          <w:i w:val="0"/>
+          <w:sz w:val="32"/>
+          <w:szCs w:val="32"/>
+          <w:bCs w:val="0"/>
+          <w:iCs w:val="0"/>
+        </w:rPr>
+        <w:t>ภาพประกอบที่ 4.5 หน้า LINE LIFF สำหรับสร้างรหัสคิวอาร์</w:t>
+      </w:r>
+    </w:p>
+    <w:p>
+      <w:pPr>
+        <w:keepNext/>
+        <w:spacing w:before="120" w:after="80"/>
+        <w:ind w:left="567"/>
+      </w:pPr>
+      <w:r>
+        <w:rPr>
+          <w:rFonts w:ascii="TH SarabunPSK" w:hAnsi="TH SarabunPSK" w:cs="TH SarabunPSK" w:eastAsia="TH SarabunPSK"/>
+          <w:b/>
+          <w:i w:val="0"/>
+          <w:sz w:val="32"/>
+          <w:szCs w:val="32"/>
+          <w:bCs w:val="1"/>
+          <w:iCs w:val="0"/>
+        </w:rPr>
+        <w:t>4.3.2 แดชบอร์ดแสดงสถานะและประวัติเหตุการณ์</w:t>
+      </w:r>
+    </w:p>
+    <w:p>
+      <w:pPr>
+        <w:spacing w:after="120" w:before="0" w:line="240" w:lineRule="auto"/>
+        <w:ind w:left="0" w:firstLine="850"/>
+        <w:jc w:val="both"/>
+      </w:pPr>
+      <w:r>
+        <w:rPr>
+          <w:rFonts w:ascii="TH SarabunPSK" w:hAnsi="TH SarabunPSK" w:cs="TH SarabunPSK" w:eastAsia="TH SarabunPSK"/>
+          <w:b w:val="0"/>
+          <w:i w:val="0"/>
+          <w:sz w:val="32"/>
+          <w:szCs w:val="32"/>
+          <w:bCs w:val="0"/>
+          <w:iCs w:val="0"/>
+        </w:rPr>
+        <w:t xml:space="preserve">แดชบอร์ดเป็นหน้าเว็บสำหรับผู้ดูแลระบบ ติดต่อกับเซิร์ฟเวอร์ผ่านโปรโตคอล WebSocket เพื่อแสดงเหตุการณ์แบบเวลาจริงโดยไม่ต้องรีเฟรชหน้า ดังภาพประกอบที่ 4.6 ประกอบด้วย 4 ส่วน คือ (1) LIVE FEED แสดงเหตุการณ์ที่เกิดขึ้นใหม่ เช่น สถานะอุปกรณ์ การตรวจสอบรหัส การเปิดประตู การล็อก และการถ่ายภาพ (2) DEVICE STATUS แสดงสถานะออนไลน์และสถานะประตูของอุปกรณ์ ซึ่งอัปเดตจากสัญญาณรายงานสถานะ (Heartbeat) ทุก 30 วินาที (3) UNLOCK CONTROL สำหรับสั่งปลดล็อกจากหน้าเว็บ </w:t>
+      </w:r>
+      <w:r>
+        <w:rPr>
+          <w:rFonts w:ascii="TH SarabunPSK" w:hAnsi="TH SarabunPSK" w:cs="TH SarabunPSK" w:eastAsia="TH SarabunPSK"/>
+          <w:b w:val="0"/>
+          <w:i w:val="0"/>
+          <w:sz w:val="32"/>
+          <w:szCs w:val="32"/>
+          <w:bCs w:val="0"/>
+          <w:iCs w:val="0"/>
+          <w:highlight w:val="yellow"/>
+        </w:rPr>
+        <w:t>[ยืนยันว่าเป็นฟังก์ชันที่ใช้ในการทดสอบ]</w:t>
+      </w:r>
+      <w:r>
+        <w:rPr>
+          <w:rFonts w:ascii="TH SarabunPSK" w:hAnsi="TH SarabunPSK" w:cs="TH SarabunPSK" w:eastAsia="TH SarabunPSK"/>
+          <w:b w:val="0"/>
+          <w:i w:val="0"/>
+          <w:sz w:val="32"/>
+          <w:szCs w:val="32"/>
+          <w:bCs w:val="0"/>
+          <w:iCs w:val="0"/>
+        </w:rPr>
+        <w:t xml:space="preserve"> และ (4) ACCESS LOG แสดงประวัติเหตุการณ์ทั้งหมด ได้แก่ เวลา อุปกรณ์ ชนิดเหตุการณ์ ผล (granted, denied, error) และหมายเหตุ ซึ่งคณะผู้จัดทำใช้ข้อมูลส่วนนี้ในการคำนวณระยะเวลาในการทดสอบ</w:t>
+      </w:r>
+    </w:p>
+    <w:p>
+      <w:pPr>
+        <w:keepNext/>
+        <w:spacing w:after="80"/>
+        <w:ind w:firstLine="0"/>
+        <w:jc w:val="center"/>
+      </w:pPr>
+      <w:r>
+        <w:drawing>
+          <wp:inline xmlns:a="http://schemas.openxmlformats.org/drawingml/2006/main" xmlns:pic="http://schemas.openxmlformats.org/drawingml/2006/picture">
+            <wp:extent cx="5400000" cy="2649600"/>
+            <wp:docPr id="2090114743" name="Picture 2090114743"/>
+            <wp:cNvGraphicFramePr>
+              <a:graphicFrameLocks noChangeAspect="1"/>
+            </wp:cNvGraphicFramePr>
+            <a:graphic>
+              <a:graphicData uri="http://schemas.openxmlformats.org/drawingml/2006/picture">
+                <pic:pic>
+                  <pic:nvPicPr>
+                    <pic:cNvPr id="0" name="dash.jpg"/>
+                    <pic:cNvPicPr/>
+                  </pic:nvPicPr>
+                  <pic:blipFill>
+                    <a:blip r:embed="rId73"/>
+                    <a:stretch>
+                      <a:fillRect/>
+                    </a:stretch>
+                  </pic:blipFill>
+                  <pic:spPr>
+                    <a:xfrm>
+                      <a:off x="0" y="0"/>
+                      <a:ext cx="5400000" cy="2649600"/>
+                    </a:xfrm>
+                    <a:prstGeom prst="rect"/>
+                  </pic:spPr>
+                </pic:pic>
+              </a:graphicData>
+            </a:graphic>
+          </wp:inline>
+        </w:drawing>
+      </w:r>
+    </w:p>
+    <w:p>
+      <w:pPr>
+        <w:spacing w:after="160"/>
+        <w:ind w:firstLine="0"/>
+        <w:jc w:val="center"/>
+      </w:pPr>
+      <w:r>
+        <w:rPr>
+          <w:rFonts w:ascii="TH SarabunPSK" w:hAnsi="TH SarabunPSK" w:cs="TH SarabunPSK" w:eastAsia="TH SarabunPSK"/>
+          <w:b w:val="0"/>
+          <w:i w:val="0"/>
+          <w:sz w:val="32"/>
+          <w:szCs w:val="32"/>
+          <w:bCs w:val="0"/>
+          <w:iCs w:val="0"/>
+        </w:rPr>
+        <w:t>ภาพประกอบที่ 4.6 หน้าแดชบอร์ดแสดงสถานะและประวัติเหตุการณ์ของระบบ</w:t>
+      </w:r>
+    </w:p>
+    <w:p>
+      <w:pPr>
+        <w:keepNext/>
+        <w:spacing w:before="120" w:after="80"/>
+        <w:ind w:left="567"/>
+      </w:pPr>
+      <w:r>
+        <w:rPr>
+          <w:rFonts w:ascii="TH SarabunPSK" w:hAnsi="TH SarabunPSK" w:cs="TH SarabunPSK" w:eastAsia="TH SarabunPSK"/>
+          <w:b/>
+          <w:i w:val="0"/>
+          <w:sz w:val="32"/>
+          <w:szCs w:val="32"/>
+          <w:bCs w:val="1"/>
+          <w:iCs w:val="0"/>
+        </w:rPr>
+        <w:t>4.3.3 ข้อความแจ้งเตือนผ่าน LINE</w:t>
+      </w:r>
+    </w:p>
+    <w:p>
+      <w:pPr>
+        <w:spacing w:after="120" w:before="0" w:line="240" w:lineRule="auto"/>
+        <w:ind w:left="0" w:firstLine="850"/>
+        <w:jc w:val="both"/>
+      </w:pPr>
+      <w:r>
+        <w:rPr>
+          <w:rFonts w:ascii="TH SarabunPSK" w:hAnsi="TH SarabunPSK" w:cs="TH SarabunPSK" w:eastAsia="TH SarabunPSK"/>
+          <w:b w:val="0"/>
+          <w:i w:val="0"/>
+          <w:sz w:val="32"/>
+          <w:szCs w:val="32"/>
+          <w:bCs w:val="0"/>
+          <w:iCs w:val="0"/>
+        </w:rPr>
+        <w:t xml:space="preserve">เซิร์ฟเวอร์ส่งข้อความแจ้งเตือนไปยังผู้ใช้ผ่าน LINE Messaging API </w:t>
+      </w:r>
+      <w:r>
+        <w:rPr>
+          <w:rFonts w:ascii="TH SarabunPSK" w:hAnsi="TH SarabunPSK" w:cs="TH SarabunPSK" w:eastAsia="TH SarabunPSK"/>
+          <w:b w:val="0"/>
+          <w:i w:val="0"/>
+          <w:sz w:val="32"/>
+          <w:szCs w:val="32"/>
+          <w:bCs w:val="0"/>
+          <w:iCs w:val="0"/>
+          <w:highlight w:val="yellow"/>
+        </w:rPr>
+        <w:t>[30]</w:t>
+      </w:r>
+      <w:r>
+        <w:rPr>
+          <w:rFonts w:ascii="TH SarabunPSK" w:hAnsi="TH SarabunPSK" w:cs="TH SarabunPSK" w:eastAsia="TH SarabunPSK"/>
+          <w:b w:val="0"/>
+          <w:i w:val="0"/>
+          <w:sz w:val="32"/>
+          <w:szCs w:val="32"/>
+          <w:bCs w:val="0"/>
+          <w:iCs w:val="0"/>
+        </w:rPr>
+        <w:t xml:space="preserve"> ตามเหตุการณ์ที่เกิดขึ้นในระบบ ดังตารางที่ 4.2 โดยภาพหลักฐานแนบเป็นลิงก์ HTTPS สาธารณะที่เปิดให้เข้าถึงผ่าน Tailscale Funnel </w:t>
+      </w:r>
+      <w:r>
+        <w:rPr>
+          <w:rFonts w:ascii="TH SarabunPSK" w:hAnsi="TH SarabunPSK" w:cs="TH SarabunPSK" w:eastAsia="TH SarabunPSK"/>
+          <w:b w:val="0"/>
+          <w:i w:val="0"/>
+          <w:sz w:val="32"/>
+          <w:szCs w:val="32"/>
+          <w:bCs w:val="0"/>
+          <w:iCs w:val="0"/>
+          <w:highlight w:val="yellow"/>
+        </w:rPr>
+        <w:t>[26]</w:t>
+      </w:r>
+      <w:r>
+        <w:rPr>
+          <w:rFonts w:ascii="TH SarabunPSK" w:hAnsi="TH SarabunPSK" w:cs="TH SarabunPSK" w:eastAsia="TH SarabunPSK"/>
+          <w:b w:val="0"/>
+          <w:i w:val="0"/>
+          <w:sz w:val="32"/>
+          <w:szCs w:val="32"/>
+          <w:bCs w:val="0"/>
+          <w:iCs w:val="0"/>
+        </w:rPr>
+        <w:t xml:space="preserve"> ตัวอย่างข้อความที่ได้รับแสดงดังภาพประกอบที่ 4.7</w:t>
       </w:r>
     </w:p>
     <w:p>
@@ -1178,7 +1561,1035 @@
           <w:bCs w:val="0"/>
           <w:iCs w:val="0"/>
         </w:rPr>
-        <w:t>ตารางที่ 4.2 ผลการตรวจวัดแรงดันและกระแสของแหล่งจ่ายไฟและวงจรขับกลอน</w:t>
+        <w:t>ตารางที่ 4.2 ข้อความแจ้งเตือนผ่าน LINE ของระบบ</w:t>
+      </w:r>
+    </w:p>
+    <w:tbl>
+      <w:tblPr>
+        <w:tblStyle w:val="TableGrid"/>
+        <w:tblW w:type="auto" w:w="0"/>
+        <w:jc w:val="center"/>
+        <w:tblLayout w:type="fixed"/>
+        <w:tblLook w:firstColumn="1" w:firstRow="1" w:lastColumn="0" w:lastRow="0" w:noHBand="0" w:noVBand="1" w:val="04A0"/>
+      </w:tblPr>
+      <w:tblGrid>
+        <w:gridCol w:w="1928"/>
+        <w:gridCol w:w="3175"/>
+        <w:gridCol w:w="1474"/>
+        <w:gridCol w:w="2494"/>
+      </w:tblGrid>
+      <w:tr>
+        <w:trPr>
+          <w:tblHeader w:val="true"/>
+          <w:cantSplit w:val="true"/>
+        </w:trPr>
+        <w:tc>
+          <w:tcPr>
+            <w:tcW w:type="dxa" w:w="1928"/>
+            <w:shd w:val="clear" w:color="auto" w:fill="E8E8E8"/>
+          </w:tcPr>
+          <w:p>
+            <w:pPr>
+              <w:keepNext/>
+              <w:jc w:val="center"/>
+            </w:pPr>
+            <w:r/>
+            <w:r>
+              <w:rPr>
+                <w:rFonts w:ascii="TH SarabunPSK" w:hAnsi="TH SarabunPSK" w:cs="TH SarabunPSK" w:eastAsia="TH SarabunPSK"/>
+                <w:b/>
+                <w:i w:val="0"/>
+                <w:sz w:val="28"/>
+                <w:szCs w:val="28"/>
+                <w:bCs w:val="1"/>
+                <w:iCs w:val="0"/>
+              </w:rPr>
+              <w:t>เหตุการณ์</w:t>
+            </w:r>
+          </w:p>
+        </w:tc>
+        <w:tc>
+          <w:tcPr>
+            <w:tcW w:type="dxa" w:w="3175"/>
+            <w:shd w:val="clear" w:color="auto" w:fill="E8E8E8"/>
+          </w:tcPr>
+          <w:p>
+            <w:pPr>
+              <w:keepNext/>
+              <w:jc w:val="center"/>
+            </w:pPr>
+            <w:r/>
+            <w:r>
+              <w:rPr>
+                <w:rFonts w:ascii="TH SarabunPSK" w:hAnsi="TH SarabunPSK" w:cs="TH SarabunPSK" w:eastAsia="TH SarabunPSK"/>
+                <w:b/>
+                <w:i w:val="0"/>
+                <w:sz w:val="28"/>
+                <w:szCs w:val="28"/>
+                <w:bCs w:val="1"/>
+                <w:iCs w:val="0"/>
+              </w:rPr>
+              <w:t>เงื่อนไข</w:t>
+            </w:r>
+          </w:p>
+        </w:tc>
+        <w:tc>
+          <w:tcPr>
+            <w:tcW w:type="dxa" w:w="1474"/>
+            <w:shd w:val="clear" w:color="auto" w:fill="E8E8E8"/>
+          </w:tcPr>
+          <w:p>
+            <w:pPr>
+              <w:keepNext/>
+              <w:jc w:val="center"/>
+            </w:pPr>
+            <w:r/>
+            <w:r>
+              <w:rPr>
+                <w:rFonts w:ascii="TH SarabunPSK" w:hAnsi="TH SarabunPSK" w:cs="TH SarabunPSK" w:eastAsia="TH SarabunPSK"/>
+                <w:b/>
+                <w:i w:val="0"/>
+                <w:sz w:val="28"/>
+                <w:szCs w:val="28"/>
+                <w:bCs w:val="1"/>
+                <w:iCs w:val="0"/>
+              </w:rPr>
+              <w:t>ผู้รับ</w:t>
+            </w:r>
+          </w:p>
+        </w:tc>
+        <w:tc>
+          <w:tcPr>
+            <w:tcW w:type="dxa" w:w="2494"/>
+            <w:shd w:val="clear" w:color="auto" w:fill="E8E8E8"/>
+          </w:tcPr>
+          <w:p>
+            <w:pPr>
+              <w:keepNext/>
+              <w:jc w:val="center"/>
+            </w:pPr>
+            <w:r/>
+            <w:r>
+              <w:rPr>
+                <w:rFonts w:ascii="TH SarabunPSK" w:hAnsi="TH SarabunPSK" w:cs="TH SarabunPSK" w:eastAsia="TH SarabunPSK"/>
+                <w:b/>
+                <w:i w:val="0"/>
+                <w:sz w:val="28"/>
+                <w:szCs w:val="28"/>
+                <w:bCs w:val="1"/>
+                <w:iCs w:val="0"/>
+              </w:rPr>
+              <w:t>ข้อความ (สรุป)</w:t>
+            </w:r>
+          </w:p>
+        </w:tc>
+      </w:tr>
+      <w:tr>
+        <w:trPr>
+          <w:cantSplit w:val="true"/>
+        </w:trPr>
+        <w:tc>
+          <w:tcPr>
+            <w:tcW w:type="dxa" w:w="1928"/>
+          </w:tcPr>
+          <w:p>
+            <w:pPr>
+              <w:keepNext/>
+              <w:jc w:val="center"/>
+            </w:pPr>
+            <w:r/>
+            <w:r>
+              <w:rPr>
+                <w:rFonts w:ascii="TH SarabunPSK" w:hAnsi="TH SarabunPSK" w:cs="TH SarabunPSK" w:eastAsia="TH SarabunPSK"/>
+                <w:b w:val="0"/>
+                <w:i w:val="0"/>
+                <w:sz w:val="28"/>
+                <w:szCs w:val="28"/>
+                <w:bCs w:val="0"/>
+                <w:iCs w:val="0"/>
+              </w:rPr>
+              <w:t>ประตูถูกเปิด</w:t>
+            </w:r>
+          </w:p>
+        </w:tc>
+        <w:tc>
+          <w:tcPr>
+            <w:tcW w:type="dxa" w:w="3175"/>
+          </w:tcPr>
+          <w:p>
+            <w:pPr>
+              <w:keepNext/>
+            </w:pPr>
+            <w:r/>
+            <w:r>
+              <w:rPr>
+                <w:rFonts w:ascii="TH SarabunPSK" w:hAnsi="TH SarabunPSK" w:cs="TH SarabunPSK" w:eastAsia="TH SarabunPSK"/>
+                <w:b w:val="0"/>
+                <w:i w:val="0"/>
+                <w:sz w:val="28"/>
+                <w:szCs w:val="28"/>
+                <w:bCs w:val="0"/>
+                <w:iCs w:val="0"/>
+              </w:rPr>
+              <w:t>ESP32 รายงานว่าประตูเปิดหลังปลดล็อกด้วยรหัส</w:t>
+            </w:r>
+          </w:p>
+        </w:tc>
+        <w:tc>
+          <w:tcPr>
+            <w:tcW w:type="dxa" w:w="1474"/>
+          </w:tcPr>
+          <w:p>
+            <w:pPr>
+              <w:keepNext/>
+              <w:jc w:val="center"/>
+            </w:pPr>
+            <w:r/>
+            <w:r>
+              <w:rPr>
+                <w:rFonts w:ascii="TH SarabunPSK" w:hAnsi="TH SarabunPSK" w:cs="TH SarabunPSK" w:eastAsia="TH SarabunPSK"/>
+                <w:b w:val="0"/>
+                <w:i w:val="0"/>
+                <w:sz w:val="28"/>
+                <w:szCs w:val="28"/>
+                <w:bCs w:val="0"/>
+                <w:iCs w:val="0"/>
+              </w:rPr>
+              <w:t>ผู้สร้างรหัส</w:t>
+            </w:r>
+          </w:p>
+        </w:tc>
+        <w:tc>
+          <w:tcPr>
+            <w:tcW w:type="dxa" w:w="2494"/>
+          </w:tcPr>
+          <w:p>
+            <w:pPr>
+              <w:keepNext/>
+            </w:pPr>
+            <w:r/>
+            <w:r>
+              <w:rPr>
+                <w:rFonts w:ascii="TH SarabunPSK" w:hAnsi="TH SarabunPSK" w:cs="TH SarabunPSK" w:eastAsia="TH SarabunPSK"/>
+                <w:b w:val="0"/>
+                <w:i w:val="0"/>
+                <w:sz w:val="28"/>
+                <w:szCs w:val="28"/>
+                <w:bCs w:val="0"/>
+                <w:iCs w:val="0"/>
+              </w:rPr>
+              <w:t>the door was opened</w:t>
+            </w:r>
+          </w:p>
+        </w:tc>
+      </w:tr>
+      <w:tr>
+        <w:trPr>
+          <w:cantSplit w:val="true"/>
+        </w:trPr>
+        <w:tc>
+          <w:tcPr>
+            <w:tcW w:type="dxa" w:w="1928"/>
+          </w:tcPr>
+          <w:p>
+            <w:pPr>
+              <w:keepNext/>
+              <w:jc w:val="center"/>
+            </w:pPr>
+            <w:r/>
+            <w:r>
+              <w:rPr>
+                <w:rFonts w:ascii="TH SarabunPSK" w:hAnsi="TH SarabunPSK" w:cs="TH SarabunPSK" w:eastAsia="TH SarabunPSK"/>
+                <w:b w:val="0"/>
+                <w:i w:val="0"/>
+                <w:sz w:val="28"/>
+                <w:szCs w:val="28"/>
+                <w:bCs w:val="0"/>
+                <w:iCs w:val="0"/>
+              </w:rPr>
+              <w:t>ประตูปิดและล็อก</w:t>
+            </w:r>
+          </w:p>
+        </w:tc>
+        <w:tc>
+          <w:tcPr>
+            <w:tcW w:type="dxa" w:w="3175"/>
+          </w:tcPr>
+          <w:p>
+            <w:pPr>
+              <w:keepNext/>
+            </w:pPr>
+            <w:r/>
+            <w:r>
+              <w:rPr>
+                <w:rFonts w:ascii="TH SarabunPSK" w:hAnsi="TH SarabunPSK" w:cs="TH SarabunPSK" w:eastAsia="TH SarabunPSK"/>
+                <w:b w:val="0"/>
+                <w:i w:val="0"/>
+                <w:sz w:val="28"/>
+                <w:szCs w:val="28"/>
+                <w:bCs w:val="0"/>
+                <w:iCs w:val="0"/>
+              </w:rPr>
+              <w:t>ประตูปิดสนิทและกลอนล็อก</w:t>
+            </w:r>
+          </w:p>
+        </w:tc>
+        <w:tc>
+          <w:tcPr>
+            <w:tcW w:type="dxa" w:w="1474"/>
+          </w:tcPr>
+          <w:p>
+            <w:pPr>
+              <w:keepNext/>
+              <w:jc w:val="center"/>
+            </w:pPr>
+            <w:r/>
+            <w:r>
+              <w:rPr>
+                <w:rFonts w:ascii="TH SarabunPSK" w:hAnsi="TH SarabunPSK" w:cs="TH SarabunPSK" w:eastAsia="TH SarabunPSK"/>
+                <w:b w:val="0"/>
+                <w:i w:val="0"/>
+                <w:sz w:val="28"/>
+                <w:szCs w:val="28"/>
+                <w:bCs w:val="0"/>
+                <w:iCs w:val="0"/>
+              </w:rPr>
+              <w:t>ผู้สร้างรหัส</w:t>
+            </w:r>
+          </w:p>
+        </w:tc>
+        <w:tc>
+          <w:tcPr>
+            <w:tcW w:type="dxa" w:w="2494"/>
+          </w:tcPr>
+          <w:p>
+            <w:pPr>
+              <w:keepNext/>
+            </w:pPr>
+            <w:r/>
+            <w:r>
+              <w:rPr>
+                <w:rFonts w:ascii="TH SarabunPSK" w:hAnsi="TH SarabunPSK" w:cs="TH SarabunPSK" w:eastAsia="TH SarabunPSK"/>
+                <w:b w:val="0"/>
+                <w:i w:val="0"/>
+                <w:sz w:val="28"/>
+                <w:szCs w:val="28"/>
+                <w:bCs w:val="0"/>
+                <w:iCs w:val="0"/>
+              </w:rPr>
+              <w:t>the door was closed and locked</w:t>
+            </w:r>
+          </w:p>
+        </w:tc>
+      </w:tr>
+      <w:tr>
+        <w:trPr>
+          <w:cantSplit w:val="true"/>
+        </w:trPr>
+        <w:tc>
+          <w:tcPr>
+            <w:tcW w:type="dxa" w:w="1928"/>
+          </w:tcPr>
+          <w:p>
+            <w:pPr>
+              <w:keepNext/>
+              <w:jc w:val="center"/>
+            </w:pPr>
+            <w:r/>
+            <w:r>
+              <w:rPr>
+                <w:rFonts w:ascii="TH SarabunPSK" w:hAnsi="TH SarabunPSK" w:cs="TH SarabunPSK" w:eastAsia="TH SarabunPSK"/>
+                <w:b w:val="0"/>
+                <w:i w:val="0"/>
+                <w:sz w:val="28"/>
+                <w:szCs w:val="28"/>
+                <w:bCs w:val="0"/>
+                <w:iCs w:val="0"/>
+              </w:rPr>
+              <w:t>ส่งมอบพัสดุพร้อมภาพ</w:t>
+            </w:r>
+          </w:p>
+        </w:tc>
+        <w:tc>
+          <w:tcPr>
+            <w:tcW w:type="dxa" w:w="3175"/>
+          </w:tcPr>
+          <w:p>
+            <w:pPr>
+              <w:keepNext/>
+            </w:pPr>
+            <w:r/>
+            <w:r>
+              <w:rPr>
+                <w:rFonts w:ascii="TH SarabunPSK" w:hAnsi="TH SarabunPSK" w:cs="TH SarabunPSK" w:eastAsia="TH SarabunPSK"/>
+                <w:b w:val="0"/>
+                <w:i w:val="0"/>
+                <w:sz w:val="28"/>
+                <w:szCs w:val="28"/>
+                <w:bCs w:val="0"/>
+                <w:iCs w:val="0"/>
+              </w:rPr>
+              <w:t>ได้รับภาพภายในเวลารอภาพ</w:t>
+            </w:r>
+          </w:p>
+        </w:tc>
+        <w:tc>
+          <w:tcPr>
+            <w:tcW w:type="dxa" w:w="1474"/>
+          </w:tcPr>
+          <w:p>
+            <w:pPr>
+              <w:keepNext/>
+              <w:jc w:val="center"/>
+            </w:pPr>
+            <w:r/>
+            <w:r>
+              <w:rPr>
+                <w:rFonts w:ascii="TH SarabunPSK" w:hAnsi="TH SarabunPSK" w:cs="TH SarabunPSK" w:eastAsia="TH SarabunPSK"/>
+                <w:b w:val="0"/>
+                <w:i w:val="0"/>
+                <w:sz w:val="28"/>
+                <w:szCs w:val="28"/>
+                <w:bCs w:val="0"/>
+                <w:iCs w:val="0"/>
+              </w:rPr>
+              <w:t>ผู้สร้างรหัส</w:t>
+            </w:r>
+          </w:p>
+        </w:tc>
+        <w:tc>
+          <w:tcPr>
+            <w:tcW w:type="dxa" w:w="2494"/>
+          </w:tcPr>
+          <w:p>
+            <w:pPr>
+              <w:keepNext/>
+            </w:pPr>
+            <w:r/>
+            <w:r>
+              <w:rPr>
+                <w:rFonts w:ascii="TH SarabunPSK" w:hAnsi="TH SarabunPSK" w:cs="TH SarabunPSK" w:eastAsia="TH SarabunPSK"/>
+                <w:b w:val="0"/>
+                <w:i w:val="0"/>
+                <w:sz w:val="28"/>
+                <w:szCs w:val="28"/>
+                <w:bCs w:val="0"/>
+                <w:iCs w:val="0"/>
+              </w:rPr>
+              <w:t>A parcel was delivered ... พร้อมลิงก์ภาพ</w:t>
+            </w:r>
+          </w:p>
+        </w:tc>
+      </w:tr>
+      <w:tr>
+        <w:trPr>
+          <w:cantSplit w:val="true"/>
+        </w:trPr>
+        <w:tc>
+          <w:tcPr>
+            <w:tcW w:type="dxa" w:w="1928"/>
+          </w:tcPr>
+          <w:p>
+            <w:pPr>
+              <w:keepNext/>
+              <w:jc w:val="center"/>
+            </w:pPr>
+            <w:r/>
+            <w:r>
+              <w:rPr>
+                <w:rFonts w:ascii="TH SarabunPSK" w:hAnsi="TH SarabunPSK" w:cs="TH SarabunPSK" w:eastAsia="TH SarabunPSK"/>
+                <w:b w:val="0"/>
+                <w:i w:val="0"/>
+                <w:sz w:val="28"/>
+                <w:szCs w:val="28"/>
+                <w:bCs w:val="0"/>
+                <w:iCs w:val="0"/>
+              </w:rPr>
+              <w:t>ส่งมอบพัสดุไม่มีภาพ</w:t>
+            </w:r>
+          </w:p>
+        </w:tc>
+        <w:tc>
+          <w:tcPr>
+            <w:tcW w:type="dxa" w:w="3175"/>
+          </w:tcPr>
+          <w:p>
+            <w:pPr>
+              <w:keepNext/>
+            </w:pPr>
+            <w:r/>
+            <w:r>
+              <w:rPr>
+                <w:rFonts w:ascii="TH SarabunPSK" w:hAnsi="TH SarabunPSK" w:cs="TH SarabunPSK" w:eastAsia="TH SarabunPSK"/>
+                <w:b w:val="0"/>
+                <w:i w:val="0"/>
+                <w:sz w:val="28"/>
+                <w:szCs w:val="28"/>
+                <w:bCs w:val="0"/>
+                <w:iCs w:val="0"/>
+              </w:rPr>
+              <w:t>ไม่ได้รับภาพภายในเวลารอภาพ</w:t>
+            </w:r>
+          </w:p>
+        </w:tc>
+        <w:tc>
+          <w:tcPr>
+            <w:tcW w:type="dxa" w:w="1474"/>
+          </w:tcPr>
+          <w:p>
+            <w:pPr>
+              <w:keepNext/>
+              <w:jc w:val="center"/>
+            </w:pPr>
+            <w:r/>
+            <w:r>
+              <w:rPr>
+                <w:rFonts w:ascii="TH SarabunPSK" w:hAnsi="TH SarabunPSK" w:cs="TH SarabunPSK" w:eastAsia="TH SarabunPSK"/>
+                <w:b w:val="0"/>
+                <w:i w:val="0"/>
+                <w:sz w:val="28"/>
+                <w:szCs w:val="28"/>
+                <w:bCs w:val="0"/>
+                <w:iCs w:val="0"/>
+              </w:rPr>
+              <w:t>ผู้สร้างรหัส</w:t>
+            </w:r>
+          </w:p>
+        </w:tc>
+        <w:tc>
+          <w:tcPr>
+            <w:tcW w:type="dxa" w:w="2494"/>
+          </w:tcPr>
+          <w:p>
+            <w:pPr>
+              <w:keepNext/>
+            </w:pPr>
+            <w:r/>
+            <w:r>
+              <w:rPr>
+                <w:rFonts w:ascii="TH SarabunPSK" w:hAnsi="TH SarabunPSK" w:cs="TH SarabunPSK" w:eastAsia="TH SarabunPSK"/>
+                <w:b w:val="0"/>
+                <w:i w:val="0"/>
+                <w:sz w:val="28"/>
+                <w:szCs w:val="28"/>
+                <w:bCs w:val="0"/>
+                <w:iCs w:val="0"/>
+              </w:rPr>
+              <w:t>A parcel was delivered ... (No photo received within N s.)</w:t>
+            </w:r>
+          </w:p>
+        </w:tc>
+      </w:tr>
+      <w:tr>
+        <w:trPr>
+          <w:cantSplit w:val="true"/>
+        </w:trPr>
+        <w:tc>
+          <w:tcPr>
+            <w:tcW w:type="dxa" w:w="1928"/>
+          </w:tcPr>
+          <w:p>
+            <w:pPr>
+              <w:keepNext/>
+              <w:jc w:val="center"/>
+            </w:pPr>
+            <w:r/>
+            <w:r>
+              <w:rPr>
+                <w:rFonts w:ascii="TH SarabunPSK" w:hAnsi="TH SarabunPSK" w:cs="TH SarabunPSK" w:eastAsia="TH SarabunPSK"/>
+                <w:b w:val="0"/>
+                <w:i w:val="0"/>
+                <w:sz w:val="28"/>
+                <w:szCs w:val="28"/>
+                <w:bCs w:val="0"/>
+                <w:iCs w:val="0"/>
+              </w:rPr>
+              <w:t>ประตูเปิดค้าง</w:t>
+            </w:r>
+          </w:p>
+        </w:tc>
+        <w:tc>
+          <w:tcPr>
+            <w:tcW w:type="dxa" w:w="3175"/>
+          </w:tcPr>
+          <w:p>
+            <w:pPr>
+              <w:keepNext/>
+            </w:pPr>
+            <w:r/>
+            <w:r>
+              <w:rPr>
+                <w:rFonts w:ascii="TH SarabunPSK" w:hAnsi="TH SarabunPSK" w:cs="TH SarabunPSK" w:eastAsia="TH SarabunPSK"/>
+                <w:b w:val="0"/>
+                <w:i w:val="0"/>
+                <w:sz w:val="28"/>
+                <w:szCs w:val="28"/>
+                <w:bCs w:val="0"/>
+                <w:iCs w:val="0"/>
+              </w:rPr>
+              <w:t>ประตูเปิดค้างเกิน 60 วินาที (ส่งครั้งเดียว)</w:t>
+            </w:r>
+          </w:p>
+        </w:tc>
+        <w:tc>
+          <w:tcPr>
+            <w:tcW w:type="dxa" w:w="1474"/>
+          </w:tcPr>
+          <w:p>
+            <w:pPr>
+              <w:keepNext/>
+              <w:jc w:val="center"/>
+            </w:pPr>
+            <w:r/>
+            <w:r>
+              <w:rPr>
+                <w:rFonts w:ascii="TH SarabunPSK" w:hAnsi="TH SarabunPSK" w:cs="TH SarabunPSK" w:eastAsia="TH SarabunPSK"/>
+                <w:b w:val="0"/>
+                <w:i w:val="0"/>
+                <w:sz w:val="28"/>
+                <w:szCs w:val="28"/>
+                <w:bCs w:val="0"/>
+                <w:iCs w:val="0"/>
+              </w:rPr>
+              <w:t>ผู้สร้างรหัส</w:t>
+            </w:r>
+          </w:p>
+        </w:tc>
+        <w:tc>
+          <w:tcPr>
+            <w:tcW w:type="dxa" w:w="2494"/>
+          </w:tcPr>
+          <w:p>
+            <w:pPr>
+              <w:keepNext/>
+            </w:pPr>
+            <w:r/>
+            <w:r>
+              <w:rPr>
+                <w:rFonts w:ascii="TH SarabunPSK" w:hAnsi="TH SarabunPSK" w:cs="TH SarabunPSK" w:eastAsia="TH SarabunPSK"/>
+                <w:b w:val="0"/>
+                <w:i w:val="0"/>
+                <w:sz w:val="28"/>
+                <w:szCs w:val="28"/>
+                <w:bCs w:val="0"/>
+                <w:iCs w:val="0"/>
+              </w:rPr>
+              <w:t>the door has been open for more than 60 seconds</w:t>
+            </w:r>
+          </w:p>
+        </w:tc>
+      </w:tr>
+      <w:tr>
+        <w:trPr>
+          <w:cantSplit w:val="true"/>
+        </w:trPr>
+        <w:tc>
+          <w:tcPr>
+            <w:tcW w:type="dxa" w:w="1928"/>
+          </w:tcPr>
+          <w:p>
+            <w:pPr>
+              <w:keepNext/>
+              <w:jc w:val="center"/>
+            </w:pPr>
+            <w:r/>
+            <w:r>
+              <w:rPr>
+                <w:rFonts w:ascii="TH SarabunPSK" w:hAnsi="TH SarabunPSK" w:cs="TH SarabunPSK" w:eastAsia="TH SarabunPSK"/>
+                <w:b w:val="0"/>
+                <w:i w:val="0"/>
+                <w:sz w:val="28"/>
+                <w:szCs w:val="28"/>
+                <w:bCs w:val="0"/>
+                <w:iCs w:val="0"/>
+              </w:rPr>
+              <w:t>ปฏิเสธการเข้าถึง</w:t>
+            </w:r>
+          </w:p>
+        </w:tc>
+        <w:tc>
+          <w:tcPr>
+            <w:tcW w:type="dxa" w:w="3175"/>
+          </w:tcPr>
+          <w:p>
+            <w:pPr>
+              <w:keepNext/>
+            </w:pPr>
+            <w:r/>
+            <w:r>
+              <w:rPr>
+                <w:rFonts w:ascii="TH SarabunPSK" w:hAnsi="TH SarabunPSK" w:cs="TH SarabunPSK" w:eastAsia="TH SarabunPSK"/>
+                <w:b w:val="0"/>
+                <w:i w:val="0"/>
+                <w:sz w:val="28"/>
+                <w:szCs w:val="28"/>
+                <w:bCs w:val="0"/>
+                <w:iCs w:val="0"/>
+              </w:rPr>
+              <w:t>รหัสถูกปฏิเสธ (invalid_code, expired, already_used)</w:t>
+            </w:r>
+          </w:p>
+        </w:tc>
+        <w:tc>
+          <w:tcPr>
+            <w:tcW w:type="dxa" w:w="1474"/>
+          </w:tcPr>
+          <w:p>
+            <w:pPr>
+              <w:keepNext/>
+            </w:pPr>
+            <w:r/>
+            <w:r>
+              <w:rPr>
+                <w:rFonts w:ascii="TH SarabunPSK" w:hAnsi="TH SarabunPSK" w:cs="TH SarabunPSK" w:eastAsia="TH SarabunPSK"/>
+                <w:b w:val="0"/>
+                <w:i w:val="0"/>
+                <w:sz w:val="28"/>
+                <w:szCs w:val="28"/>
+                <w:bCs w:val="0"/>
+                <w:iCs w:val="0"/>
+              </w:rPr>
+              <w:t>ผู้รับที่ตั้งค่าไว้</w:t>
+            </w:r>
+          </w:p>
+        </w:tc>
+        <w:tc>
+          <w:tcPr>
+            <w:tcW w:type="dxa" w:w="2494"/>
+          </w:tcPr>
+          <w:p>
+            <w:pPr>
+              <w:keepNext/>
+            </w:pPr>
+            <w:r/>
+            <w:r>
+              <w:rPr>
+                <w:rFonts w:ascii="TH SarabunPSK" w:hAnsi="TH SarabunPSK" w:cs="TH SarabunPSK" w:eastAsia="TH SarabunPSK"/>
+                <w:b w:val="0"/>
+                <w:i w:val="0"/>
+                <w:sz w:val="28"/>
+                <w:szCs w:val="28"/>
+                <w:bCs w:val="0"/>
+                <w:iCs w:val="0"/>
+              </w:rPr>
+              <w:t>Denied access attempt at box: เหตุผล</w:t>
+            </w:r>
+          </w:p>
+        </w:tc>
+      </w:tr>
+      <w:tr>
+        <w:trPr>
+          <w:cantSplit w:val="true"/>
+        </w:trPr>
+        <w:tc>
+          <w:tcPr>
+            <w:tcW w:type="dxa" w:w="1928"/>
+          </w:tcPr>
+          <w:p>
+            <w:pPr>
+              <w:keepNext/>
+              <w:jc w:val="center"/>
+            </w:pPr>
+            <w:r/>
+            <w:r>
+              <w:rPr>
+                <w:rFonts w:ascii="TH SarabunPSK" w:hAnsi="TH SarabunPSK" w:cs="TH SarabunPSK" w:eastAsia="TH SarabunPSK"/>
+                <w:b w:val="0"/>
+                <w:i w:val="0"/>
+                <w:sz w:val="28"/>
+                <w:szCs w:val="28"/>
+                <w:bCs w:val="0"/>
+                <w:iCs w:val="0"/>
+              </w:rPr>
+              <w:t>เปิดประตูขณะล็อก</w:t>
+            </w:r>
+          </w:p>
+        </w:tc>
+        <w:tc>
+          <w:tcPr>
+            <w:tcW w:type="dxa" w:w="3175"/>
+          </w:tcPr>
+          <w:p>
+            <w:pPr>
+              <w:keepNext/>
+            </w:pPr>
+            <w:r/>
+            <w:r>
+              <w:rPr>
+                <w:rFonts w:ascii="TH SarabunPSK" w:hAnsi="TH SarabunPSK" w:cs="TH SarabunPSK" w:eastAsia="TH SarabunPSK"/>
+                <w:b w:val="0"/>
+                <w:i w:val="0"/>
+                <w:sz w:val="28"/>
+                <w:szCs w:val="28"/>
+                <w:bCs w:val="0"/>
+                <w:iCs w:val="0"/>
+              </w:rPr>
+              <w:t>ประตูถูกเปิดขณะที่กลอนล็อก (ส่งไม่เกิน 1 ครั้งต่อ 60 วินาที)</w:t>
+            </w:r>
+          </w:p>
+        </w:tc>
+        <w:tc>
+          <w:tcPr>
+            <w:tcW w:type="dxa" w:w="1474"/>
+          </w:tcPr>
+          <w:p>
+            <w:pPr>
+              <w:keepNext/>
+              <w:jc w:val="center"/>
+            </w:pPr>
+            <w:r/>
+            <w:r>
+              <w:rPr>
+                <w:rFonts w:ascii="TH SarabunPSK" w:hAnsi="TH SarabunPSK" w:cs="TH SarabunPSK" w:eastAsia="TH SarabunPSK"/>
+                <w:b w:val="0"/>
+                <w:i w:val="0"/>
+                <w:sz w:val="28"/>
+                <w:szCs w:val="28"/>
+                <w:bCs w:val="0"/>
+                <w:iCs w:val="0"/>
+              </w:rPr>
+              <w:t>ผู้ผูกกับกล่อง</w:t>
+            </w:r>
+          </w:p>
+        </w:tc>
+        <w:tc>
+          <w:tcPr>
+            <w:tcW w:type="dxa" w:w="2494"/>
+          </w:tcPr>
+          <w:p>
+            <w:pPr>
+              <w:keepNext/>
+            </w:pPr>
+            <w:r/>
+            <w:r>
+              <w:rPr>
+                <w:rFonts w:ascii="TH SarabunPSK" w:hAnsi="TH SarabunPSK" w:cs="TH SarabunPSK" w:eastAsia="TH SarabunPSK"/>
+                <w:b w:val="0"/>
+                <w:i w:val="0"/>
+                <w:sz w:val="28"/>
+                <w:szCs w:val="28"/>
+                <w:bCs w:val="0"/>
+                <w:iCs w:val="0"/>
+              </w:rPr>
+              <w:t>the door was opened while locked (possible tampering)</w:t>
+            </w:r>
+          </w:p>
+        </w:tc>
+      </w:tr>
+      <w:tr>
+        <w:trPr>
+          <w:cantSplit w:val="true"/>
+        </w:trPr>
+        <w:tc>
+          <w:tcPr>
+            <w:tcW w:type="dxa" w:w="1928"/>
+          </w:tcPr>
+          <w:p>
+            <w:pPr>
+              <w:jc w:val="center"/>
+            </w:pPr>
+            <w:r/>
+            <w:r>
+              <w:rPr>
+                <w:rFonts w:ascii="TH SarabunPSK" w:hAnsi="TH SarabunPSK" w:cs="TH SarabunPSK" w:eastAsia="TH SarabunPSK"/>
+                <w:b w:val="0"/>
+                <w:i w:val="0"/>
+                <w:sz w:val="28"/>
+                <w:szCs w:val="28"/>
+                <w:bCs w:val="0"/>
+                <w:iCs w:val="0"/>
+              </w:rPr>
+              <w:t>ปลดล็อกด้วยปุ่ม</w:t>
+            </w:r>
+          </w:p>
+        </w:tc>
+        <w:tc>
+          <w:tcPr>
+            <w:tcW w:type="dxa" w:w="3175"/>
+          </w:tcPr>
+          <w:p>
+            <w:r/>
+            <w:r>
+              <w:rPr>
+                <w:rFonts w:ascii="TH SarabunPSK" w:hAnsi="TH SarabunPSK" w:cs="TH SarabunPSK" w:eastAsia="TH SarabunPSK"/>
+                <w:b w:val="0"/>
+                <w:i w:val="0"/>
+                <w:sz w:val="28"/>
+                <w:szCs w:val="28"/>
+                <w:bCs w:val="0"/>
+                <w:iCs w:val="0"/>
+              </w:rPr>
+              <w:t>กดปุ่มปลดล็อกด้วยมือ (ไม่ถ่ายภาพ)</w:t>
+            </w:r>
+          </w:p>
+        </w:tc>
+        <w:tc>
+          <w:tcPr>
+            <w:tcW w:type="dxa" w:w="1474"/>
+          </w:tcPr>
+          <w:p>
+            <w:pPr>
+              <w:jc w:val="center"/>
+            </w:pPr>
+            <w:r/>
+            <w:r>
+              <w:rPr>
+                <w:rFonts w:ascii="TH SarabunPSK" w:hAnsi="TH SarabunPSK" w:cs="TH SarabunPSK" w:eastAsia="TH SarabunPSK"/>
+                <w:b w:val="0"/>
+                <w:i w:val="0"/>
+                <w:sz w:val="28"/>
+                <w:szCs w:val="28"/>
+                <w:bCs w:val="0"/>
+                <w:iCs w:val="0"/>
+              </w:rPr>
+              <w:t>ผู้ผูกกับกล่อง</w:t>
+            </w:r>
+          </w:p>
+        </w:tc>
+        <w:tc>
+          <w:tcPr>
+            <w:tcW w:type="dxa" w:w="2494"/>
+          </w:tcPr>
+          <w:p>
+            <w:r/>
+            <w:r>
+              <w:rPr>
+                <w:rFonts w:ascii="TH SarabunPSK" w:hAnsi="TH SarabunPSK" w:cs="TH SarabunPSK" w:eastAsia="TH SarabunPSK"/>
+                <w:b w:val="0"/>
+                <w:i w:val="0"/>
+                <w:sz w:val="28"/>
+                <w:szCs w:val="28"/>
+                <w:bCs w:val="0"/>
+                <w:iCs w:val="0"/>
+              </w:rPr>
+              <w:t>opened with the manual override (no photo)</w:t>
+            </w:r>
+          </w:p>
+        </w:tc>
+      </w:tr>
+    </w:tbl>
+    <w:p>
+      <w:pPr>
+        <w:spacing w:after="0"/>
+        <w:ind w:left="283"/>
+        <w:jc w:val="left"/>
+      </w:pPr>
+      <w:r>
+        <w:rPr>
+          <w:rFonts w:ascii="TH SarabunPSK" w:hAnsi="TH SarabunPSK" w:cs="TH SarabunPSK" w:eastAsia="TH SarabunPSK"/>
+          <w:b w:val="0"/>
+          <w:i w:val="0"/>
+          <w:sz w:val="28"/>
+          <w:szCs w:val="28"/>
+          <w:bCs w:val="0"/>
+          <w:iCs w:val="0"/>
+        </w:rPr>
+        <w:t>หมายเหตุ: ข้อความที่ระบบส่งเป็นภาษาอังกฤษตามที่พัฒนา และมีสัญลักษณ์อีโมจิกำกับ</w:t>
+      </w:r>
+    </w:p>
+    <w:p>
+      <w:pPr>
+        <w:spacing w:after="80"/>
+      </w:pPr>
+    </w:p>
+    <w:p>
+      <w:pPr>
+        <w:keepNext/>
+        <w:spacing w:after="80"/>
+        <w:ind w:firstLine="0"/>
+        <w:jc w:val="center"/>
+      </w:pPr>
+      <w:r>
+        <w:rPr>
+          <w:rFonts w:ascii="TH SarabunPSK" w:hAnsi="TH SarabunPSK" w:cs="TH SarabunPSK" w:eastAsia="TH SarabunPSK"/>
+          <w:b w:val="0"/>
+          <w:i w:val="0"/>
+          <w:sz w:val="32"/>
+          <w:szCs w:val="32"/>
+          <w:bCs w:val="0"/>
+          <w:iCs w:val="0"/>
+          <w:highlight w:val="yellow"/>
+        </w:rPr>
+        <w:t>[แทรกภาพหน้าจอ LINE ที่มีข้อความแจ้งเตือนหลายประเภท และมีภาพหลักฐานแสดงผล (ใช้ภาพจากเครื่องที่ต่อเครือข่ายที่เข้าถึงลิงก์ภาพได้)]</w:t>
+      </w:r>
+    </w:p>
+    <w:p>
+      <w:pPr>
+        <w:spacing w:after="160"/>
+        <w:ind w:firstLine="0"/>
+        <w:jc w:val="center"/>
+      </w:pPr>
+      <w:r>
+        <w:rPr>
+          <w:rFonts w:ascii="TH SarabunPSK" w:hAnsi="TH SarabunPSK" w:cs="TH SarabunPSK" w:eastAsia="TH SarabunPSK"/>
+          <w:b w:val="0"/>
+          <w:i w:val="0"/>
+          <w:sz w:val="32"/>
+          <w:szCs w:val="32"/>
+          <w:bCs w:val="0"/>
+          <w:iCs w:val="0"/>
+        </w:rPr>
+        <w:t>ภาพประกอบที่ 4.7 ตัวอย่างข้อความแจ้งเตือนผ่านแอป LINE</w:t>
+      </w:r>
+    </w:p>
+    <w:p>
+      <w:pPr>
+        <w:pStyle w:val="Heading1"/>
+        <w:keepNext/>
+        <w:spacing w:before="240" w:after="120"/>
+      </w:pPr>
+      <w:r>
+        <w:rPr>
+          <w:rFonts w:ascii="TH SarabunPSK" w:hAnsi="TH SarabunPSK" w:cs="TH SarabunPSK" w:eastAsia="TH SarabunPSK"/>
+          <w:b/>
+          <w:i w:val="0"/>
+          <w:color w:val="000000"/>
+          <w:sz w:val="32"/>
+          <w:szCs w:val="32"/>
+          <w:bCs w:val="1"/>
+          <w:iCs w:val="0"/>
+        </w:rPr>
+        <w:t>4.4 ผลการตรวจวัดแรงดันไฟเลี้ยงและวงจรขับกลอน</w:t>
+      </w:r>
+    </w:p>
+    <w:p>
+      <w:pPr>
+        <w:spacing w:after="120" w:before="0" w:line="240" w:lineRule="auto"/>
+        <w:ind w:left="0" w:firstLine="850"/>
+        <w:jc w:val="both"/>
+      </w:pPr>
+      <w:r>
+        <w:rPr>
+          <w:rFonts w:ascii="TH SarabunPSK" w:hAnsi="TH SarabunPSK" w:cs="TH SarabunPSK" w:eastAsia="TH SarabunPSK"/>
+          <w:b w:val="0"/>
+          <w:i w:val="0"/>
+          <w:sz w:val="32"/>
+          <w:szCs w:val="32"/>
+          <w:bCs w:val="0"/>
+          <w:iCs w:val="0"/>
+        </w:rPr>
+        <w:t>บทที่ 3 กำหนดให้ตรวจสอบค่าที่ได้จากการคำนวณออกแบบกับค่าที่วัดได้จริงในบทที่ 4 (หัวข้อ 3.2.1–3.2.3) คณะผู้จัดทำจึงวัดแรงดันและกระแสด้วยมัลติมิเตอร์ ผลแสดงดังตารางที่ 4.3</w:t>
+      </w:r>
+    </w:p>
+    <w:p>
+      <w:pPr>
+        <w:pStyle w:val="Heading4"/>
+        <w:keepNext/>
+        <w:spacing w:after="80" w:before="120"/>
+        <w:ind w:left="0"/>
+      </w:pPr>
+      <w:r>
+        <w:rPr>
+          <w:rFonts w:ascii="TH SarabunPSK" w:hAnsi="TH SarabunPSK" w:cs="TH SarabunPSK" w:eastAsia="TH SarabunPSK"/>
+          <w:b w:val="0"/>
+          <w:i w:val="0"/>
+          <w:color w:val="000000"/>
+          <w:sz w:val="32"/>
+          <w:szCs w:val="32"/>
+          <w:bCs w:val="0"/>
+          <w:iCs w:val="0"/>
+        </w:rPr>
+        <w:t>ตารางที่ 4.3 ผลการตรวจวัดแรงดันและกระแสของแหล่งจ่ายไฟและวงจรขับกลอน</w:t>
       </w:r>
     </w:p>
     <w:tbl>
@@ -2066,7 +3477,7 @@
           <w:bCs w:val="0"/>
           <w:iCs w:val="0"/>
         </w:rPr>
-        <w:t xml:space="preserve">จากตารางที่ 4.2 พบว่า แรงดันรางไฟ 5 V วัดได้ </w:t>
+        <w:t xml:space="preserve">จากตารางที่ 4.3 พบว่า แรงดันรางไฟ 5 V วัดได้ </w:t>
       </w:r>
       <w:r>
         <w:rPr>
@@ -2274,7 +3685,7 @@
           <w:bCs w:val="1"/>
           <w:iCs w:val="0"/>
         </w:rPr>
-        <w:t>4.4 แผนการทดสอบและเกณฑ์การประเมิน</w:t>
+        <w:t>4.5 แผนการทดสอบและเกณฑ์การประเมิน</w:t>
       </w:r>
     </w:p>
     <w:p>
@@ -2293,7 +3704,7 @@
           <w:bCs w:val="0"/>
           <w:iCs w:val="0"/>
         </w:rPr>
-        <w:t>เพื่อให้สอดคล้องกับวัตถุประสงค์ของโครงงานในการพัฒนาต้นแบบกล่องรับพัสดุอัจฉริยะที่เพิ่มความปลอดภัยในการรับพัสดุ และยืนยันหลักฐานการส่งมอบพัสดุ (Proof of Delivery) ได้อย่างถูกต้อง คณะผู้จัดทำแบ่งการทดสอบเป็น 5 ส่วน ส่วนละ 15 ครั้ง ดังตารางที่ 4.3 โดยทุกการทดสอบผู้ทดสอบปิดประตูด้วยมือจนสนิท และใช้เครือข่าย Wi-Fi เดียวกันตลอดการทดสอบ</w:t>
+        <w:t>เพื่อให้สอดคล้องกับวัตถุประสงค์ของโครงงานในการพัฒนาต้นแบบกล่องรับพัสดุอัจฉริยะที่เพิ่มความปลอดภัยในการรับพัสดุ และยืนยันหลักฐานการส่งมอบพัสดุ (Proof of Delivery) ได้อย่างถูกต้อง คณะผู้จัดทำแบ่งการทดสอบเป็น 5 ส่วน ส่วนละ 15 ครั้ง ดังตารางที่ 4.4 โดยทุกการทดสอบผู้ทดสอบปิดประตูด้วยมือจนสนิท และใช้เครือข่าย Wi-Fi เดียวกันตลอดการทดสอบ</w:t>
       </w:r>
     </w:p>
     <w:p>
@@ -2314,7 +3725,7 @@
           <w:bCs w:val="0"/>
           <w:iCs w:val="0"/>
         </w:rPr>
-        <w:t>ตารางที่ 4.3 แผนการทดสอบและเกณฑ์การประเมิน</w:t>
+        <w:t>ตารางที่ 4.4 แผนการทดสอบและเกณฑ์การประเมิน</w:t>
       </w:r>
     </w:p>
     <w:tbl>
@@ -2510,7 +3921,7 @@
                 <w:bCs w:val="0"/>
                 <w:iCs w:val="0"/>
               </w:rPr>
-              <w:t>ความถูกต้องในการยืนยันตัวตนและการปลดล็อก (4.5)</w:t>
+              <w:t>ความถูกต้องในการยืนยันตัวตนและการปลดล็อก (4.6)</w:t>
             </w:r>
           </w:p>
         </w:tc>
@@ -2631,7 +4042,7 @@
                 <w:bCs w:val="0"/>
                 <w:iCs w:val="0"/>
               </w:rPr>
-              <w:t>การบันทึกภาพหลักฐาน (4.6)</w:t>
+              <w:t>การบันทึกภาพหลักฐาน (4.7)</w:t>
             </w:r>
           </w:p>
         </w:tc>
@@ -2778,7 +4189,7 @@
                 <w:bCs w:val="0"/>
                 <w:iCs w:val="0"/>
               </w:rPr>
-              <w:t>การตรวจสอบสถานะประตูและการล็อกอัตโนมัติด้วย Reed Switch (4.7)</w:t>
+              <w:t>การตรวจสอบสถานะประตูและการล็อกอัตโนมัติด้วย Reed Switch (4.8)</w:t>
             </w:r>
           </w:p>
         </w:tc>
@@ -2900,7 +4311,7 @@
                 <w:bCs w:val="0"/>
                 <w:iCs w:val="0"/>
               </w:rPr>
-              <w:t>การแจ้งเตือนกรณีประตูปิดไม่สนิท (4.8)</w:t>
+              <w:t>การแจ้งเตือนกรณีประตูปิดไม่สนิท (4.9)</w:t>
             </w:r>
           </w:p>
         </w:tc>
@@ -3018,7 +4429,7 @@
                 <w:bCs w:val="0"/>
                 <w:iCs w:val="0"/>
               </w:rPr>
-              <w:t>ประสิทธิภาพของระบบโดยรวม (4.9)</w:t>
+              <w:t>ประสิทธิภาพของระบบโดยรวม (4.10)</w:t>
             </w:r>
           </w:p>
         </w:tc>
@@ -3222,11 +4633,12 @@
           <w:bCs w:val="1"/>
           <w:iCs w:val="0"/>
         </w:rPr>
-        <w:t>4.5 ผลการทดสอบความถูกต้องในการยืนยันตัวตนและการปลดล็อก</w:t>
+        <w:t>4.6 ผลการทดสอบความถูกต้องในการยืนยันตัวตนและการปลดล็อก</w:t>
       </w:r>
     </w:p>
     <w:p>
       <w:pPr>
+        <w:keepNext/>
         <w:spacing w:after="120" w:before="0" w:line="240" w:lineRule="auto"/>
         <w:ind w:left="0" w:firstLine="850"/>
         <w:jc w:val="both"/>
@@ -3266,7 +4678,147 @@
           <w:bCs w:val="0"/>
           <w:iCs w:val="0"/>
         </w:rPr>
-        <w:t xml:space="preserve"> กรณีรหัสได้รับอนุญาต กลอนต้องปลดล็อก 10 วินาทีพร้อมเสียงบัซเซอร์ 1 ครั้ง ส่วนกรณีไม่ได้รับอนุญาต กลอนต้องไม่ปลดล็อก บัซเซอร์ส่งเสียง 2 ครั้ง เซิร์ฟเวอร์บันทึกเหตุการณ์ qr_scan ผล denied พร้อมเหตุผลลงใน Access Log และแจ้งเตือนความพยายามเข้าถึงที่ถูกปฏิเสธผ่าน LINE บันทึกผลและระยะเวลาตอบสนองนับตั้งแต่อ่านรหัสจนกลอนทำงาน ดังภาพประกอบที่ 4.3 และตารางที่ 4.4</w:t>
+        <w:t xml:space="preserve"> โดยมีวิธีการทดสอบดังนี้</w:t>
+      </w:r>
+    </w:p>
+    <w:p>
+      <w:pPr>
+        <w:spacing w:after="80" w:before="0" w:line="240" w:lineRule="auto"/>
+        <w:ind w:left="1134"/>
+        <w:jc w:val="both"/>
+      </w:pPr>
+      <w:r>
+        <w:rPr>
+          <w:rFonts w:ascii="TH SarabunPSK" w:hAnsi="TH SarabunPSK" w:cs="TH SarabunPSK" w:eastAsia="TH SarabunPSK"/>
+          <w:b w:val="0"/>
+          <w:i w:val="0"/>
+          <w:sz w:val="32"/>
+          <w:szCs w:val="32"/>
+          <w:bCs w:val="0"/>
+          <w:iCs w:val="0"/>
+        </w:rPr>
+        <w:t>(1) สร้างรหัสคิวอาร์ผ่านหน้า LINE LIFF สำหรับการทดสอบรหัสที่ได้รับอนุญาต ส่วนรหัสที่ใช้แล้วใช้รหัสจากการทดสอบครั้งก่อนหน้า</w:t>
+      </w:r>
+    </w:p>
+    <w:p>
+      <w:pPr>
+        <w:spacing w:after="80" w:before="0" w:line="240" w:lineRule="auto"/>
+        <w:ind w:left="1134"/>
+        <w:jc w:val="both"/>
+      </w:pPr>
+      <w:r>
+        <w:rPr>
+          <w:rFonts w:ascii="TH SarabunPSK" w:hAnsi="TH SarabunPSK" w:cs="TH SarabunPSK" w:eastAsia="TH SarabunPSK"/>
+          <w:b w:val="0"/>
+          <w:i w:val="0"/>
+          <w:sz w:val="32"/>
+          <w:szCs w:val="32"/>
+          <w:bCs w:val="0"/>
+          <w:iCs w:val="0"/>
+        </w:rPr>
+        <w:t xml:space="preserve">(2) แสดงรหัสบนหน้าจอโทรศัพท์และสแกนที่โมดูล GM66 ที่ระยะ </w:t>
+      </w:r>
+      <w:r>
+        <w:rPr>
+          <w:rFonts w:ascii="TH SarabunPSK" w:hAnsi="TH SarabunPSK" w:cs="TH SarabunPSK" w:eastAsia="TH SarabunPSK"/>
+          <w:b w:val="0"/>
+          <w:i w:val="0"/>
+          <w:sz w:val="32"/>
+          <w:szCs w:val="32"/>
+          <w:bCs w:val="0"/>
+          <w:iCs w:val="0"/>
+          <w:highlight w:val="yellow"/>
+        </w:rPr>
+        <w:t>[ ]</w:t>
+      </w:r>
+      <w:r>
+        <w:rPr>
+          <w:rFonts w:ascii="TH SarabunPSK" w:hAnsi="TH SarabunPSK" w:cs="TH SarabunPSK" w:eastAsia="TH SarabunPSK"/>
+          <w:b w:val="0"/>
+          <w:i w:val="0"/>
+          <w:sz w:val="32"/>
+          <w:szCs w:val="32"/>
+          <w:bCs w:val="0"/>
+          <w:iCs w:val="0"/>
+        </w:rPr>
+        <w:t xml:space="preserve"> เซนติเมตร</w:t>
+      </w:r>
+    </w:p>
+    <w:p>
+      <w:pPr>
+        <w:spacing w:after="80" w:before="0" w:line="240" w:lineRule="auto"/>
+        <w:ind w:left="1134"/>
+        <w:jc w:val="both"/>
+      </w:pPr>
+      <w:r>
+        <w:rPr>
+          <w:rFonts w:ascii="TH SarabunPSK" w:hAnsi="TH SarabunPSK" w:cs="TH SarabunPSK" w:eastAsia="TH SarabunPSK"/>
+          <w:b w:val="0"/>
+          <w:i w:val="0"/>
+          <w:sz w:val="32"/>
+          <w:szCs w:val="32"/>
+          <w:bCs w:val="0"/>
+          <w:iCs w:val="0"/>
+        </w:rPr>
+        <w:t>(3) สังเกตการตอบสนอง กรณีรหัสได้รับอนุญาต กลอนต้องปลดล็อก 10 วินาทีพร้อมเสียงบัซเซอร์ 1 ครั้ง กรณีไม่ได้รับอนุญาต กลอนต้องไม่ปลดล็อก บัซเซอร์ส่งเสียง 2 ครั้ง และเซิร์ฟเวอร์แจ้งเตือนความพยายามเข้าถึงที่ถูกปฏิเสธผ่าน LINE</w:t>
+      </w:r>
+    </w:p>
+    <w:p>
+      <w:pPr>
+        <w:spacing w:after="80" w:before="0" w:line="240" w:lineRule="auto"/>
+        <w:ind w:left="1134"/>
+        <w:jc w:val="both"/>
+      </w:pPr>
+      <w:r>
+        <w:rPr>
+          <w:rFonts w:ascii="TH SarabunPSK" w:hAnsi="TH SarabunPSK" w:cs="TH SarabunPSK" w:eastAsia="TH SarabunPSK"/>
+          <w:b w:val="0"/>
+          <w:i w:val="0"/>
+          <w:sz w:val="32"/>
+          <w:szCs w:val="32"/>
+          <w:bCs w:val="0"/>
+          <w:iCs w:val="0"/>
+        </w:rPr>
+        <w:t>(4) บันทึกผล อ่านเวลาตอบสนองจาก Serial Monitor และตรวจเหตุการณ์ qr_scan (granted หรือ denied) ใน Access Log</w:t>
+      </w:r>
+    </w:p>
+    <w:p>
+      <w:pPr>
+        <w:spacing w:after="80" w:before="0" w:line="240" w:lineRule="auto"/>
+        <w:ind w:left="1134"/>
+        <w:jc w:val="both"/>
+      </w:pPr>
+      <w:r>
+        <w:rPr>
+          <w:rFonts w:ascii="TH SarabunPSK" w:hAnsi="TH SarabunPSK" w:cs="TH SarabunPSK" w:eastAsia="TH SarabunPSK"/>
+          <w:b w:val="0"/>
+          <w:i w:val="0"/>
+          <w:sz w:val="32"/>
+          <w:szCs w:val="32"/>
+          <w:bCs w:val="0"/>
+          <w:iCs w:val="0"/>
+        </w:rPr>
+        <w:t>(5) กรณีปลดล็อก ปิดประตูให้ล็อกก่อนเริ่มการทดสอบครั้งถัดไป</w:t>
+      </w:r>
+    </w:p>
+    <w:p>
+      <w:pPr>
+        <w:keepNext/>
+        <w:spacing w:after="120" w:before="0" w:line="240" w:lineRule="auto"/>
+        <w:ind w:left="0" w:firstLine="850"/>
+        <w:jc w:val="both"/>
+      </w:pPr>
+      <w:r>
+        <w:rPr>
+          <w:rFonts w:ascii="TH SarabunPSK" w:hAnsi="TH SarabunPSK" w:cs="TH SarabunPSK" w:eastAsia="TH SarabunPSK"/>
+          <w:b w:val="0"/>
+          <w:i w:val="0"/>
+          <w:sz w:val="32"/>
+          <w:szCs w:val="32"/>
+          <w:bCs w:val="0"/>
+          <w:iCs w:val="0"/>
+        </w:rPr>
+        <w:t>ผลการทดสอบแสดงดังภาพประกอบที่ 4.8 และตารางที่ 4.5</w:t>
       </w:r>
     </w:p>
     <w:p>
@@ -3306,7 +4858,7 @@
           <w:bCs w:val="0"/>
           <w:iCs w:val="0"/>
         </w:rPr>
-        <w:t>ภาพประกอบที่ 4.3 การทดสอบสแกนรหัสคิวอาร์ผ่านโมดูล GM66</w:t>
+        <w:t>ภาพประกอบที่ 4.8 การทดสอบสแกนรหัสคิวอาร์ผ่านโมดูล GM66</w:t>
       </w:r>
     </w:p>
     <w:p>
@@ -3327,7 +4879,7 @@
           <w:bCs w:val="0"/>
           <w:iCs w:val="0"/>
         </w:rPr>
-        <w:t>ตารางที่ 4.4 ผลการทดสอบความถูกต้องในการอ่านรหัสและการตอบสนองของระบบล็อก</w:t>
+        <w:t>ตารางที่ 4.5 ผลการทดสอบความถูกต้องในการอ่านรหัสและการตอบสนองของระบบล็อก</w:t>
       </w:r>
     </w:p>
     <w:tbl>
@@ -4882,7 +6434,7 @@
           <w:bCs w:val="0"/>
           <w:iCs w:val="0"/>
         </w:rPr>
-        <w:t>ตารางที่ 4.5 สรุปผลการทดสอบความถูกต้องในการยืนยันตัวตนและการปลดล็อก</w:t>
+        <w:t>ตารางที่ 4.6 สรุปผลการทดสอบความถูกต้องในการยืนยันตัวตนและการปลดล็อก</w:t>
       </w:r>
     </w:p>
     <w:tbl>
@@ -5382,7 +6934,7 @@
           <w:bCs w:val="0"/>
           <w:iCs w:val="0"/>
         </w:rPr>
-        <w:t xml:space="preserve">จากตารางที่ 4.4 และ 4.5 พบว่า GM66 อ่านรหัสได้สำเร็จ </w:t>
+        <w:t xml:space="preserve">จากตารางที่ 4.5 และตารางที่ 4.6 พบว่า GM66 อ่านรหัสได้สำเร็จ </w:t>
       </w:r>
       <w:r>
         <w:rPr>
@@ -5615,11 +7167,12 @@
           <w:bCs w:val="1"/>
           <w:iCs w:val="0"/>
         </w:rPr>
-        <w:t>4.6 ผลการทดสอบประสิทธิภาพการบันทึกภาพหลักฐาน</w:t>
+        <w:t>4.7 ผลการทดสอบประสิทธิภาพการบันทึกภาพหลักฐาน</w:t>
       </w:r>
     </w:p>
     <w:p>
       <w:pPr>
+        <w:keepNext/>
         <w:spacing w:after="120" w:before="0" w:line="240" w:lineRule="auto"/>
         <w:ind w:left="0" w:firstLine="850"/>
         <w:jc w:val="both"/>
@@ -5634,7 +7187,103 @@
           <w:bCs w:val="0"/>
           <w:iCs w:val="0"/>
         </w:rPr>
-        <w:t>การทดสอบนี้ตรวจสอบการเปลี่ยนสถานะจาก Door Open เป็น Locked ซึ่งเป็นตัวกระตุ้นให้บอร์ด ESP32 ส่งพัลส์ 200 ms ไปยัง ESP32-CAM ตามภาพประกอบที่ 3.9 จากนั้น ESP32-CAM สอบถามเซิร์ฟเวอร์ว่ามีเหตุการณ์ใดรอภาพอยู่ ถ่ายภาพ (เปิดไฟแฟลช) และส่งไปยังเซิร์ฟเวอร์ ซึ่งแจ้งเตือนการส่งมอบพัสดุพร้อมภาพผ่าน LINE หากไม่ได้รับภาพภายในเวลาที่กำหนดจะส่งข้อความแจ้งเตือนแบบไม่มีรูปภาพ ทดสอบ 15 ครั้ง โดยปลดล็อกด้วยรหัสคิวอาร์ เปิดประตู วางพัสดุ แล้วปิดประตูด้วยมือจนสนิททุกครั้ง ผลแสดงดังตารางที่ 4.6 และตัวอย่างข้อความแจ้งเตือนพร้อมภาพหลักฐานที่ได้รับผ่าน LINE แสดงดังภาพประกอบที่ 4.4</w:t>
+        <w:t>การทดสอบนี้ตรวจสอบการเปลี่ยนสถานะจาก Door Open เป็น Locked ซึ่งเป็นตัวกระตุ้นให้บอร์ด ESP32 ส่งพัลส์ 200 ms ไปยัง ESP32-CAM ตามภาพประกอบที่ 3.9 จากนั้น ESP32-CAM สอบถามเซิร์ฟเวอร์ว่ามีเหตุการณ์ใดรอภาพอยู่ ถ่ายภาพ (เปิดไฟแฟลช) และส่งไปยังเซิร์ฟเวอร์ ซึ่งแจ้งเตือนการส่งมอบพัสดุพร้อมภาพผ่าน LINE หากไม่ได้รับภาพภายในเวลาที่กำหนดจะส่งข้อความแจ้งเตือนแบบไม่มีรูปภาพ ทดสอบ 15 ครั้ง โดยมีวิธีการทดสอบดังนี้</w:t>
+      </w:r>
+    </w:p>
+    <w:p>
+      <w:pPr>
+        <w:spacing w:after="80" w:before="0" w:line="240" w:lineRule="auto"/>
+        <w:ind w:left="1134"/>
+        <w:jc w:val="both"/>
+      </w:pPr>
+      <w:r>
+        <w:rPr>
+          <w:rFonts w:ascii="TH SarabunPSK" w:hAnsi="TH SarabunPSK" w:cs="TH SarabunPSK" w:eastAsia="TH SarabunPSK"/>
+          <w:b w:val="0"/>
+          <w:i w:val="0"/>
+          <w:sz w:val="32"/>
+          <w:szCs w:val="32"/>
+          <w:bCs w:val="0"/>
+          <w:iCs w:val="0"/>
+        </w:rPr>
+        <w:t>(1) ปลดล็อกด้วยรหัสคิวอาร์ที่ได้รับอนุญาต</w:t>
+      </w:r>
+    </w:p>
+    <w:p>
+      <w:pPr>
+        <w:spacing w:after="80" w:before="0" w:line="240" w:lineRule="auto"/>
+        <w:ind w:left="1134"/>
+        <w:jc w:val="both"/>
+      </w:pPr>
+      <w:r>
+        <w:rPr>
+          <w:rFonts w:ascii="TH SarabunPSK" w:hAnsi="TH SarabunPSK" w:cs="TH SarabunPSK" w:eastAsia="TH SarabunPSK"/>
+          <w:b w:val="0"/>
+          <w:i w:val="0"/>
+          <w:sz w:val="32"/>
+          <w:szCs w:val="32"/>
+          <w:bCs w:val="0"/>
+          <w:iCs w:val="0"/>
+        </w:rPr>
+        <w:t>(2) เปิดประตู วางพัสดุ แล้วปิดประตูด้วยมือจนสนิท</w:t>
+      </w:r>
+    </w:p>
+    <w:p>
+      <w:pPr>
+        <w:spacing w:after="80" w:before="0" w:line="240" w:lineRule="auto"/>
+        <w:ind w:left="1134"/>
+        <w:jc w:val="both"/>
+      </w:pPr>
+      <w:r>
+        <w:rPr>
+          <w:rFonts w:ascii="TH SarabunPSK" w:hAnsi="TH SarabunPSK" w:cs="TH SarabunPSK" w:eastAsia="TH SarabunPSK"/>
+          <w:b w:val="0"/>
+          <w:i w:val="0"/>
+          <w:sz w:val="32"/>
+          <w:szCs w:val="32"/>
+          <w:bCs w:val="0"/>
+          <w:iCs w:val="0"/>
+        </w:rPr>
+        <w:t>(3) รอให้กลอนล็อกและรอรับข้อความแจ้งเตือนทาง LINE</w:t>
+      </w:r>
+    </w:p>
+    <w:p>
+      <w:pPr>
+        <w:spacing w:after="80" w:before="0" w:line="240" w:lineRule="auto"/>
+        <w:ind w:left="1134"/>
+        <w:jc w:val="both"/>
+      </w:pPr>
+      <w:r>
+        <w:rPr>
+          <w:rFonts w:ascii="TH SarabunPSK" w:hAnsi="TH SarabunPSK" w:cs="TH SarabunPSK" w:eastAsia="TH SarabunPSK"/>
+          <w:b w:val="0"/>
+          <w:i w:val="0"/>
+          <w:sz w:val="32"/>
+          <w:szCs w:val="32"/>
+          <w:bCs w:val="0"/>
+          <w:iCs w:val="0"/>
+        </w:rPr>
+        <w:t>(4) บันทึกเวลาเหตุการณ์ locked และ image_capture ใน Access Log และตรวจสอบภาพที่ได้รับ</w:t>
+      </w:r>
+    </w:p>
+    <w:p>
+      <w:pPr>
+        <w:keepNext/>
+        <w:spacing w:after="120" w:before="0" w:line="240" w:lineRule="auto"/>
+        <w:ind w:left="0" w:firstLine="850"/>
+        <w:jc w:val="both"/>
+      </w:pPr>
+      <w:r>
+        <w:rPr>
+          <w:rFonts w:ascii="TH SarabunPSK" w:hAnsi="TH SarabunPSK" w:cs="TH SarabunPSK" w:eastAsia="TH SarabunPSK"/>
+          <w:b w:val="0"/>
+          <w:i w:val="0"/>
+          <w:sz w:val="32"/>
+          <w:szCs w:val="32"/>
+          <w:bCs w:val="0"/>
+          <w:iCs w:val="0"/>
+        </w:rPr>
+        <w:t>ผลการทดสอบแสดงดังตารางที่ 4.7 และตัวอย่างข้อความแจ้งเตือนพร้อมภาพหลักฐานที่ได้รับผ่าน LINE แสดงดังภาพประกอบที่ 4.9</w:t>
       </w:r>
     </w:p>
     <w:p>
@@ -5655,7 +7304,7 @@
           <w:bCs w:val="0"/>
           <w:iCs w:val="0"/>
         </w:rPr>
-        <w:t>ตารางที่ 4.6 ผลการตรวจสอบสถานะการล็อกและการทำงานของระบบบันทึกภาพหลักฐาน</w:t>
+        <w:t>ตารางที่ 4.7 ผลการตรวจสอบสถานะการล็อกและการทำงานของระบบบันทึกภาพหลักฐาน</w:t>
       </w:r>
     </w:p>
     <w:tbl>
@@ -6830,7 +8479,7 @@
           <w:bCs w:val="0"/>
           <w:iCs w:val="0"/>
         </w:rPr>
-        <w:t>ภาพประกอบที่ 4.4 ตัวอย่างข้อความแจ้งเตือนพร้อมภาพหลักฐานที่ได้รับผ่าน LINE</w:t>
+        <w:t>ภาพประกอบที่ 4.9 ตัวอย่างข้อความแจ้งเตือนพร้อมภาพหลักฐานที่ได้รับผ่าน LINE</w:t>
       </w:r>
     </w:p>
     <w:p>
@@ -6874,7 +8523,7 @@
           <w:bCs w:val="0"/>
           <w:iCs w:val="0"/>
         </w:rPr>
-        <w:t xml:space="preserve"> ดังตารางที่ 4.7</w:t>
+        <w:t xml:space="preserve"> โดยกดปุ่มปลดล็อก เปิดและปิดประตู แล้วตรวจ Access Log ว่ามีเหตุการณ์ manual_unlock และไม่มีเหตุการณ์ image_capture ดังตารางที่ 4.8</w:t>
       </w:r>
     </w:p>
     <w:p>
@@ -6895,7 +8544,7 @@
           <w:bCs w:val="0"/>
           <w:iCs w:val="0"/>
         </w:rPr>
-        <w:t>ตารางที่ 4.7 ผลการตรวจสอบการปลดล็อกด้วยปุ่มกดว่าไม่มีการบันทึกภาพ</w:t>
+        <w:t>ตารางที่ 4.8 ผลการตรวจสอบการปลดล็อกด้วยปุ่มกดว่าไม่มีการบันทึกภาพ</w:t>
       </w:r>
     </w:p>
     <w:tbl>
@@ -7380,7 +9029,7 @@
           <w:bCs w:val="0"/>
           <w:iCs w:val="0"/>
         </w:rPr>
-        <w:t xml:space="preserve">จากตารางที่ 4.6 พบว่า กลอนสั่งล็อกสำเร็จ </w:t>
+        <w:t xml:space="preserve">จากตารางที่ 4.7 พบว่า กลอนสั่งล็อกสำเร็จ </w:t>
       </w:r>
       <w:r>
         <w:rPr>
@@ -7555,7 +9204,7 @@
           <w:bCs w:val="0"/>
           <w:iCs w:val="0"/>
         </w:rPr>
-        <w:t xml:space="preserve"> ผลจากตารางที่ 4.7 แสดงว่าการปลดล็อกด้วยปุ่ม </w:t>
+        <w:t xml:space="preserve"> ผลจากตารางที่ 4.8 แสดงว่าการปลดล็อกด้วยปุ่ม </w:t>
       </w:r>
       <w:r>
         <w:rPr>
@@ -7650,11 +9299,12 @@
           <w:bCs w:val="1"/>
           <w:iCs w:val="0"/>
         </w:rPr>
-        <w:t>4.7 ผลการทดสอบการตรวจสอบสถานะประตูและการล็อกอัตโนมัติด้วย Reed Switch MC-38</w:t>
+        <w:t>4.8 ผลการทดสอบการตรวจสอบสถานะประตูและการล็อกอัตโนมัติด้วย Reed Switch MC-38</w:t>
       </w:r>
     </w:p>
     <w:p>
       <w:pPr>
+        <w:keepNext/>
         <w:spacing w:after="120" w:before="0" w:line="240" w:lineRule="auto"/>
         <w:ind w:left="0" w:firstLine="850"/>
         <w:jc w:val="both"/>
@@ -7694,7 +9344,84 @@
           <w:bCs w:val="0"/>
           <w:iCs w:val="0"/>
         </w:rPr>
-        <w:t xml:space="preserve"> และสั่งล็อกกลอนทันที ผู้ทดสอบปิดประตูด้วยมือในทุกครั้ง ทดสอบ 15 ครั้ง ดังตารางที่ 4.8 และตัวอย่างการทดสอบแสดงดังภาพประกอบที่ 4.5</w:t>
+        <w:t xml:space="preserve"> และสั่งล็อกกลอนทันที ทดสอบ 15 ครั้ง โดยมีวิธีการทดสอบดังนี้</w:t>
+      </w:r>
+    </w:p>
+    <w:p>
+      <w:pPr>
+        <w:spacing w:after="80" w:before="0" w:line="240" w:lineRule="auto"/>
+        <w:ind w:left="1134"/>
+        <w:jc w:val="both"/>
+      </w:pPr>
+      <w:r>
+        <w:rPr>
+          <w:rFonts w:ascii="TH SarabunPSK" w:hAnsi="TH SarabunPSK" w:cs="TH SarabunPSK" w:eastAsia="TH SarabunPSK"/>
+          <w:b w:val="0"/>
+          <w:i w:val="0"/>
+          <w:sz w:val="32"/>
+          <w:szCs w:val="32"/>
+          <w:bCs w:val="0"/>
+          <w:iCs w:val="0"/>
+        </w:rPr>
+        <w:t>(1) ปลดล็อกด้วยรหัสคิวอาร์ที่ได้รับอนุญาตและเปิดประตู</w:t>
+      </w:r>
+    </w:p>
+    <w:p>
+      <w:pPr>
+        <w:spacing w:after="80" w:before="0" w:line="240" w:lineRule="auto"/>
+        <w:ind w:left="1134"/>
+        <w:jc w:val="both"/>
+      </w:pPr>
+      <w:r>
+        <w:rPr>
+          <w:rFonts w:ascii="TH SarabunPSK" w:hAnsi="TH SarabunPSK" w:cs="TH SarabunPSK" w:eastAsia="TH SarabunPSK"/>
+          <w:b w:val="0"/>
+          <w:i w:val="0"/>
+          <w:sz w:val="32"/>
+          <w:szCs w:val="32"/>
+          <w:bCs w:val="0"/>
+          <w:iCs w:val="0"/>
+        </w:rPr>
+        <w:t>(2) ปิดประตูด้วยมือจนสนิท</w:t>
+      </w:r>
+    </w:p>
+    <w:p>
+      <w:pPr>
+        <w:spacing w:after="80" w:before="0" w:line="240" w:lineRule="auto"/>
+        <w:ind w:left="1134"/>
+        <w:jc w:val="both"/>
+      </w:pPr>
+      <w:r>
+        <w:rPr>
+          <w:rFonts w:ascii="TH SarabunPSK" w:hAnsi="TH SarabunPSK" w:cs="TH SarabunPSK" w:eastAsia="TH SarabunPSK"/>
+          <w:b w:val="0"/>
+          <w:i w:val="0"/>
+          <w:sz w:val="32"/>
+          <w:szCs w:val="32"/>
+          <w:bCs w:val="0"/>
+          <w:iCs w:val="0"/>
+        </w:rPr>
+        <w:t>(3) สังเกตว่ากลอนล็อกและตรวจเหตุการณ์ locked ใน Access Log หรือสถานะประตูในส่วน DEVICE STATUS ของแดชบอร์ด</w:t>
+      </w:r>
+    </w:p>
+    <w:p>
+      <w:pPr>
+        <w:keepNext/>
+        <w:spacing w:after="120" w:before="0" w:line="240" w:lineRule="auto"/>
+        <w:ind w:left="0" w:firstLine="850"/>
+        <w:jc w:val="both"/>
+      </w:pPr>
+      <w:r>
+        <w:rPr>
+          <w:rFonts w:ascii="TH SarabunPSK" w:hAnsi="TH SarabunPSK" w:cs="TH SarabunPSK" w:eastAsia="TH SarabunPSK"/>
+          <w:b w:val="0"/>
+          <w:i w:val="0"/>
+          <w:sz w:val="32"/>
+          <w:szCs w:val="32"/>
+          <w:bCs w:val="0"/>
+          <w:iCs w:val="0"/>
+        </w:rPr>
+        <w:t>ผลการทดสอบแสดงดังตารางที่ 4.9 และภาพประกอบที่ 4.10</w:t>
       </w:r>
     </w:p>
     <w:p>
@@ -7715,7 +9442,7 @@
           <w:bCs w:val="0"/>
           <w:iCs w:val="0"/>
         </w:rPr>
-        <w:t>ตารางที่ 4.8 ผลการทำงานของระบบการตรวจสอบสถานะประตูและการล็อก</w:t>
+        <w:t>ตารางที่ 4.9 ผลการทำงานของระบบการตรวจสอบสถานะประตูและการล็อก</w:t>
       </w:r>
     </w:p>
     <w:tbl>
@@ -8666,7 +10393,7 @@
           <w:bCs w:val="0"/>
           <w:iCs w:val="0"/>
         </w:rPr>
-        <w:t>ภาพประกอบที่ 4.5 การทดสอบการตรวจสอบสถานะประตูด้วย Reed Switch MC-38</w:t>
+        <w:t>ภาพประกอบที่ 4.10 การทดสอบการตรวจสอบสถานะประตูด้วย Reed Switch MC-38</w:t>
       </w:r>
     </w:p>
     <w:p>
@@ -8685,7 +10412,7 @@
           <w:bCs w:val="0"/>
           <w:iCs w:val="0"/>
         </w:rPr>
-        <w:t xml:space="preserve">จากตารางที่ 4.8 พบว่า ระบบตรวจพบสถานะประตูปิดสนิทถูกต้อง </w:t>
+        <w:t xml:space="preserve">จากตารางที่ 4.9 พบว่า ระบบตรวจพบสถานะประตูปิดสนิทถูกต้อง </w:t>
       </w:r>
       <w:r>
         <w:rPr>
@@ -8818,11 +10545,12 @@
           <w:bCs w:val="1"/>
           <w:iCs w:val="0"/>
         </w:rPr>
-        <w:t>4.8 ผลการทดสอบการแจ้งเตือนกรณีประตูปิดไม่สนิทและความเสถียรของระบบ</w:t>
+        <w:t>4.9 ผลการทดสอบการแจ้งเตือนกรณีประตูปิดไม่สนิทและความเสถียรของระบบ</w:t>
       </w:r>
     </w:p>
     <w:p>
       <w:pPr>
+        <w:keepNext/>
         <w:spacing w:after="120" w:before="0" w:line="240" w:lineRule="auto"/>
         <w:ind w:left="0" w:firstLine="850"/>
         <w:jc w:val="both"/>
@@ -8837,7 +10565,103 @@
           <w:bCs w:val="0"/>
           <w:iCs w:val="0"/>
         </w:rPr>
-        <w:t>เนื่องจากต้นแบบไม่มีโช้คอัพประตู ผู้ใช้ต้องปิดประตูด้วยมือ จึงมีโอกาสที่ประตูปิดไม่สนิท ระบบจึงออกแบบให้แจ้งเตือนเมื่อประตูเปิดค้างเกิน 60 วินาที (T_ajar) โดยเซิร์ฟเวอร์บันทึกเหตุการณ์ door_ajar และส่งข้อความผ่าน LINE ครั้งเดียว ส่วนบัซเซอร์ที่ตัวเครื่องส่งเสียงเตือนซ้ำจนกว่าจะปิดประตู การทดสอบนี้จำลองกรณีมีวัตถุกีดขวางทำให้ประตูปิดไม่สนิท เพื่อวัดความถูกต้องของการแจ้งเตือนด้วยเสียงและผ่าน LINE Messaging API ทดสอบ 15 ครั้ง ดังตารางที่ 4.9 และตัวอย่างข้อความแจ้งเตือนที่ได้รับแสดงดังภาพประกอบที่ 4.6</w:t>
+        <w:t>เนื่องจากต้นแบบไม่มีโช้คอัพประตู ผู้ใช้ต้องปิดประตูด้วยมือ จึงมีโอกาสที่ประตูปิดไม่สนิท ระบบจึงออกแบบให้แจ้งเตือนเมื่อประตูเปิดค้างเกิน 60 วินาที (T_ajar) โดยเซิร์ฟเวอร์บันทึกเหตุการณ์ door_ajar และส่งข้อความผ่าน LINE ครั้งเดียว ส่วนบัซเซอร์ที่ตัวเครื่องส่งเสียงเตือนซ้ำจนกว่าจะปิดประตู การทดสอบนี้จำลองกรณีมีวัตถุกีดขวางทำให้ประตูปิดไม่สนิท เพื่อวัดความถูกต้องของการแจ้งเตือนด้วยเสียงและผ่าน LINE Messaging API ทดสอบ 15 ครั้ง โดยมีวิธีการทดสอบดังนี้</w:t>
+      </w:r>
+    </w:p>
+    <w:p>
+      <w:pPr>
+        <w:spacing w:after="80" w:before="0" w:line="240" w:lineRule="auto"/>
+        <w:ind w:left="1134"/>
+        <w:jc w:val="both"/>
+      </w:pPr>
+      <w:r>
+        <w:rPr>
+          <w:rFonts w:ascii="TH SarabunPSK" w:hAnsi="TH SarabunPSK" w:cs="TH SarabunPSK" w:eastAsia="TH SarabunPSK"/>
+          <w:b w:val="0"/>
+          <w:i w:val="0"/>
+          <w:sz w:val="32"/>
+          <w:szCs w:val="32"/>
+          <w:bCs w:val="0"/>
+          <w:iCs w:val="0"/>
+        </w:rPr>
+        <w:t>(1) ปลดล็อกด้วยรหัสคิวอาร์ที่ได้รับอนุญาตและเปิดประตู</w:t>
+      </w:r>
+    </w:p>
+    <w:p>
+      <w:pPr>
+        <w:spacing w:after="80" w:before="0" w:line="240" w:lineRule="auto"/>
+        <w:ind w:left="1134"/>
+        <w:jc w:val="both"/>
+      </w:pPr>
+      <w:r>
+        <w:rPr>
+          <w:rFonts w:ascii="TH SarabunPSK" w:hAnsi="TH SarabunPSK" w:cs="TH SarabunPSK" w:eastAsia="TH SarabunPSK"/>
+          <w:b w:val="0"/>
+          <w:i w:val="0"/>
+          <w:sz w:val="32"/>
+          <w:szCs w:val="32"/>
+          <w:bCs w:val="0"/>
+          <w:iCs w:val="0"/>
+        </w:rPr>
+        <w:t>(2) วางวัตถุกีดขวางให้ประตูปิดไม่สนิทและเริ่มจับเวลา</w:t>
+      </w:r>
+    </w:p>
+    <w:p>
+      <w:pPr>
+        <w:spacing w:after="80" w:before="0" w:line="240" w:lineRule="auto"/>
+        <w:ind w:left="1134"/>
+        <w:jc w:val="both"/>
+      </w:pPr>
+      <w:r>
+        <w:rPr>
+          <w:rFonts w:ascii="TH SarabunPSK" w:hAnsi="TH SarabunPSK" w:cs="TH SarabunPSK" w:eastAsia="TH SarabunPSK"/>
+          <w:b w:val="0"/>
+          <w:i w:val="0"/>
+          <w:sz w:val="32"/>
+          <w:szCs w:val="32"/>
+          <w:bCs w:val="0"/>
+          <w:iCs w:val="0"/>
+        </w:rPr>
+        <w:t>(3) เมื่อครบ 60 วินาที สังเกตเสียงเตือนจากบัซเซอร์และข้อความ LINE</w:t>
+      </w:r>
+    </w:p>
+    <w:p>
+      <w:pPr>
+        <w:spacing w:after="80" w:before="0" w:line="240" w:lineRule="auto"/>
+        <w:ind w:left="1134"/>
+        <w:jc w:val="both"/>
+      </w:pPr>
+      <w:r>
+        <w:rPr>
+          <w:rFonts w:ascii="TH SarabunPSK" w:hAnsi="TH SarabunPSK" w:cs="TH SarabunPSK" w:eastAsia="TH SarabunPSK"/>
+          <w:b w:val="0"/>
+          <w:i w:val="0"/>
+          <w:sz w:val="32"/>
+          <w:szCs w:val="32"/>
+          <w:bCs w:val="0"/>
+          <w:iCs w:val="0"/>
+        </w:rPr>
+        <w:t>(4) บันทึกเวลาเหตุการณ์ door_open และ door_ajar ใน Access Log จากนั้นนำวัตถุออกและปิดประตูให้ล็อกก่อนเริ่มครั้งถัดไป</w:t>
+      </w:r>
+    </w:p>
+    <w:p>
+      <w:pPr>
+        <w:keepNext/>
+        <w:spacing w:after="120" w:before="0" w:line="240" w:lineRule="auto"/>
+        <w:ind w:left="0" w:firstLine="850"/>
+        <w:jc w:val="both"/>
+      </w:pPr>
+      <w:r>
+        <w:rPr>
+          <w:rFonts w:ascii="TH SarabunPSK" w:hAnsi="TH SarabunPSK" w:cs="TH SarabunPSK" w:eastAsia="TH SarabunPSK"/>
+          <w:b w:val="0"/>
+          <w:i w:val="0"/>
+          <w:sz w:val="32"/>
+          <w:szCs w:val="32"/>
+          <w:bCs w:val="0"/>
+          <w:iCs w:val="0"/>
+        </w:rPr>
+        <w:t>ผลการทดสอบแสดงดังตารางที่ 4.10 และตัวอย่างข้อความที่ได้รับแสดงดังภาพประกอบที่ 4.11</w:t>
       </w:r>
     </w:p>
     <w:p>
@@ -8858,7 +10682,7 @@
           <w:bCs w:val="0"/>
           <w:iCs w:val="0"/>
         </w:rPr>
-        <w:t>ตารางที่ 4.9 ผลการส่งสัญญาณแจ้งเตือนความปลอดภัยและแจ้งเตือนผ่าน IoT</w:t>
+        <w:t>ตารางที่ 4.10 ผลการส่งสัญญาณแจ้งเตือนความปลอดภัยและแจ้งเตือนผ่าน IoT</w:t>
       </w:r>
     </w:p>
     <w:tbl>
@@ -10033,7 +11857,7 @@
           <w:bCs w:val="0"/>
           <w:iCs w:val="0"/>
         </w:rPr>
-        <w:t>ภาพประกอบที่ 4.6 ตัวอย่างข้อความแจ้งเตือนกรณีประตูปิดไม่สนิทผ่าน LINE</w:t>
+        <w:t>ภาพประกอบที่ 4.11 ตัวอย่างข้อความแจ้งเตือนกรณีประตูปิดไม่สนิทผ่าน LINE</w:t>
       </w:r>
     </w:p>
     <w:p>
@@ -10052,7 +11876,7 @@
           <w:bCs w:val="0"/>
           <w:iCs w:val="0"/>
         </w:rPr>
-        <w:t xml:space="preserve">จากตารางที่ 4.9 พบว่า มีเสียงเตือน </w:t>
+        <w:t xml:space="preserve">จากตารางที่ 4.10 พบว่า มีเสียงเตือน </w:t>
       </w:r>
       <w:r>
         <w:rPr>
@@ -10235,11 +12059,12 @@
           <w:bCs w:val="1"/>
           <w:iCs w:val="0"/>
         </w:rPr>
-        <w:t>4.9 ผลการทดสอบประสิทธิภาพและความต่อเนื่องของระบบโดยรวม</w:t>
+        <w:t>4.10 ผลการทดสอบประสิทธิภาพและความต่อเนื่องของระบบโดยรวม</w:t>
       </w:r>
     </w:p>
     <w:p>
       <w:pPr>
+        <w:keepNext/>
         <w:spacing w:after="120" w:before="0" w:line="240" w:lineRule="auto"/>
         <w:ind w:left="0" w:firstLine="850"/>
         <w:jc w:val="both"/>
@@ -10254,7 +12079,7 @@
           <w:bCs w:val="0"/>
           <w:iCs w:val="0"/>
         </w:rPr>
-        <w:t>การทดสอบนี้ประเมินการทำงานร่วมกันของระบบแบบครบวงจร (End-to-End Testing) ทั้งฮาร์ดแวร์และซอฟต์แวร์ ตั้งแต่การอ่านรหัสคิวอาร์จนถึงการแจ้งเตือนผู้ใช้งาน ทดสอบซ้ำ 15 ครั้ง ผู้ทดสอบปิดประตูด้วยมือจนสนิท แต่ละครั้งประกอบด้วย 7 ขั้นตอน ดังตารางที่ 4.10</w:t>
+        <w:t>การทดสอบนี้ประเมินการทำงานร่วมกันของระบบแบบครบวงจร (End-to-End Testing) ทั้งฮาร์ดแวร์และซอฟต์แวร์ ตั้งแต่การอ่านรหัสคิวอาร์จนถึงการแจ้งเตือนผู้ใช้งาน ทดสอบซ้ำ 15 ครั้ง ผู้ทดสอบปิดประตูด้วยมือจนสนิท แต่ละครั้งประกอบด้วย 7 ขั้นตอน ตามลำดับในตารางที่ 4.11</w:t>
       </w:r>
     </w:p>
     <w:p>
@@ -10275,7 +12100,7 @@
           <w:bCs w:val="0"/>
           <w:iCs w:val="0"/>
         </w:rPr>
-        <w:t>ตารางที่ 4.10 ผลการทดสอบประสิทธิภาพและอัตราความสำเร็จของระบบโดยรวม</w:t>
+        <w:t>ตารางที่ 4.11 ผลการทดสอบประสิทธิภาพและอัตราความสำเร็จของระบบโดยรวม</w:t>
       </w:r>
     </w:p>
     <w:tbl>
@@ -12588,7 +14413,7 @@
           <w:bCs w:val="0"/>
           <w:iCs w:val="0"/>
         </w:rPr>
-        <w:t xml:space="preserve">จากตารางที่ 4.10 พบว่า ระบบทำงานครบทั้ง 7 ขั้นตอนอย่างสมบูรณ์ </w:t>
+        <w:t xml:space="preserve">จากตารางที่ 4.11 พบว่า ระบบทำงานครบทั้ง 7 ขั้นตอนอย่างสมบูรณ์ </w:t>
       </w:r>
       <w:r>
         <w:rPr>
@@ -12771,7 +14596,7 @@
           <w:bCs w:val="1"/>
           <w:iCs w:val="0"/>
         </w:rPr>
-        <w:t>4.10 อภิปรายผล</w:t>
+        <w:t>4.11 อภิปรายผล</w:t>
       </w:r>
     </w:p>
     <w:p>
@@ -12790,7 +14615,7 @@
           <w:bCs w:val="1"/>
           <w:iCs w:val="0"/>
         </w:rPr>
-        <w:t>4.10.1 เปรียบเทียบผลกับวัตถุประสงค์</w:t>
+        <w:t>4.11.1 เปรียบเทียบผลกับวัตถุประสงค์</w:t>
       </w:r>
     </w:p>
     <w:p>
@@ -12810,7 +14635,7 @@
           <w:bCs w:val="0"/>
           <w:iCs w:val="0"/>
         </w:rPr>
-        <w:t>ผลการเปรียบเทียบผลการทดลองกับขอบเขตการศึกษาตามหัวข้อ 1.3 แสดงดังตารางที่ 4.11</w:t>
+        <w:t>ผลการเปรียบเทียบผลการทดลองกับขอบเขตการศึกษาตามหัวข้อ 1.3 แสดงดังตารางที่ 4.12</w:t>
       </w:r>
     </w:p>
     <w:p>
@@ -12831,7 +14656,7 @@
           <w:bCs w:val="0"/>
           <w:iCs w:val="0"/>
         </w:rPr>
-        <w:t>ตารางที่ 4.11 เปรียบเทียบผลการทดลองกับขอบเขตการศึกษา</w:t>
+        <w:t>ตารางที่ 4.12 เปรียบเทียบผลการทดลองกับขอบเขตการศึกษา</w:t>
       </w:r>
     </w:p>
     <w:tbl>
@@ -13001,7 +14826,7 @@
                 <w:bCs w:val="0"/>
                 <w:iCs w:val="0"/>
               </w:rPr>
-              <w:t>หัวข้อ 4.1 และ 4.3</w:t>
+              <w:t>หัวข้อ 4.1 และ 4.4</w:t>
             </w:r>
           </w:p>
         </w:tc>
@@ -13090,20 +14915,19 @@
           <w:p>
             <w:pPr>
               <w:keepNext/>
-              <w:jc w:val="center"/>
-            </w:pPr>
-            <w:r/>
-            <w:r>
-              <w:rPr>
-                <w:rFonts w:ascii="TH SarabunPSK" w:hAnsi="TH SarabunPSK" w:cs="TH SarabunPSK" w:eastAsia="TH SarabunPSK"/>
-                <w:b w:val="0"/>
-                <w:i w:val="0"/>
-                <w:sz w:val="28"/>
-                <w:szCs w:val="28"/>
-                <w:bCs w:val="0"/>
-                <w:iCs w:val="0"/>
-              </w:rPr>
-              <w:t>ตารางที่ 4.4–4.5</w:t>
+            </w:pPr>
+            <w:r/>
+            <w:r>
+              <w:rPr>
+                <w:rFonts w:ascii="TH SarabunPSK" w:hAnsi="TH SarabunPSK" w:cs="TH SarabunPSK" w:eastAsia="TH SarabunPSK"/>
+                <w:b w:val="0"/>
+                <w:i w:val="0"/>
+                <w:sz w:val="28"/>
+                <w:szCs w:val="28"/>
+                <w:bCs w:val="0"/>
+                <w:iCs w:val="0"/>
+              </w:rPr>
+              <w:t>หัวข้อ 4.3 และตารางที่ 4.5–4.6</w:t>
             </w:r>
           </w:p>
         </w:tc>
@@ -13206,7 +15030,7 @@
                 <w:bCs w:val="0"/>
                 <w:iCs w:val="0"/>
               </w:rPr>
-              <w:t>ตารางที่ 4.6–4.8</w:t>
+              <w:t>ตารางที่ 4.7–4.9</w:t>
             </w:r>
           </w:p>
         </w:tc>
@@ -13296,20 +15120,19 @@
           <w:p>
             <w:pPr>
               <w:keepNext/>
-              <w:jc w:val="center"/>
-            </w:pPr>
-            <w:r/>
-            <w:r>
-              <w:rPr>
-                <w:rFonts w:ascii="TH SarabunPSK" w:hAnsi="TH SarabunPSK" w:cs="TH SarabunPSK" w:eastAsia="TH SarabunPSK"/>
-                <w:b w:val="0"/>
-                <w:i w:val="0"/>
-                <w:sz w:val="28"/>
-                <w:szCs w:val="28"/>
-                <w:bCs w:val="0"/>
-                <w:iCs w:val="0"/>
-              </w:rPr>
-              <w:t>ตารางที่ 4.9</w:t>
+            </w:pPr>
+            <w:r/>
+            <w:r>
+              <w:rPr>
+                <w:rFonts w:ascii="TH SarabunPSK" w:hAnsi="TH SarabunPSK" w:cs="TH SarabunPSK" w:eastAsia="TH SarabunPSK"/>
+                <w:b w:val="0"/>
+                <w:i w:val="0"/>
+                <w:sz w:val="28"/>
+                <w:szCs w:val="28"/>
+                <w:bCs w:val="0"/>
+                <w:iCs w:val="0"/>
+              </w:rPr>
+              <w:t>หัวข้อ 4.3.3 และตารางที่ 4.10</w:t>
             </w:r>
           </w:p>
         </w:tc>
@@ -13410,7 +15233,7 @@
                 <w:bCs w:val="0"/>
                 <w:iCs w:val="0"/>
               </w:rPr>
-              <w:t>ตารางที่ 4.10</w:t>
+              <w:t>ตารางที่ 4.11</w:t>
             </w:r>
           </w:p>
         </w:tc>
@@ -13485,7 +15308,7 @@
           <w:bCs w:val="1"/>
           <w:iCs w:val="0"/>
         </w:rPr>
-        <w:t>4.10.2 อภิปราย</w:t>
+        <w:t>4.11.2 อภิปราย</w:t>
       </w:r>
     </w:p>
     <w:p>
@@ -13504,7 +15327,7 @@
           <w:bCs w:val="0"/>
           <w:iCs w:val="0"/>
         </w:rPr>
-        <w:t xml:space="preserve">(1) การยืนยันตัวตน ต้นแบบใช้รหัสคิวอาร์สุ่มแบบ UUID ใช้ได้ครั้งเดียว มีอายุ 24 ชั่วโมง และตรวจสอบภายใน 3 วินาที ผลในตารางที่ 4.5 </w:t>
+        <w:t xml:space="preserve">(1) การยืนยันตัวตน ต้นแบบใช้รหัสคิวอาร์สุ่มแบบ UUID ใช้ได้ครั้งเดียว มีอายุ 24 ชั่วโมง และตรวจสอบภายใน 3 วินาที ผลในตารางที่ 4.6 </w:t>
       </w:r>
       <w:r>
         <w:rPr>
@@ -13623,7 +15446,7 @@
           <w:bCs w:val="0"/>
           <w:iCs w:val="0"/>
         </w:rPr>
-        <w:t xml:space="preserve"> คือล็อกเมื่อไม่มีไฟและปลดล็อกเมื่อจ่ายไฟ ผลการวัดแรงดันเกตในตารางที่ 4.2 </w:t>
+        <w:t xml:space="preserve"> คือล็อกเมื่อไม่มีไฟและปลดล็อกเมื่อจ่ายไฟ ผลการวัดแรงดันเกตในตารางที่ 4.3 </w:t>
       </w:r>
       <w:r>
         <w:rPr>
@@ -13717,7 +15540,7 @@
           <w:bCs w:val="0"/>
           <w:iCs w:val="0"/>
         </w:rPr>
-        <w:t xml:space="preserve"> ให้สถานะแบบไบนารีที่ชัดเจน ผลในตารางที่ 4.8 </w:t>
+        <w:t xml:space="preserve"> ให้สถานะแบบไบนารีที่ชัดเจน ผลในตารางที่ 4.9 </w:t>
       </w:r>
       <w:r>
         <w:rPr>
@@ -13761,7 +15584,7 @@
           <w:bCs w:val="0"/>
           <w:iCs w:val="0"/>
         </w:rPr>
-        <w:t xml:space="preserve">(4) การบันทึกภาพและการแจ้งเตือน ผลในตารางที่ 4.6 และ 4.9 </w:t>
+        <w:t xml:space="preserve">(4) การบันทึกภาพและการแจ้งเตือน ผลในตารางที่ 4.7 และตารางที่ 4.10 </w:t>
       </w:r>
       <w:r>
         <w:rPr>
@@ -13955,7 +15778,7 @@
           <w:bCs w:val="0"/>
           <w:iCs w:val="0"/>
         </w:rPr>
-        <w:t xml:space="preserve">(5) ความเสถียรโดยรวม ผลในตารางที่ 4.10 </w:t>
+        <w:t xml:space="preserve">(5) ความเสถียรโดยรวม ผลในตารางที่ 4.11 </w:t>
       </w:r>
       <w:r>
         <w:rPr>
@@ -13999,7 +15822,7 @@
           <w:bCs w:val="1"/>
           <w:iCs w:val="0"/>
         </w:rPr>
-        <w:t>4.10.3 ข้อจำกัดของระบบ</w:t>
+        <w:t>4.11.3 ข้อจำกัดของระบบ</w:t>
       </w:r>
     </w:p>
     <w:p>

</xml_diff>

<commit_message>
Chapter 4: refine all lead-in paragraphs and section prose
Co-Authored-By: Claude Sonnet 5.5 <noreply@anthropic.com>
Claude-Session: https://claude.ai/code/session_01VnBozHXF9mmTyHiTgVtwAM
</commit_message>
<xml_diff>
--- a/บทที่4_ไฟนอล_เฉพาะบท.docx
+++ b/บทที่4_ไฟนอล_เฉพาะบท.docx
@@ -88,7 +88,7 @@
           <w:bCs w:val="0"/>
           <w:iCs w:val="0"/>
         </w:rPr>
-        <w:t>ในบทนี้นำเสนอผลการสร้างและทดสอบต้นแบบกล่องรับพัสดุไอโอทีอัจฉริยะตามที่ออกแบบไว้ในบทที่ 3 โดยแบ่งเป็น 3 ส่วน ได้แก่ (1) ผลการสร้างต้นแบบ ประกอบด้วยโครงสร้างกล่อง การติดตั้งอุปกรณ์ วงจรควบคุมก่อนติดตั้ง และระบบซอฟต์แวร์ที่ผู้ใช้งานมองเห็น (หัวข้อ 4.1–4.3) (2) ผลการตรวจวัดแรงดันไฟเลี้ยงและวงจรขับกลอน (หัวข้อ 4.4) และ (3) ผลการทดสอบสมรรถนะของระบบ 5 ด้าน ได้แก่ การยืนยันตัวตนและการปลดล็อก การบันทึกภาพหลักฐาน การตรวจสอบสถานะประตู การแจ้งเตือน และการทำงานโดยรวม (หัวข้อ 4.5–4.10) จากนั้นอภิปรายผลเทียบกับวัตถุประสงค์และงานวิจัยที่เกี่ยวข้อง (หัวข้อ 4.11)</w:t>
+        <w:t>จากการออกแบบและพัฒนาต้นแบบกล่องรับพัสดุไอโอทีอัจฉริยะตามที่กล่าวไว้ในบทที่ 3 คณะผู้จัดทำได้สร้างต้นแบบและทดสอบการทำงานของระบบ เพื่อประเมินความสามารถในการยืนยันตัวตนผู้ส่งพัสดุ การควบคุมกลอน การบันทึกภาพหลักฐาน และการแจ้งเตือนผู้ใช้งานผ่านเครือข่ายอินเทอร์เน็ต ในบทนี้จึงนำเสนอผลการสร้างต้นแบบ ผลการตรวจวัดวงจร และผลการทดสอบสมรรถนะของระบบ พร้อมอภิปรายผลเทียบกับวัตถุประสงค์ของโครงงานและงานวิจัยที่เกี่ยวข้อง</w:t>
       </w:r>
     </w:p>
     <w:p>
@@ -113,6 +113,25 @@
     </w:p>
     <w:p>
       <w:pPr>
+        <w:spacing w:after="120" w:before="0" w:line="240" w:lineRule="auto"/>
+        <w:ind w:left="0" w:firstLine="850"/>
+        <w:jc w:val="both"/>
+      </w:pPr>
+      <w:r>
+        <w:rPr>
+          <w:rFonts w:ascii="TH SarabunPSK" w:hAnsi="TH SarabunPSK" w:cs="TH SarabunPSK" w:eastAsia="TH SarabunPSK"/>
+          <w:b w:val="0"/>
+          <w:i w:val="0"/>
+          <w:sz w:val="32"/>
+          <w:szCs w:val="32"/>
+          <w:bCs w:val="0"/>
+          <w:iCs w:val="0"/>
+        </w:rPr>
+        <w:t>คณะผู้จัดทำสร้างต้นแบบตามแบบจำลองสามมิติที่ออกแบบด้วยโปรแกรม SolidWorks (ภาพประกอบที่ 3.6–3.8) ผลการสร้างโครงสร้างและการติดตั้งอุปกรณ์มีรายละเอียดดังนี้</w:t>
+      </w:r>
+    </w:p>
+    <w:p>
+      <w:pPr>
         <w:keepNext/>
         <w:spacing w:before="120" w:after="80"/>
         <w:ind w:left="567"/>
@@ -146,7 +165,7 @@
           <w:bCs w:val="0"/>
           <w:iCs w:val="0"/>
         </w:rPr>
-        <w:t>คณะผู้จัดทำสร้างโครงสร้างกล่องตามแบบจำลองสามมิติที่ออกแบบด้วยโปรแกรม SolidWorks (ภาพประกอบที่ 3.6–3.8) โดยใช้อลูมิเนียมโปรไฟล์ 2020 เป็นโครง ปิดผนังด้วยแผ่นอลูมิเนียมคอมโพสิตหนา 3 มิลลิเมตร ขนาดพื้นที่ภายในกว้าง 42 เซนติเมตร ยาว 51 เซนติเมตร และสูง 69 เซนติเมตร บานประตูติดตั้งบานพับและมือจับ ทั้งนี้ต้นแบบที่สร้างจริงไม่ได้ติดตั้งโช้คอัพประตู (Door Closer) ที่แสดงในภาพประกอบที่ 3.6–3.8 ผู้ใช้จึงต้องปิดประตูด้วยมือจนสนิท และการติดตั้งโช้คอัพประตูได้นำไปเสนอเป็นแนวทางพัฒนาต่อยอดในหัวข้อ 5.4 โครงสร้างที่ประกอบจริงแสดงดังภาพประกอบที่ 4.1</w:t>
+        <w:t>โครงกล่องใช้อลูมิเนียมโปรไฟล์ 2020 ปิดผนังด้วยแผ่นอลูมิเนียมคอมโพสิตหนา 3 มิลลิเมตร พื้นที่ภายในมีขนาดกว้าง 42 เซนติเมตร ยาว 51 เซนติเมตร และสูง 69 เซนติเมตร บานประตูติดตั้งบานพับและมือจับ ทั้งนี้ ต้นแบบจริงไม่ได้ติดตั้งโช้คอัพประตู (Door Closer) ตามที่แสดงในแบบจำลอง ผู้ใช้จึงต้องปิดประตูด้วยมือจนสนิท ส่วนการติดตั้งโช้คอัพได้เสนอไว้เป็นแนวทางพัฒนาต่อยอดในหัวข้อ 5.4 โครงสร้างที่สร้างเสร็จแสดงดังภาพประกอบที่ 4.1</w:t>
       </w:r>
     </w:p>
     <w:p>
@@ -245,7 +264,7 @@
           <w:bCs w:val="0"/>
           <w:iCs w:val="0"/>
         </w:rPr>
-        <w:t>การติดตั้งอุปกรณ์แบ่งเป็น 2 พื้นที่ตามที่ออกแบบไว้ในหัวข้อ 3.3.6 ดังตารางที่ 4.1 โดยอุปกรณ์ภายนอกตู้แสดงในภาพประกอบที่ 4.2 และอุปกรณ์ภายในตู้แสดงในภาพประกอบที่ 4.3</w:t>
+        <w:t>อุปกรณ์ทั้งหมดติดตั้งตามที่ออกแบบไว้ในหัวข้อ 3.3.6 โดยแบ่งเป็นอุปกรณ์ภายนอกตู้และภายในตู้ ดังตารางที่ 4.1 ภาพประกอบที่ 4.2 และภาพประกอบที่ 4.3</w:t>
       </w:r>
     </w:p>
     <w:p>
@@ -1079,7 +1098,7 @@
           <w:bCs w:val="0"/>
           <w:iCs w:val="0"/>
         </w:rPr>
-        <w:t>จากตารางที่ 4.1 บอร์ดควบคุมหลักถูกแยกไว้ในกล่องพลาสติกด้านนอกตู้ เนื่องจากแผ่นอลูมิเนียมคอมโพสิตลดทอนสัญญาณ Wi-Fi ส่วนบอร์ด ESP32-CAM อยู่ภายในตู้โลหะ จึงต้องติดตามผลกระทบต่อการส่งภาพในหัวข้อ 4.7</w:t>
+        <w:t>จากตารางที่ 4.1 บอร์ดควบคุมหลักติดตั้งในกล่องพลาสติกกันน้ำภายนอกตู้ เนื่องจากแผ่นอลูมิเนียมคอมโพสิตลดทอนสัญญาณ Wi-Fi ส่วนบอร์ด ESP32-CAM ติดตั้งภายในตู้โลหะ จึงต้องตรวจสอบผลกระทบต่อการส่งภาพในหัวข้อ 4.7</w:t>
       </w:r>
     </w:p>
     <w:p>
@@ -1118,7 +1137,7 @@
           <w:bCs w:val="0"/>
           <w:iCs w:val="0"/>
         </w:rPr>
-        <w:t>ก่อนติดตั้งเข้าตู้ คณะผู้จัดทำประกอบวงจรทั้งหมดไว้ในกล่องพลาสติกกันน้ำตามแผนผังวงจรในภาพประกอบที่ 3.4 และตรวจสอบนอกตู้ด้วยมัลติมิเตอร์ ดังภาพประกอบที่ 4.4 ตามขั้นตอนในหัวข้อ 3.3.4 คือ (1) ปรับเอาต์พุตของ XL4015E1 ให้ได้ 5.0 V ก่อนต่อโหลด (2) ต่อกราวด์ร่วมของทุกอุปกรณ์ (3) ต่อสายตามการกำหนดขา GPIO ในตารางที่ 3.8 และ (4) ตรวจสอบแรงดันของแต่ละรางไฟก่อนจ่ายไฟให้บอร์ด</w:t>
+        <w:t>ก่อนติดตั้งเข้าตู้ คณะผู้จัดทำประกอบและตรวจสอบวงจรทั้งหมดภายนอกตู้ ดังภาพประกอบที่ 4.4 โดยต่อวงจรตามแผนผังในภาพประกอบที่ 3.4 และดำเนินการตามลำดับต่อไปนี้ (1) ปรับเอาต์พุตของ XL4015E1 ให้ได้ 5.0 V ก่อนต่อโหลด (2) ต่อกราวด์ร่วมของทุกอุปกรณ์ (3) ต่อสัญญาณตามการกำหนดขา GPIO ในตารางที่ 3.8 และ (4) วัดแรงดันของแต่ละรางไฟก่อนจ่ายไฟให้บอร์ด</w:t>
       </w:r>
     </w:p>
     <w:p>
@@ -1198,7 +1217,7 @@
           <w:bCs w:val="0"/>
           <w:iCs w:val="0"/>
         </w:rPr>
-        <w:t>การทดสอบวงจรนอกตู้ก่อนช่วยแยกปัญหาของวงจรออกจากปัญหาของโครงสร้างและการเดินสายภายในตู้ ผลการตรวจวัดแสดงในหัวข้อ 4.4</w:t>
+        <w:t>การตรวจสอบนอกตู้ช่วยแยกปัญหาของวงจรออกจากปัญหาด้านโครงสร้างและการเดินสายภายในตู้ ผลการวัดแสดงในหัวข้อ 4.4</w:t>
       </w:r>
     </w:p>
     <w:p>
@@ -1237,7 +1256,7 @@
           <w:bCs w:val="0"/>
           <w:iCs w:val="0"/>
         </w:rPr>
-        <w:t>ระบบซอฟต์แวร์ของต้นแบบประกอบด้วยเฟิร์มแวร์ของ ESP32 และ ESP32-CAM แอปพลิเคชันฝั่งเซิร์ฟเวอร์ที่พัฒนาด้วย FastAPI ร่วมกับฐานข้อมูล MariaDB และส่วนติดต่อผู้ใช้ ตามสถาปัตยกรรมในหัวข้อ 3.3.1–3.3.3 ในหัวข้อนี้แสดงผลของส่วนติดต่อผู้ใช้ที่ผู้ใช้งานและผู้ดูแลระบบมองเห็นจริง 3 ส่วน ได้แก่ หน้า LINE LIFF แดชบอร์ด และข้อความแจ้งเตือนผ่าน LINE</w:t>
+        <w:t>ระบบซอฟต์แวร์ประกอบด้วยเฟิร์มแวร์ของ ESP32 และ ESP32-CAM แอปพลิเคชันฝั่งเซิร์ฟเวอร์ที่พัฒนาด้วย FastAPI ร่วมกับฐานข้อมูล MariaDB และส่วนติดต่อผู้ใช้ ตามสถาปัตยกรรมในหัวข้อ 3.3.1–3.3.3 หัวข้อนี้นำเสนอส่วนติดต่อผู้ใช้ 3 ส่วนที่ผู้ใช้งานและผู้ดูแลระบบใช้งานจริง ได้แก่ หน้า LINE LIFF แดชบอร์ด และข้อความแจ้งเตือนผ่าน LINE</w:t>
       </w:r>
     </w:p>
     <w:p>
@@ -1275,7 +1294,7 @@
           <w:bCs w:val="0"/>
           <w:iCs w:val="0"/>
         </w:rPr>
-        <w:t xml:space="preserve">ผู้ใช้งานเปิดหน้า LINE LIFF ภายในแอป LINE ระบบตรวจสอบตัวตนด้วย ID Token ของ LINE ตามหัวข้อ 3.3.2 จากนั้นผู้ใช้สร้างรหัสคิวอาร์ซึ่งเป็นรหัส UUID แบบสุ่ม มีอายุ 24 ชั่วโมง และใช้ได้ครั้งเดียว ผู้ส่งพัสดุนำรหัสที่แสดงบนหน้าจอมาสแกนที่โมดูล GM66 ที่ตัวกล่อง ดังภาพประกอบที่ 4.5 </w:t>
+        <w:t xml:space="preserve">ผู้ใช้เปิดหน้า LINE LIFF ภายในแอป LINE โดยระบบตรวจสอบตัวตนจาก ID Token ของ LINE (หัวข้อ 3.3.2) จากนั้นสร้างรหัสคิวอาร์ซึ่งเป็นรหัส UUID แบบสุ่ม มีอายุ 24 ชั่วโมง และใช้ได้ครั้งเดียว ผู้ส่งพัสดุนำรหัสที่แสดงบนหน้าจอไปสแกนที่โมดูล GM66 ของกล่อง ดังภาพประกอบที่ 4.5 </w:t>
       </w:r>
       <w:r>
         <w:rPr>
@@ -1366,7 +1385,7 @@
           <w:bCs w:val="0"/>
           <w:iCs w:val="0"/>
         </w:rPr>
-        <w:t xml:space="preserve">แดชบอร์ดเป็นหน้าเว็บสำหรับผู้ดูแลระบบ ติดต่อกับเซิร์ฟเวอร์ผ่านโปรโตคอล WebSocket เพื่อแสดงเหตุการณ์แบบเวลาจริงโดยไม่ต้องรีเฟรชหน้า ดังภาพประกอบที่ 4.6 ประกอบด้วย 4 ส่วน คือ (1) LIVE FEED แสดงเหตุการณ์ที่เกิดขึ้นใหม่ เช่น สถานะอุปกรณ์ การตรวจสอบรหัส การเปิดประตู การล็อก และการถ่ายภาพ (2) DEVICE STATUS แสดงสถานะออนไลน์และสถานะประตูของอุปกรณ์ ซึ่งอัปเดตจากสัญญาณรายงานสถานะ (Heartbeat) ทุก 30 วินาที (3) UNLOCK CONTROL สำหรับสั่งปลดล็อกจากหน้าเว็บ </w:t>
+        <w:t xml:space="preserve">แดชบอร์ดเป็นหน้าเว็บสำหรับผู้ดูแลระบบ เชื่อมต่อกับเซิร์ฟเวอร์ผ่านโปรโตคอล WebSocket จึงแสดงเหตุการณ์ได้ทันทีโดยไม่ต้องรีเฟรชหน้า ดังภาพประกอบที่ 4.6 ประกอบด้วย 4 ส่วน ได้แก่ (1) LIVE FEED แสดงเหตุการณ์ใหม่ เช่น สถานะอุปกรณ์ การตรวจสอบรหัส การเปิดประตู การล็อก และการถ่ายภาพ (2) DEVICE STATUS แสดงสถานะออนไลน์และสถานะประตู ซึ่งอัปเดตจากสัญญาณรายงานสถานะ (Heartbeat) ทุก 30 วินาที (3) UNLOCK CONTROL สำหรับสั่งปลดล็อกจากหน้าเว็บ </w:t>
       </w:r>
       <w:r>
         <w:rPr>
@@ -1391,7 +1410,7 @@
           <w:bCs w:val="0"/>
           <w:iCs w:val="0"/>
         </w:rPr>
-        <w:t xml:space="preserve"> และ (4) ACCESS LOG แสดงประวัติเหตุการณ์ทั้งหมด ได้แก่ เวลา อุปกรณ์ ชนิดเหตุการณ์ ผล (granted, denied, error) และหมายเหตุ ซึ่งคณะผู้จัดทำใช้ข้อมูลส่วนนี้ในการคำนวณระยะเวลาในการทดสอบ</w:t>
+        <w:t xml:space="preserve"> และ (4) ACCESS LOG แสดงประวัติเหตุการณ์ ได้แก่ เวลา อุปกรณ์ ชนิดเหตุการณ์ ผล (granted, denied, error) และหมายเหตุ ซึ่งคณะผู้จัดทำใช้คำนวณระยะเวลาในการทดสอบ</w:t>
       </w:r>
     </w:p>
     <w:p>
@@ -1490,7 +1509,7 @@
           <w:bCs w:val="0"/>
           <w:iCs w:val="0"/>
         </w:rPr>
-        <w:t xml:space="preserve">เซิร์ฟเวอร์ส่งข้อความแจ้งเตือนไปยังผู้ใช้ผ่าน LINE Messaging API </w:t>
+        <w:t xml:space="preserve">เซิร์ฟเวอร์ส่งข้อความแจ้งเตือนผ่าน LINE Messaging API </w:t>
       </w:r>
       <w:r>
         <w:rPr>
@@ -1515,7 +1534,7 @@
           <w:bCs w:val="0"/>
           <w:iCs w:val="0"/>
         </w:rPr>
-        <w:t xml:space="preserve"> ตามเหตุการณ์ที่เกิดขึ้นในระบบ ดังตารางที่ 4.2 โดยภาพหลักฐานแนบเป็นลิงก์ HTTPS สาธารณะที่เปิดให้เข้าถึงผ่าน Tailscale Funnel </w:t>
+        <w:t xml:space="preserve"> ตามเหตุการณ์ในระบบ ดังตารางที่ 4.2 โดยภาพหลักฐานแนบเป็นลิงก์ HTTPS สาธารณะผ่าน Tailscale Funnel </w:t>
       </w:r>
       <w:r>
         <w:rPr>
@@ -2568,7 +2587,7 @@
           <w:bCs w:val="0"/>
           <w:iCs w:val="0"/>
         </w:rPr>
-        <w:t>บทที่ 3 กำหนดให้ตรวจสอบค่าที่ได้จากการคำนวณออกแบบกับค่าที่วัดได้จริงในบทที่ 4 (หัวข้อ 3.2.1–3.2.3) คณะผู้จัดทำจึงวัดแรงดันและกระแสด้วยมัลติมิเตอร์ ผลแสดงดังตารางที่ 4.3</w:t>
+        <w:t>บทที่ 3 กำหนดให้เปรียบเทียบค่าที่ได้จากการคำนวณออกแบบกับค่าที่วัดได้จริง (หัวข้อ 3.2.1–3.2.3) คณะผู้จัดทำจึงวัดแรงดันและกระแสของระบบด้วยมัลติมิเตอร์ ผลการวัดแสดงดังตารางที่ 4.3</w:t>
       </w:r>
     </w:p>
     <w:p>
@@ -3527,7 +3546,7 @@
           <w:bCs w:val="0"/>
           <w:iCs w:val="0"/>
         </w:rPr>
-        <w:t xml:space="preserve"> ค่าออกแบบ ส่วนแรงดันเกตของ Q1 ขณะล็อกวัดได้ </w:t>
+        <w:t xml:space="preserve"> ค่าออกแบบ แรงดันเกตของ Q1 ขณะล็อกวัดได้ </w:t>
       </w:r>
       <w:r>
         <w:rPr>
@@ -3577,7 +3596,7 @@
           <w:bCs w:val="0"/>
           <w:iCs w:val="0"/>
         </w:rPr>
-        <w:t xml:space="preserve"> 2 V จึง </w:t>
+        <w:t xml:space="preserve"> แรงดันเริ่มนำกระแส 2 V จึง </w:t>
       </w:r>
       <w:r>
         <w:rPr>
@@ -3665,7 +3684,7 @@
           <w:iCs w:val="0"/>
           <w:highlight w:val="yellow"/>
         </w:rPr>
-        <w:t>[ถ้าค่าที่วัดต่างจากค่าออกแบบ ให้อธิบายสาเหตุที่พบและวิธีแก้ไข]</w:t>
+        <w:t>[ถ้าค่าที่วัดต่างจากค่าออกแบบ ให้อธิบายสาเหตุและวิธีแก้ไข]</w:t>
       </w:r>
     </w:p>
     <w:p>
@@ -3704,7 +3723,7 @@
           <w:bCs w:val="0"/>
           <w:iCs w:val="0"/>
         </w:rPr>
-        <w:t>เพื่อให้สอดคล้องกับวัตถุประสงค์ของโครงงานในการพัฒนาต้นแบบกล่องรับพัสดุอัจฉริยะที่เพิ่มความปลอดภัยในการรับพัสดุ และยืนยันหลักฐานการส่งมอบพัสดุ (Proof of Delivery) ได้อย่างถูกต้อง คณะผู้จัดทำแบ่งการทดสอบเป็น 5 ส่วน ส่วนละ 15 ครั้ง ดังตารางที่ 4.4 โดยทุกการทดสอบผู้ทดสอบปิดประตูด้วยมือจนสนิท และใช้เครือข่าย Wi-Fi เดียวกันตลอดการทดสอบ</w:t>
+        <w:t>เพื่อประเมินว่าต้นแบบเพิ่มความปลอดภัยในการรับพัสดุและยืนยันหลักฐานการส่งมอบพัสดุ (Proof of Delivery) ได้ตามวัตถุประสงค์ คณะผู้จัดทำทดสอบสมรรถนะของระบบ 5 ด้าน ด้านละ 15 ครั้ง ดังตารางที่ 4.4 โดยผู้ทดสอบปิดประตูด้วยมือจนสนิทและใช้เครือข่าย Wi-Fi เดียวกันตลอดการทดสอบ</w:t>
       </w:r>
     </w:p>
     <w:p>
@@ -4519,7 +4538,7 @@
           <w:bCs w:val="0"/>
           <w:iCs w:val="0"/>
         </w:rPr>
-        <w:t xml:space="preserve">อัตราความสำเร็จ (ร้อยละ) คำนวณจาก (จำนวนครั้งที่ทำงานถูกต้อง ÷ จำนวนครั้งที่ทดสอบ) × 100 และค่าเฉลี่ยของระยะเวลาคำนวณจากผลรวมของระยะเวลาทุกครั้งหารด้วยจำนวนครั้งที่ทดสอบ เกณฑ์ผ่านของอัตราความสำเร็จที่ใช้ประเมินคือ </w:t>
+        <w:t xml:space="preserve">อัตราความสำเร็จ (ร้อยละ) คำนวณจาก (จำนวนครั้งที่ทำงานถูกต้อง ÷ จำนวนครั้งที่ทดสอบ) × 100 และค่าเฉลี่ยของระยะเวลาคำนวณจากผลรวมของระยะเวลาทุกครั้งหารด้วยจำนวนครั้งที่ทดสอบ โดยกำหนดเกณฑ์ผ่านของอัตราความสำเร็จไม่น้อยกว่าร้อยละ </w:t>
       </w:r>
       <w:r>
         <w:rPr>
@@ -4532,7 +4551,7 @@
           <w:iCs w:val="0"/>
           <w:highlight w:val="yellow"/>
         </w:rPr>
-        <w:t>[ไม่น้อยกว่าร้อยละ 90]</w:t>
+        <w:t>[90]</w:t>
       </w:r>
       <w:r>
         <w:rPr>
@@ -4569,7 +4588,7 @@
           <w:bCs w:val="0"/>
           <w:iCs w:val="0"/>
         </w:rPr>
-        <w:t xml:space="preserve"> ส่วนเวลารอภาพที่เซิร์ฟเวอร์ตั้งไว้จริงคือ </w:t>
+        <w:t xml:space="preserve"> ส่วนเวลารอภาพที่ตั้งไว้บนเซิร์ฟเวอร์จริงคือ </w:t>
       </w:r>
       <w:r>
         <w:rPr>
@@ -4594,7 +4613,7 @@
           <w:bCs w:val="0"/>
           <w:iCs w:val="0"/>
         </w:rPr>
-        <w:t xml:space="preserve"> วินาที (ค่า IMAGE_WAIT_SECONDS ในการตั้งค่าเซิร์ฟเวอร์ ค่าออกแบบในตารางที่ 3.6 คือ 30 วินาที)</w:t>
+        <w:t xml:space="preserve"> วินาที (ค่า IMAGE_WAIT_SECONDS ค่าออกแบบในตารางที่ 3.6 คือ 30 วินาที)</w:t>
       </w:r>
     </w:p>
     <w:p>
@@ -4613,7 +4632,7 @@
           <w:bCs w:val="0"/>
           <w:iCs w:val="0"/>
         </w:rPr>
-        <w:t>การวัดระยะเวลาในแต่ละการทดสอบใช้ข้อมูลจากระบบจริง ดังนี้ (1) เวลาตอบสนองการยืนยันรหัส วัดจากบันทึก Serial Monitor ของบอร์ด ESP32 ซึ่งแสดงเวลาเป็นมิลลิวินาที นับจากอ่านรหัสได้จนสั่งปลดล็อก (2) เวลารอภาพ วัดจากประวัติเหตุการณ์ (Access Log) บนแดชบอร์ดของเซิร์ฟเวอร์ โดยคำนวณผลต่างระหว่างเวลาของเหตุการณ์ locked และ image_capture และ (3) เวลาตั้งแต่เปิดค้างถึงแจ้งเตือน คำนวณจากผลต่างระหว่างเวลาของเหตุการณ์ door_open และ door_ajar ทั้งนี้ Access Log แสดงเวลาถึงระดับวินาที จึงมีความคลาดเคลื่อนไม่เกิน ±1 วินาที</w:t>
+        <w:t>การวัดระยะเวลาใช้ข้อมูลจากระบบจริง 3 รายการ ได้แก่ (1) เวลาตอบสนองการยืนยันรหัส อ่านจากบันทึก Serial Monitor ของ ESP32 ซึ่งแสดงเวลาเป็นมิลลิวินาที นับจากอ่านรหัสได้จนสั่งปลดล็อก (2) เวลารอภาพ คำนวณจากผลต่างของเวลาเหตุการณ์ locked และ image_capture ในประวัติเหตุการณ์ (Access Log) บนแดชบอร์ด และ (3) เวลาตั้งแต่เปิดค้างถึงแจ้งเตือน คำนวณจากผลต่างของเวลาเหตุการณ์ door_open และ door_ajar ทั้งนี้ Access Log แสดงเวลาถึงระดับวินาที จึงมีความคลาดเคลื่อนไม่เกิน ±1 วินาที</w:t>
       </w:r>
     </w:p>
     <w:p>
@@ -4653,7 +4672,7 @@
           <w:bCs w:val="0"/>
           <w:iCs w:val="0"/>
         </w:rPr>
-        <w:t xml:space="preserve">การทดสอบนี้ประเมินความแม่นยำในการจำแนกสิทธิ์การเข้าถึงของโมดูล GM66 และเซิร์ฟเวอร์ รวมถึงการสั่งกลอนแม่เหล็กไฟฟ้า ทดสอบ 15 ครั้ง ประกอบด้วยรหัสที่ได้รับอนุญาต 10 ครั้ง และรหัสที่ไม่ได้รับอนุญาต 5 ครั้ง ได้แก่ รหัสหมดอายุ (expired) 1 ครั้ง รหัสที่ใช้แล้ว (already_used) 2 ครั้ง และรหัสที่ไม่มีในระบบ (invalid_code) 2 ครั้ง ตามสถานะในตารางที่ 3.7 </w:t>
+        <w:t xml:space="preserve">การทดสอบนี้ประเมินความถูกต้องในการจำแนกสิทธิ์การเข้าถึงของโมดูล GM66 และเซิร์ฟเวอร์ รวมถึงการสั่งกลอนแม่เหล็กไฟฟ้า ทดสอบ 15 ครั้ง ประกอบด้วยรหัสที่ได้รับอนุญาต 10 ครั้ง และรหัสที่ไม่ได้รับอนุญาต 5 ครั้ง ได้แก่ รหัสหมดอายุ (expired) 1 ครั้ง รหัสที่ใช้แล้ว (already_used) 2 ครั้ง และรหัสที่ไม่มีในระบบ (invalid_code) 2 ครั้ง ตามสถานะในตารางที่ 3.7 </w:t>
       </w:r>
       <w:r>
         <w:rPr>
@@ -4678,7 +4697,7 @@
           <w:bCs w:val="0"/>
           <w:iCs w:val="0"/>
         </w:rPr>
-        <w:t xml:space="preserve"> โดยมีวิธีการทดสอบดังนี้</w:t>
+        <w:t xml:space="preserve"> ขั้นตอนการทดสอบมีดังนี้</w:t>
       </w:r>
     </w:p>
     <w:p>
@@ -4697,7 +4716,7 @@
           <w:bCs w:val="0"/>
           <w:iCs w:val="0"/>
         </w:rPr>
-        <w:t>(1) สร้างรหัสคิวอาร์ผ่านหน้า LINE LIFF สำหรับการทดสอบรหัสที่ได้รับอนุญาต ส่วนรหัสที่ใช้แล้วใช้รหัสจากการทดสอบครั้งก่อนหน้า</w:t>
+        <w:t>(1) สร้างรหัสคิวอาร์ผ่านหน้า LINE LIFF ส่วนรหัสที่ใช้แล้วใช้รหัสจากการทดสอบครั้งก่อนหน้า</w:t>
       </w:r>
     </w:p>
     <w:p>
@@ -4716,7 +4735,7 @@
           <w:bCs w:val="0"/>
           <w:iCs w:val="0"/>
         </w:rPr>
-        <w:t xml:space="preserve">(2) แสดงรหัสบนหน้าจอโทรศัพท์และสแกนที่โมดูล GM66 ที่ระยะ </w:t>
+        <w:t xml:space="preserve">(2) สแกนรหัสบนหน้าจอโทรศัพท์ที่โมดูล GM66 ที่ระยะ </w:t>
       </w:r>
       <w:r>
         <w:rPr>
@@ -4760,7 +4779,7 @@
           <w:bCs w:val="0"/>
           <w:iCs w:val="0"/>
         </w:rPr>
-        <w:t>(3) สังเกตการตอบสนอง กรณีรหัสได้รับอนุญาต กลอนต้องปลดล็อก 10 วินาทีพร้อมเสียงบัซเซอร์ 1 ครั้ง กรณีไม่ได้รับอนุญาต กลอนต้องไม่ปลดล็อก บัซเซอร์ส่งเสียง 2 ครั้ง และเซิร์ฟเวอร์แจ้งเตือนความพยายามเข้าถึงที่ถูกปฏิเสธผ่าน LINE</w:t>
+        <w:t>(3) สังเกตผล กรณีรหัสได้รับอนุญาต กลอนต้องปลดล็อก 10 วินาทีพร้อมเสียงบัซเซอร์ 1 ครั้ง กรณีไม่ได้รับอนุญาต กลอนต้องไม่ปลดล็อก บัซเซอร์ส่งเสียง 2 ครั้ง และมีข้อความแจ้งเตือนความพยายามเข้าถึงผ่าน LINE</w:t>
       </w:r>
     </w:p>
     <w:p>
@@ -4779,7 +4798,7 @@
           <w:bCs w:val="0"/>
           <w:iCs w:val="0"/>
         </w:rPr>
-        <w:t>(4) บันทึกผล อ่านเวลาตอบสนองจาก Serial Monitor และตรวจเหตุการณ์ qr_scan (granted หรือ denied) ใน Access Log</w:t>
+        <w:t>(4) อ่านเวลาตอบสนองจาก Serial Monitor และตรวจเหตุการณ์ qr_scan (granted หรือ denied) ใน Access Log</w:t>
       </w:r>
     </w:p>
     <w:p>
@@ -4818,7 +4837,7 @@
           <w:bCs w:val="0"/>
           <w:iCs w:val="0"/>
         </w:rPr>
-        <w:t>ผลการทดสอบแสดงดังภาพประกอบที่ 4.8 และตารางที่ 4.5</w:t>
+        <w:t>ผลการทดสอบแสดงดังภาพประกอบที่ 4.8 ตารางที่ 4.5 และตารางที่ 4.6</w:t>
       </w:r>
     </w:p>
     <w:p>
@@ -7034,7 +7053,7 @@
           <w:bCs w:val="0"/>
           <w:iCs w:val="0"/>
         </w:rPr>
-        <w:t xml:space="preserve"> ครั้งจาก 10 ครั้ง ส่วนรหัสที่ไม่ได้รับอนุญาตถูกปฏิเสธถูกต้อง </w:t>
+        <w:t xml:space="preserve"> ครั้งจาก 10 ครั้ง และรหัสที่ไม่ได้รับอนุญาตถูกปฏิเสธถูกต้อง </w:t>
       </w:r>
       <w:r>
         <w:rPr>
@@ -7187,7 +7206,7 @@
           <w:bCs w:val="0"/>
           <w:iCs w:val="0"/>
         </w:rPr>
-        <w:t>การทดสอบนี้ตรวจสอบการเปลี่ยนสถานะจาก Door Open เป็น Locked ซึ่งเป็นตัวกระตุ้นให้บอร์ด ESP32 ส่งพัลส์ 200 ms ไปยัง ESP32-CAM ตามภาพประกอบที่ 3.9 จากนั้น ESP32-CAM สอบถามเซิร์ฟเวอร์ว่ามีเหตุการณ์ใดรอภาพอยู่ ถ่ายภาพ (เปิดไฟแฟลช) และส่งไปยังเซิร์ฟเวอร์ ซึ่งแจ้งเตือนการส่งมอบพัสดุพร้อมภาพผ่าน LINE หากไม่ได้รับภาพภายในเวลาที่กำหนดจะส่งข้อความแจ้งเตือนแบบไม่มีรูปภาพ ทดสอบ 15 ครั้ง โดยมีวิธีการทดสอบดังนี้</w:t>
+        <w:t>การทดสอบนี้ประเมินการบันทึกภาพหลักฐานซึ่งเริ่มเมื่อประตูเปลี่ยนสถานะจาก Door Open เป็น Locked โดย ESP32 ส่งพัลส์ 200 ms ไปยัง ESP32-CAM (ภาพประกอบที่ 3.9) จากนั้น ESP32-CAM สอบถามเซิร์ฟเวอร์ว่ามีเหตุการณ์ใดรอภาพอยู่ ถ่ายภาพพร้อมไฟแฟลช และส่งภาพไปยังเซิร์ฟเวอร์ ซึ่งแจ้งเตือนการส่งมอบพัสดุพร้อมภาพผ่าน LINE หากไม่ได้รับภาพภายในเวลาที่กำหนด ระบบจะส่งข้อความแบบไม่มีรูปภาพ ทดสอบ 15 ครั้ง ขั้นตอนการทดสอบมีดังนี้</w:t>
       </w:r>
     </w:p>
     <w:p>
@@ -7225,7 +7244,7 @@
           <w:bCs w:val="0"/>
           <w:iCs w:val="0"/>
         </w:rPr>
-        <w:t>(2) เปิดประตู วางพัสดุ แล้วปิดประตูด้วยมือจนสนิท</w:t>
+        <w:t>(2) เปิดประตู วางพัสดุ และปิดประตูด้วยมือจนสนิท</w:t>
       </w:r>
     </w:p>
     <w:p>
@@ -7283,7 +7302,7 @@
           <w:bCs w:val="0"/>
           <w:iCs w:val="0"/>
         </w:rPr>
-        <w:t>ผลการทดสอบแสดงดังตารางที่ 4.7 และตัวอย่างข้อความแจ้งเตือนพร้อมภาพหลักฐานที่ได้รับผ่าน LINE แสดงดังภาพประกอบที่ 4.9</w:t>
+        <w:t>ผลการทดสอบแสดงดังตารางที่ 4.7 และตัวอย่างข้อความพร้อมภาพหลักฐานแสดงดังภาพประกอบที่ 4.9</w:t>
       </w:r>
     </w:p>
     <w:p>
@@ -8484,6 +8503,7 @@
     </w:p>
     <w:p>
       <w:pPr>
+        <w:keepNext/>
         <w:spacing w:after="120" w:before="0" w:line="240" w:lineRule="auto"/>
         <w:ind w:left="0" w:firstLine="850"/>
         <w:jc w:val="both"/>
@@ -8498,7 +8518,7 @@
           <w:bCs w:val="0"/>
           <w:iCs w:val="0"/>
         </w:rPr>
-        <w:t xml:space="preserve">ตามที่ออกแบบ การปลดล็อกด้วยปุ่มกดต้องไม่สั่งถ่ายภาพ คณะผู้จัดทำจึงทดสอบเพิ่ม </w:t>
+        <w:t xml:space="preserve">นอกจากนี้ ตามที่ออกแบบ การปลดล็อกด้วยปุ่มกดต้องไม่สั่งถ่ายภาพ คณะผู้จัดทำจึงทดสอบเพิ่ม </w:t>
       </w:r>
       <w:r>
         <w:rPr>
@@ -8523,7 +8543,7 @@
           <w:bCs w:val="0"/>
           <w:iCs w:val="0"/>
         </w:rPr>
-        <w:t xml:space="preserve"> โดยกดปุ่มปลดล็อก เปิดและปิดประตู แล้วตรวจ Access Log ว่ามีเหตุการณ์ manual_unlock และไม่มีเหตุการณ์ image_capture ดังตารางที่ 4.8</w:t>
+        <w:t xml:space="preserve"> โดยกดปุ่มปลดล็อก เปิดและปิดประตู แล้วตรวจ Access Log ว่ามีเหตุการณ์ manual_unlock และไม่มีเหตุการณ์ image_capture ผลแสดงดังตารางที่ 4.8</w:t>
       </w:r>
     </w:p>
     <w:p>
@@ -9319,7 +9339,7 @@
           <w:bCs w:val="0"/>
           <w:iCs w:val="0"/>
         </w:rPr>
-        <w:t xml:space="preserve">การทดสอบนี้ตรวจสอบว่าระบบรับรู้สถานะประตูปิดสนิทได้ถูกต้องผ่านเซนเซอร์ Reed Switch MC-38 ซึ่งกรองสัญญาณสั่นของหน้าสัมผัสด้วยซอฟต์แวร์ 100 ms </w:t>
+        <w:t xml:space="preserve">การทดสอบนี้ประเมินความถูกต้องในการรับรู้สถานะประตูปิดสนิทผ่านเซนเซอร์ Reed Switch MC-38 ซึ่งกรองสัญญาณสั่นของหน้าสัมผัสด้วยซอฟต์แวร์ 100 ms </w:t>
       </w:r>
       <w:r>
         <w:rPr>
@@ -9344,7 +9364,7 @@
           <w:bCs w:val="0"/>
           <w:iCs w:val="0"/>
         </w:rPr>
-        <w:t xml:space="preserve"> และสั่งล็อกกลอนทันที ทดสอบ 15 ครั้ง โดยมีวิธีการทดสอบดังนี้</w:t>
+        <w:t xml:space="preserve"> และการสั่งล็อกกลอนทันทีเมื่อประตูปิด ทดสอบ 15 ครั้ง ขั้นตอนการทดสอบมีดังนี้</w:t>
       </w:r>
     </w:p>
     <w:p>
@@ -9401,7 +9421,7 @@
           <w:bCs w:val="0"/>
           <w:iCs w:val="0"/>
         </w:rPr>
-        <w:t>(3) สังเกตว่ากลอนล็อกและตรวจเหตุการณ์ locked ใน Access Log หรือสถานะประตูในส่วน DEVICE STATUS ของแดชบอร์ด</w:t>
+        <w:t>(3) ตรวจว่ากลอนล็อก โดยดูเหตุการณ์ locked ใน Access Log หรือสถานะประตูใน DEVICE STATUS ของแดชบอร์ด</w:t>
       </w:r>
     </w:p>
     <w:p>
@@ -10565,7 +10585,7 @@
           <w:bCs w:val="0"/>
           <w:iCs w:val="0"/>
         </w:rPr>
-        <w:t>เนื่องจากต้นแบบไม่มีโช้คอัพประตู ผู้ใช้ต้องปิดประตูด้วยมือ จึงมีโอกาสที่ประตูปิดไม่สนิท ระบบจึงออกแบบให้แจ้งเตือนเมื่อประตูเปิดค้างเกิน 60 วินาที (T_ajar) โดยเซิร์ฟเวอร์บันทึกเหตุการณ์ door_ajar และส่งข้อความผ่าน LINE ครั้งเดียว ส่วนบัซเซอร์ที่ตัวเครื่องส่งเสียงเตือนซ้ำจนกว่าจะปิดประตู การทดสอบนี้จำลองกรณีมีวัตถุกีดขวางทำให้ประตูปิดไม่สนิท เพื่อวัดความถูกต้องของการแจ้งเตือนด้วยเสียงและผ่าน LINE Messaging API ทดสอบ 15 ครั้ง โดยมีวิธีการทดสอบดังนี้</w:t>
+        <w:t>เนื่องจากต้นแบบไม่มีโช้คอัพประตู ผู้ใช้ต้องปิดประตูด้วยมือ จึงอาจปิดประตูไม่สนิทได้ ระบบจึงออกแบบให้แจ้งเตือนเมื่อประตูเปิดค้างเกิน 60 วินาที (T_ajar) โดยเซิร์ฟเวอร์บันทึกเหตุการณ์ door_ajar และส่งข้อความผ่าน LINE ครั้งเดียว ส่วนบัซเซอร์ที่ตัวเครื่องส่งเสียงเตือนซ้ำจนกว่าจะปิดประตู การทดสอบนี้จำลองกรณีมีวัตถุกีดขวางทำให้ประตูปิดไม่สนิท ทดสอบ 15 ครั้ง ขั้นตอนการทดสอบมีดังนี้</w:t>
       </w:r>
     </w:p>
     <w:p>
@@ -12079,7 +12099,7 @@
           <w:bCs w:val="0"/>
           <w:iCs w:val="0"/>
         </w:rPr>
-        <w:t>การทดสอบนี้ประเมินการทำงานร่วมกันของระบบแบบครบวงจร (End-to-End Testing) ทั้งฮาร์ดแวร์และซอฟต์แวร์ ตั้งแต่การอ่านรหัสคิวอาร์จนถึงการแจ้งเตือนผู้ใช้งาน ทดสอบซ้ำ 15 ครั้ง ผู้ทดสอบปิดประตูด้วยมือจนสนิท แต่ละครั้งประกอบด้วย 7 ขั้นตอน ตามลำดับในตารางที่ 4.11</w:t>
+        <w:t>การทดสอบนี้ประเมินการทำงานร่วมกันของระบบแบบครบวงจร (End-to-End Testing) ทั้งฮาร์ดแวร์และซอฟต์แวร์ ตั้งแต่การอ่านรหัสคิวอาร์จนถึงการแจ้งเตือนผู้ใช้งาน ทดสอบซ้ำ 15 ครั้ง โดยผู้ทดสอบปิดประตูด้วยมือจนสนิท แต่ละครั้งประกอบด้วย 7 ขั้นตอนตามลำดับคอลัมน์ในตารางที่ 4.11</w:t>
       </w:r>
     </w:p>
     <w:p>
@@ -14635,7 +14655,7 @@
           <w:bCs w:val="0"/>
           <w:iCs w:val="0"/>
         </w:rPr>
-        <w:t>ผลการเปรียบเทียบผลการทดลองกับขอบเขตการศึกษาตามหัวข้อ 1.3 แสดงดังตารางที่ 4.12</w:t>
+        <w:t>เมื่อเปรียบเทียบผลการทดลองกับขอบเขตการศึกษาตามหัวข้อ 1.3 ได้ผลดังตารางที่ 4.12</w:t>
       </w:r>
     </w:p>
     <w:p>

</xml_diff>

<commit_message>
Chapter 4: ESP32-CAM external antenna
Co-Authored-By: Claude Sonnet 5.5 <noreply@anthropic.com>
Claude-Session: https://claude.ai/code/session_01VnBozHXF9mmTyHiTgVtwAM
</commit_message>
<xml_diff>
--- a/บทที่4_ไฟนอล_เฉพาะบท.docx
+++ b/บทที่4_ไฟนอล_เฉพาะบท.docx
@@ -1262,32 +1262,7 @@
           <w:bCs w:val="0"/>
           <w:iCs w:val="0"/>
         </w:rPr>
-        <w:t xml:space="preserve">จากตารางที่ 4.1 บอร์ดควบคุมหลักติดตั้งในกล่องพลาสติกกันน้ำภายนอกตู้ เนื่องจากแผ่นอลูมิเนียมคอมโพสิตลดทอนสัญญาณ Wi-Fi ส่วนบอร์ด ESP32-CAM ติดตั้งภายในตู้โลหะ </w:t>
-      </w:r>
-      <w:r>
-        <w:rPr>
-          <w:rFonts w:ascii="TH SarabunPSK" w:hAnsi="TH SarabunPSK" w:cs="TH SarabunPSK" w:eastAsia="TH SarabunPSK"/>
-          <w:b w:val="0"/>
-          <w:i w:val="0"/>
-          <w:sz w:val="32"/>
-          <w:szCs w:val="32"/>
-          <w:bCs w:val="0"/>
-          <w:iCs w:val="0"/>
-          <w:highlight w:val="yellow"/>
-        </w:rPr>
-        <w:t>[ยืนยัน: เสาอากาศภายนอกที่ติดตั้งเหนือตู้ในภาพประกอบที่ 4.1 ต่อกับบอร์ดใด และบรรยายวิธีนำสัญญาณออกนอกตู้]</w:t>
-      </w:r>
-      <w:r>
-        <w:rPr>
-          <w:rFonts w:ascii="TH SarabunPSK" w:hAnsi="TH SarabunPSK" w:cs="TH SarabunPSK" w:eastAsia="TH SarabunPSK"/>
-          <w:b w:val="0"/>
-          <w:i w:val="0"/>
-          <w:sz w:val="32"/>
-          <w:szCs w:val="32"/>
-          <w:bCs w:val="0"/>
-          <w:iCs w:val="0"/>
-        </w:rPr>
-        <w:t xml:space="preserve"> จึงต้องตรวจสอบผลกระทบต่อการส่งภาพในหัวข้อ 4.5</w:t>
+        <w:t>จากตารางที่ 4.1 บอร์ดควบคุมหลักติดตั้งในกล่องพลาสติกกันน้ำภายนอกตู้ เนื่องจากแผ่นอลูมิเนียมคอมโพสิตลดทอนสัญญาณ Wi-Fi ส่วนบอร์ด ESP32-CAM ติดตั้งภายในตู้โลหะ จึงต่อเสาอากาศภายนอกเข้ากับบอร์ดและนำสายออกมาติดตั้งเสาอากาศไว้เหนือตู้ ดังภาพประกอบที่ 4.1 และ 4.2 เพื่อลดการบังสัญญาณจากตัวตู้ ทั้งนี้ยังต้องตรวจสอบผลกระทบต่อการส่งภาพในหัวข้อ 4.5</w:t>
       </w:r>
     </w:p>
     <w:p>
@@ -7532,7 +7507,7 @@
           <w:bCs w:val="0"/>
           <w:iCs w:val="0"/>
         </w:rPr>
-        <w:t xml:space="preserve"> ตามที่ออกแบบ และการที่ ESP32-CAM อยู่ภายในตู้อลูมิเนียม </w:t>
+        <w:t xml:space="preserve"> ตามที่ออกแบบ และการที่ ESP32-CAM อยู่ภายในตู้อลูมิเนียมโดยต่อเสาอากาศภายนอก </w:t>
       </w:r>
       <w:r>
         <w:rPr>

</xml_diff>

<commit_message>
Chapter 4: drop expired-code test, use already_used x3 and invalid_code x2
Co-Authored-By: Claude Sonnet 5.5 <noreply@anthropic.com>
Claude-Session: https://claude.ai/code/session_01VnBozHXF9mmTyHiTgVtwAM
</commit_message>
<xml_diff>
--- a/บทที่4_ไฟนอล_เฉพาะบท.docx
+++ b/บทที่4_ไฟนอล_เฉพาะบท.docx
@@ -3564,32 +3564,7 @@
           <w:bCs w:val="0"/>
           <w:iCs w:val="0"/>
         </w:rPr>
-        <w:t xml:space="preserve">การทดสอบนี้ประเมินความถูกต้องในการจำแนกสิทธิ์การเข้าถึงของโมดูล GM66 และเซิร์ฟเวอร์ รวมถึงการสั่งกลอนแม่เหล็กไฟฟ้า ทดสอบ 15 ครั้ง ประกอบด้วยรหัสที่ได้รับอนุญาต 10 ครั้ง และรหัสที่ไม่ได้รับอนุญาต 5 ครั้ง ได้แก่ รหัสหมดอายุ (expired) 1 ครั้ง รหัสที่ใช้แล้ว (already_used) 2 ครั้ง และรหัสที่ไม่มีในระบบ (invalid_code) 2 ครั้ง ตามสถานะในตารางที่ 3.7 </w:t>
-      </w:r>
-      <w:r>
-        <w:rPr>
-          <w:rFonts w:ascii="TH SarabunPSK" w:hAnsi="TH SarabunPSK" w:cs="TH SarabunPSK" w:eastAsia="TH SarabunPSK"/>
-          <w:b w:val="0"/>
-          <w:i w:val="0"/>
-          <w:sz w:val="32"/>
-          <w:szCs w:val="32"/>
-          <w:bCs w:val="0"/>
-          <w:iCs w:val="0"/>
-          <w:highlight w:val="yellow"/>
-        </w:rPr>
-        <w:t>[วิธีทดสอบรหัสหมดอายุ เช่น ตั้ง QR_TTL_HOURS เป็น 1 แล้วทดสอบหลังครบ 1 ชั่วโมง หรือแก้เวลาหมดอายุในฐานข้อมูล]</w:t>
-      </w:r>
-      <w:r>
-        <w:rPr>
-          <w:rFonts w:ascii="TH SarabunPSK" w:hAnsi="TH SarabunPSK" w:cs="TH SarabunPSK" w:eastAsia="TH SarabunPSK"/>
-          <w:b w:val="0"/>
-          <w:i w:val="0"/>
-          <w:sz w:val="32"/>
-          <w:szCs w:val="32"/>
-          <w:bCs w:val="0"/>
-          <w:iCs w:val="0"/>
-        </w:rPr>
-        <w:t xml:space="preserve"> ขั้นตอนการทดสอบมีดังนี้</w:t>
+        <w:t>การทดสอบนี้ประเมินความถูกต้องในการจำแนกสิทธิ์การเข้าถึงของโมดูล GM66 และเซิร์ฟเวอร์ รวมถึงการสั่งกลอนแม่เหล็กไฟฟ้า ทดสอบ 15 ครั้ง ประกอบด้วยรหัสที่ได้รับอนุญาต 10 ครั้ง และรหัสที่ไม่ได้รับอนุญาต 5 ครั้ง ได้แก่ รหัสที่ใช้แล้ว (already_used) 3 ครั้ง และรหัสที่ไม่มีในระบบ (invalid_code) 2 ครั้ง ตามสถานะในตารางที่ 3.7 ทั้งนี้ไม่ได้ทดสอบกรณีรหัสหมดอายุ (expired) เนื่องจากรหัสมีอายุ 24 ชั่วโมง ซึ่งยาวเกินกว่าเวลาที่ใช้ในการทดสอบ แต่ระบบรองรับการปฏิเสธรหัสหมดอายุตามที่ออกแบบไว้ ขั้นตอนการทดสอบมีดังนี้</w:t>
       </w:r>
     </w:p>
     <w:p>
@@ -4191,7 +4166,7 @@
                 <w:bCs w:val="0"/>
                 <w:iCs w:val="0"/>
               </w:rPr>
-              <w:t>ไม่อนุญาต (expired)</w:t>
+              <w:t>ไม่อนุญาต (already_used)</w:t>
             </w:r>
           </w:p>
         </w:tc>
@@ -4421,7 +4396,7 @@
                 <w:bCs w:val="0"/>
                 <w:iCs w:val="0"/>
               </w:rPr>
-              <w:t>ไม่อนุญาต (already_used)</w:t>
+              <w:t>ไม่อนุญาต (invalid_code)</w:t>
             </w:r>
           </w:p>
         </w:tc>
@@ -4651,7 +4626,7 @@
                 <w:bCs w:val="0"/>
                 <w:iCs w:val="0"/>
               </w:rPr>
-              <w:t>ไม่อนุญาต (invalid_code)</w:t>
+              <w:t>ไม่อนุญาต (already_used)</w:t>
             </w:r>
           </w:p>
         </w:tc>

</xml_diff>